<commit_message>
Deploying to gh-pages from @ Morrison-Lab/psw@c6258c7076c45d402153c4e331be4a277276916a 🚀
</commit_message>
<xml_diff>
--- a/chapters/paper-organization.docx
+++ b/chapters/paper-organization.docx
@@ -15,7 +15,7 @@
         <w:pStyle w:val="Date"/>
       </w:pPr>
       <w:r>
-        <w:t xml:space="preserve">Last modified: 2026-10-02 01:10:21 (UTC)</w:t>
+        <w:t xml:space="preserve">Last modified: 2026-10-02 08:28:14 (UTC)</w:t>
       </w:r>
     </w:p>
     <w:p>
@@ -769,7 +769,7 @@
     <w:bookmarkEnd w:id="14"/>
     <w:bookmarkEnd w:id="15"/>
     <w:bookmarkEnd w:id="16"/>
-    <w:bookmarkStart w:id="17" w:name="figures-and-tables"/>
+    <w:bookmarkStart w:id="20" w:name="figures-and-tables"/>
     <w:p>
       <w:pPr>
         <w:pStyle w:val="Heading2"/>
@@ -783,13 +783,54 @@
         <w:pStyle w:val="FirstParagraph"/>
       </w:pPr>
       <w:r>
-        <w:t xml:space="preserve">Place figures and tables near the relevant text that describes them.</w:t>
-      </w:r>
-      <w:r>
-        <w:t xml:space="preserve"> </w:t>
-      </w:r>
-      <w:r>
-        <w:t xml:space="preserve">Number them sequentially</w:t>
+        <w:t xml:space="preserve">In a reading copy</w:t>
+      </w:r>
+      <w:r>
+        <w:t xml:space="preserve"> </w:t>
+      </w:r>
+      <w:r>
+        <w:t xml:space="preserve">(a website, a preprint, or a draft circulated to coauthors),</w:t>
+      </w:r>
+      <w:r>
+        <w:t xml:space="preserve"> </w:t>
+      </w:r>
+      <w:r>
+        <w:t xml:space="preserve">place figures and tables near the relevant text that describes them.</w:t>
+      </w:r>
+      <w:r>
+        <w:t xml:space="preserve"> </w:t>
+      </w:r>
+      <w:r>
+        <w:t xml:space="preserve">A journal submission often needs a different layout</w:t>
+      </w:r>
+      <w:r>
+        <w:t xml:space="preserve"> </w:t>
+      </w:r>
+      <w:r>
+        <w:t xml:space="preserve">(</w:t>
+      </w:r>
+      <w:hyperlink w:anchor="sec-submission-layout">
+        <w:r>
+          <w:rPr>
+            <w:rStyle w:val="Hyperlink"/>
+          </w:rPr>
+          <w:t xml:space="preserve">Section 3.2</w:t>
+        </w:r>
+      </w:hyperlink>
+      <w:r>
+        <w:t xml:space="preserve">).</w:t>
+      </w:r>
+      <w:r>
+        <w:t xml:space="preserve"> </w:t>
+      </w:r>
+      <w:r>
+        <w:t xml:space="preserve">Either way,</w:t>
+      </w:r>
+      <w:r>
+        <w:t xml:space="preserve"> </w:t>
+      </w:r>
+      <w:r>
+        <w:t xml:space="preserve">number figures and tables sequentially</w:t>
       </w:r>
       <w:r>
         <w:t xml:space="preserve"> </w:t>
@@ -818,14 +859,13 @@
         <w:t xml:space="preserve">without reading the main text.</w:t>
       </w:r>
     </w:p>
-    <w:bookmarkEnd w:id="17"/>
-    <w:bookmarkStart w:id="18" w:name="subsection-headings"/>
-    <w:p>
-      <w:pPr>
-        <w:pStyle w:val="Heading2"/>
-      </w:pPr>
-      <w:r>
-        <w:t xml:space="preserve">4 Subsection headings</w:t>
+    <w:bookmarkStart w:id="17" w:name="captions-are-captions-not-headings"/>
+    <w:p>
+      <w:pPr>
+        <w:pStyle w:val="Heading3"/>
+      </w:pPr>
+      <w:r>
+        <w:t xml:space="preserve">3.1 Captions are captions, not headings</w:t>
       </w:r>
     </w:p>
     <w:p>
@@ -833,13 +873,81 @@
         <w:pStyle w:val="FirstParagraph"/>
       </w:pPr>
       <w:r>
-        <w:t xml:space="preserve">Use descriptive subsection headings to guide readers through your results.</w:t>
-      </w:r>
-      <w:r>
-        <w:t xml:space="preserve"> </w:t>
-      </w:r>
-      <w:r>
-        <w:t xml:space="preserve">Headings should clearly indicate the content of each section.</w:t>
+        <w:t xml:space="preserve">Give every figure and table a numbered caption,</w:t>
+      </w:r>
+      <w:r>
+        <w:t xml:space="preserve"> </w:t>
+      </w:r>
+      <w:r>
+        <w:t xml:space="preserve">including those in the supplementary material.</w:t>
+      </w:r>
+      <w:r>
+        <w:t xml:space="preserve"> </w:t>
+      </w:r>
+      <w:r>
+        <w:t xml:space="preserve">A table without a caption is incomplete,</w:t>
+      </w:r>
+      <w:r>
+        <w:t xml:space="preserve"> </w:t>
+      </w:r>
+      <w:r>
+        <w:t xml:space="preserve">even when its contents are correct.</w:t>
+      </w:r>
+    </w:p>
+    <w:p>
+      <w:pPr>
+        <w:pStyle w:val="BodyText"/>
+      </w:pPr>
+      <w:r>
+        <w:t xml:space="preserve">Attach each caption to its figure or table</w:t>
+      </w:r>
+      <w:r>
+        <w:t xml:space="preserve"> </w:t>
+      </w:r>
+      <w:r>
+        <w:t xml:space="preserve">with your writing tool’s caption feature</w:t>
+      </w:r>
+      <w:r>
+        <w:t xml:space="preserve"> </w:t>
+      </w:r>
+      <w:r>
+        <w:t xml:space="preserve">(in Quarto, the last line of a</w:t>
+      </w:r>
+      <w:r>
+        <w:t xml:space="preserve"> </w:t>
+      </w:r>
+      <w:r>
+        <w:rPr>
+          <w:rStyle w:val="VerbatimChar"/>
+        </w:rPr>
+        <w:t xml:space="preserve">#fig-</w:t>
+      </w:r>
+      <w:r>
+        <w:t xml:space="preserve"> </w:t>
+      </w:r>
+      <w:r>
+        <w:t xml:space="preserve">or</w:t>
+      </w:r>
+      <w:r>
+        <w:t xml:space="preserve"> </w:t>
+      </w:r>
+      <w:r>
+        <w:rPr>
+          <w:rStyle w:val="VerbatimChar"/>
+        </w:rPr>
+        <w:t xml:space="preserve">#tbl-</w:t>
+      </w:r>
+      <w:r>
+        <w:t xml:space="preserve"> </w:t>
+      </w:r>
+      <w:r>
+        <w:t xml:space="preserve">div),</w:t>
+      </w:r>
+      <w:r>
+        <w:t xml:space="preserve"> </w:t>
+      </w:r>
+      <w:r>
+        <w:t xml:space="preserve">not as a section heading.</w:t>
       </w:r>
     </w:p>
     <w:p>
@@ -851,16 +959,25 @@
           <w:b/>
           <w:bCs/>
         </w:rPr>
-        <w:t xml:space="preserve">Poor heading</w:t>
-      </w:r>
-      <w:r>
-        <w:t xml:space="preserve">:</w:t>
-      </w:r>
-      <w:r>
-        <w:t xml:space="preserve"> </w:t>
-      </w:r>
-      <w:r>
-        <w:t xml:space="preserve">“Analysis 1”</w:t>
+        <w:t xml:space="preserve">Poor caption</w:t>
+      </w:r>
+      <w:r>
+        <w:t xml:space="preserve">: a section heading that reads</w:t>
+      </w:r>
+      <w:r>
+        <w:t xml:space="preserve"> </w:t>
+      </w:r>
+      <w:r>
+        <w:t xml:space="preserve">“Supplementary Figure S43: Distribution of follow-up time”</w:t>
+      </w:r>
+      <w:r>
+        <w:t xml:space="preserve">,</w:t>
+      </w:r>
+      <w:r>
+        <w:t xml:space="preserve"> </w:t>
+      </w:r>
+      <w:r>
+        <w:t xml:space="preserve">placed above the figure</w:t>
       </w:r>
     </w:p>
     <w:p>
@@ -872,7 +989,7 @@
           <w:b/>
           <w:bCs/>
         </w:rPr>
-        <w:t xml:space="preserve">Better heading</w:t>
+        <w:t xml:space="preserve">Better caption</w:t>
       </w:r>
       <w:r>
         <w:t xml:space="preserve">:</w:t>
@@ -881,18 +998,512 @@
         <w:t xml:space="preserve"> </w:t>
       </w:r>
       <w:r>
-        <w:t xml:space="preserve">“Association between treatment and mortality”</w:t>
+        <w:t xml:space="preserve">“Distribution of follow-up time”</w:t>
+      </w:r>
+      <w:r>
+        <w:t xml:space="preserve">,</w:t>
+      </w:r>
+      <w:r>
+        <w:t xml:space="preserve"> </w:t>
+      </w:r>
+      <w:r>
+        <w:t xml:space="preserve">written as a caption attached to the figure,</w:t>
+      </w:r>
+      <w:r>
+        <w:t xml:space="preserve"> </w:t>
+      </w:r>
+      <w:r>
+        <w:t xml:space="preserve">with its label and number generated by your writing tool</w:t>
+      </w:r>
+      <w:r>
+        <w:t xml:space="preserve"> </w:t>
+      </w:r>
+      <w:r>
+        <w:t xml:space="preserve">rather than typed by hand</w:t>
+      </w:r>
+      <w:r>
+        <w:t xml:space="preserve"> </w:t>
+      </w:r>
+      <w:r>
+        <w:t xml:space="preserve">(a supplementary</w:t>
+      </w:r>
+      <w:r>
+        <w:t xml:space="preserve"> </w:t>
+      </w:r>
+      <w:r>
+        <w:t xml:space="preserve">“S”</w:t>
+      </w:r>
+      <w:r>
+        <w:t xml:space="preserve"> </w:t>
+      </w:r>
+      <w:r>
+        <w:t xml:space="preserve">prefix may need extra setup in the tool)</w:t>
       </w:r>
     </w:p>
     <w:p>
       <w:pPr>
         <w:pStyle w:val="BodyText"/>
+      </w:pPr>
+      <w:r>
+        <w:t xml:space="preserve">A heading posing as a caption usually appears in the table of contents,</w:t>
+      </w:r>
+      <w:r>
+        <w:t xml:space="preserve"> </w:t>
+      </w:r>
+      <w:r>
+        <w:t xml:space="preserve">takes on heading styling,</w:t>
+      </w:r>
+      <w:r>
+        <w:t xml:space="preserve"> </w:t>
+      </w:r>
+      <w:r>
+        <w:t xml:space="preserve">and is not attached to its figure.</w:t>
+      </w:r>
+      <w:r>
+        <w:t xml:space="preserve"> </w:t>
+      </w:r>
+      <w:r>
+        <w:t xml:space="preserve">Its number is typed by hand,</w:t>
+      </w:r>
+      <w:r>
+        <w:t xml:space="preserve"> </w:t>
+      </w:r>
+      <w:r>
+        <w:t xml:space="preserve">so it falls out of step with the real numbering</w:t>
+      </w:r>
+      <w:r>
+        <w:t xml:space="preserve"> </w:t>
+      </w:r>
+      <w:r>
+        <w:t xml:space="preserve">when figures are added, removed, or reordered.</w:t>
+      </w:r>
+    </w:p>
+    <w:bookmarkEnd w:id="17"/>
+    <w:bookmarkStart w:id="18" w:name="sec-submission-layout"/>
+    <w:p>
+      <w:pPr>
+        <w:pStyle w:val="Heading3"/>
+      </w:pPr>
+      <w:r>
+        <w:t xml:space="preserve">3.2 Manuscript layout for journal submission</w:t>
+      </w:r>
+    </w:p>
+    <w:p>
+      <w:pPr>
+        <w:pStyle w:val="FirstParagraph"/>
+      </w:pPr>
+      <w:r>
+        <w:t xml:space="preserve">Many journals ask for figures and tables</w:t>
+      </w:r>
+      <w:r>
+        <w:t xml:space="preserve"> </w:t>
+      </w:r>
+      <w:r>
+        <w:t xml:space="preserve">to follow the main text of a submitted manuscript</w:t>
+      </w:r>
+      <w:r>
+        <w:t xml:space="preserve"> </w:t>
+      </w:r>
+      <w:r>
+        <w:t xml:space="preserve">rather than appear inline.</w:t>
+      </w:r>
+      <w:r>
+        <w:t xml:space="preserve"> </w:t>
+      </w:r>
+      <w:r>
+        <w:t xml:space="preserve">Unless the journal’s instructions say otherwise,</w:t>
+      </w:r>
+      <w:r>
+        <w:t xml:space="preserve"> </w:t>
+      </w:r>
+      <w:r>
+        <w:t xml:space="preserve">lay out a submission manuscript as follows:</w:t>
+      </w:r>
+    </w:p>
+    <w:p>
+      <w:pPr>
+        <w:pStyle w:val="Compact"/>
+        <w:numPr>
+          <w:ilvl w:val="0"/>
+          <w:numId w:val="1005"/>
+        </w:numPr>
       </w:pPr>
       <w:r>
         <w:rPr>
           <w:b/>
           <w:bCs/>
         </w:rPr>
+        <w:t xml:space="preserve">Put all main-text figures and tables at the end of the main manuscript</w:t>
+      </w:r>
+      <w:r>
+        <w:t xml:space="preserve">,</w:t>
+      </w:r>
+      <w:r>
+        <w:t xml:space="preserve"> </w:t>
+      </w:r>
+      <w:r>
+        <w:t xml:space="preserve">after the main text and the references,</w:t>
+      </w:r>
+      <w:r>
+        <w:t xml:space="preserve"> </w:t>
+      </w:r>
+      <w:r>
+        <w:t xml:space="preserve">and before the supplementary material.</w:t>
+      </w:r>
+      <w:r>
+        <w:t xml:space="preserve"> </w:t>
+      </w:r>
+      <w:r>
+        <w:t xml:space="preserve">The main text still cites each one by number.</w:t>
+      </w:r>
+    </w:p>
+    <w:p>
+      <w:pPr>
+        <w:pStyle w:val="Compact"/>
+        <w:numPr>
+          <w:ilvl w:val="0"/>
+          <w:numId w:val="1005"/>
+        </w:numPr>
+      </w:pPr>
+      <w:r>
+        <w:rPr>
+          <w:b/>
+          <w:bCs/>
+        </w:rPr>
+        <w:t xml:space="preserve">Insert a page break before the supplementary material header</w:t>
+      </w:r>
+      <w:r>
+        <w:t xml:space="preserve">,</w:t>
+      </w:r>
+      <w:r>
+        <w:t xml:space="preserve"> </w:t>
+      </w:r>
+      <w:r>
+        <w:t xml:space="preserve">so the supplement starts on a new page.</w:t>
+      </w:r>
+    </w:p>
+    <w:p>
+      <w:pPr>
+        <w:pStyle w:val="Compact"/>
+        <w:numPr>
+          <w:ilvl w:val="0"/>
+          <w:numId w:val="1005"/>
+        </w:numPr>
+      </w:pPr>
+      <w:r>
+        <w:rPr>
+          <w:b/>
+          <w:bCs/>
+        </w:rPr>
+        <w:t xml:space="preserve">Keep each caption with its figure or table.</w:t>
+      </w:r>
+      <w:r>
+        <w:t xml:space="preserve"> </w:t>
+      </w:r>
+      <w:r>
+        <w:t xml:space="preserve">Insert a page break before the first figure or table</w:t>
+      </w:r>
+      <w:r>
+        <w:t xml:space="preserve"> </w:t>
+      </w:r>
+      <w:r>
+        <w:t xml:space="preserve">and between consecutive ones,</w:t>
+      </w:r>
+      <w:r>
+        <w:t xml:space="preserve"> </w:t>
+      </w:r>
+      <w:r>
+        <w:t xml:space="preserve">so that each one starts on a page where it fits with its caption.</w:t>
+      </w:r>
+      <w:r>
+        <w:t xml:space="preserve"> </w:t>
+      </w:r>
+      <w:r>
+        <w:t xml:space="preserve">Do not let a caption fall on a different page from its figure or table,</w:t>
+      </w:r>
+      <w:r>
+        <w:t xml:space="preserve"> </w:t>
+      </w:r>
+      <w:r>
+        <w:t xml:space="preserve">or split across a page break,</w:t>
+      </w:r>
+      <w:r>
+        <w:t xml:space="preserve"> </w:t>
+      </w:r>
+      <w:r>
+        <w:t xml:space="preserve">unless it cannot be avoided,</w:t>
+      </w:r>
+      <w:r>
+        <w:t xml:space="preserve"> </w:t>
+      </w:r>
+      <w:r>
+        <w:t xml:space="preserve">as when a figure or table and its caption together are taller than a full page.</w:t>
+      </w:r>
+    </w:p>
+    <w:p>
+      <w:pPr>
+        <w:pStyle w:val="FirstParagraph"/>
+      </w:pPr>
+      <w:r>
+        <w:t xml:space="preserve">In Quarto,</w:t>
+      </w:r>
+      <w:r>
+        <w:t xml:space="preserve"> </w:t>
+      </w:r>
+      <w:r>
+        <w:t xml:space="preserve">the</w:t>
+      </w:r>
+      <w:r>
+        <w:t xml:space="preserve"> </w:t>
+      </w:r>
+      <w:r>
+        <w:rPr>
+          <w:rStyle w:val="VerbatimChar"/>
+        </w:rPr>
+        <w:t xml:space="preserve">{{&lt; pagebreak &gt;}}</w:t>
+      </w:r>
+      <w:r>
+        <w:t xml:space="preserve"> </w:t>
+      </w:r>
+      <w:r>
+        <w:t xml:space="preserve">shortcode inserts a page break</w:t>
+      </w:r>
+      <w:r>
+        <w:t xml:space="preserve"> </w:t>
+      </w:r>
+      <w:r>
+        <w:t xml:space="preserve">in PDF and Word output,</w:t>
+      </w:r>
+      <w:r>
+        <w:t xml:space="preserve"> </w:t>
+      </w:r>
+      <w:r>
+        <w:t xml:space="preserve">and a</w:t>
+      </w:r>
+      <w:r>
+        <w:t xml:space="preserve"> </w:t>
+      </w:r>
+      <w:r>
+        <w:rPr>
+          <w:rStyle w:val="VerbatimChar"/>
+        </w:rPr>
+        <w:t xml:space="preserve">::: {#refs}</w:t>
+      </w:r>
+      <w:r>
+        <w:t xml:space="preserve"> </w:t>
+      </w:r>
+      <w:r>
+        <w:t xml:space="preserve">div places the references</w:t>
+      </w:r>
+      <w:r>
+        <w:t xml:space="preserve"> </w:t>
+      </w:r>
+      <w:r>
+        <w:t xml:space="preserve">where you put the div</w:t>
+      </w:r>
+      <w:r>
+        <w:t xml:space="preserve"> </w:t>
+      </w:r>
+      <w:r>
+        <w:t xml:space="preserve">instead of at the end of the document.</w:t>
+      </w:r>
+      <w:r>
+        <w:t xml:space="preserve"> </w:t>
+      </w:r>
+      <w:r>
+        <w:t xml:space="preserve">Write the figures and tables after that div.</w:t>
+      </w:r>
+    </w:p>
+    <w:bookmarkEnd w:id="18"/>
+    <w:bookmarkStart w:id="19" w:name="check-the-rendered-layout"/>
+    <w:p>
+      <w:pPr>
+        <w:pStyle w:val="Heading3"/>
+      </w:pPr>
+      <w:r>
+        <w:t xml:space="preserve">3.3 Check the rendered layout</w:t>
+      </w:r>
+    </w:p>
+    <w:p>
+      <w:pPr>
+        <w:pStyle w:val="FirstParagraph"/>
+      </w:pPr>
+      <w:r>
+        <w:t xml:space="preserve">Captions, page breaks, and figure placement</w:t>
+      </w:r>
+      <w:r>
+        <w:t xml:space="preserve"> </w:t>
+      </w:r>
+      <w:r>
+        <w:t xml:space="preserve">are properties of the rendered document’s layout.</w:t>
+      </w:r>
+      <w:r>
+        <w:t xml:space="preserve"> </w:t>
+      </w:r>
+      <w:r>
+        <w:t xml:space="preserve">Problems with them are easy to miss when reading the source,</w:t>
+      </w:r>
+      <w:r>
+        <w:t xml:space="preserve"> </w:t>
+      </w:r>
+      <w:r>
+        <w:t xml:space="preserve">and a check of the text and numbers alone will not catch them.</w:t>
+      </w:r>
+      <w:r>
+        <w:t xml:space="preserve"> </w:t>
+      </w:r>
+      <w:r>
+        <w:t xml:space="preserve">Before calling a rendered manuscript reviewed,</w:t>
+      </w:r>
+      <w:r>
+        <w:t xml:space="preserve"> </w:t>
+      </w:r>
+      <w:r>
+        <w:t xml:space="preserve">page through the PDF or Word output</w:t>
+      </w:r>
+      <w:r>
+        <w:t xml:space="preserve"> </w:t>
+      </w:r>
+      <w:r>
+        <w:t xml:space="preserve">and check its layout,</w:t>
+      </w:r>
+      <w:r>
+        <w:t xml:space="preserve"> </w:t>
+      </w:r>
+      <w:r>
+        <w:t xml:space="preserve">not only its text and numbers:</w:t>
+      </w:r>
+    </w:p>
+    <w:p>
+      <w:pPr>
+        <w:pStyle w:val="Compact"/>
+        <w:numPr>
+          <w:ilvl w:val="0"/>
+          <w:numId w:val="1006"/>
+        </w:numPr>
+      </w:pPr>
+      <w:r>
+        <w:t xml:space="preserve">Does every figure and table have a numbered caption?</w:t>
+      </w:r>
+    </w:p>
+    <w:p>
+      <w:pPr>
+        <w:pStyle w:val="Compact"/>
+        <w:numPr>
+          <w:ilvl w:val="0"/>
+          <w:numId w:val="1006"/>
+        </w:numPr>
+      </w:pPr>
+      <w:r>
+        <w:t xml:space="preserve">Does each caption sit on the same page as its figure or table?</w:t>
+      </w:r>
+    </w:p>
+    <w:p>
+      <w:pPr>
+        <w:pStyle w:val="Compact"/>
+        <w:numPr>
+          <w:ilvl w:val="0"/>
+          <w:numId w:val="1006"/>
+        </w:numPr>
+      </w:pPr>
+      <w:r>
+        <w:t xml:space="preserve">For a journal submission,</w:t>
+      </w:r>
+      <w:r>
+        <w:t xml:space="preserve"> </w:t>
+      </w:r>
+      <w:r>
+        <w:t xml:space="preserve">do the main-text figures and tables come after the references</w:t>
+      </w:r>
+      <w:r>
+        <w:t xml:space="preserve"> </w:t>
+      </w:r>
+      <w:r>
+        <w:t xml:space="preserve">and before the supplement,</w:t>
+      </w:r>
+      <w:r>
+        <w:t xml:space="preserve"> </w:t>
+      </w:r>
+      <w:r>
+        <w:t xml:space="preserve">and does the supplementary material start on a new page?</w:t>
+      </w:r>
+    </w:p>
+    <w:bookmarkEnd w:id="19"/>
+    <w:bookmarkEnd w:id="20"/>
+    <w:bookmarkStart w:id="21" w:name="subsection-headings"/>
+    <w:p>
+      <w:pPr>
+        <w:pStyle w:val="Heading2"/>
+      </w:pPr>
+      <w:r>
+        <w:t xml:space="preserve">4 Subsection headings</w:t>
+      </w:r>
+    </w:p>
+    <w:p>
+      <w:pPr>
+        <w:pStyle w:val="FirstParagraph"/>
+      </w:pPr>
+      <w:r>
+        <w:t xml:space="preserve">Use descriptive subsection headings to guide readers through your results.</w:t>
+      </w:r>
+      <w:r>
+        <w:t xml:space="preserve"> </w:t>
+      </w:r>
+      <w:r>
+        <w:t xml:space="preserve">Headings should clearly indicate the content of each section.</w:t>
+      </w:r>
+    </w:p>
+    <w:p>
+      <w:pPr>
+        <w:pStyle w:val="BodyText"/>
+      </w:pPr>
+      <w:r>
+        <w:rPr>
+          <w:b/>
+          <w:bCs/>
+        </w:rPr>
+        <w:t xml:space="preserve">Poor heading</w:t>
+      </w:r>
+      <w:r>
+        <w:t xml:space="preserve">:</w:t>
+      </w:r>
+      <w:r>
+        <w:t xml:space="preserve"> </w:t>
+      </w:r>
+      <w:r>
+        <w:t xml:space="preserve">“Analysis 1”</w:t>
+      </w:r>
+    </w:p>
+    <w:p>
+      <w:pPr>
+        <w:pStyle w:val="BodyText"/>
+      </w:pPr>
+      <w:r>
+        <w:rPr>
+          <w:b/>
+          <w:bCs/>
+        </w:rPr>
+        <w:t xml:space="preserve">Better heading</w:t>
+      </w:r>
+      <w:r>
+        <w:t xml:space="preserve">:</w:t>
+      </w:r>
+      <w:r>
+        <w:t xml:space="preserve"> </w:t>
+      </w:r>
+      <w:r>
+        <w:t xml:space="preserve">“Association between treatment and mortality”</w:t>
+      </w:r>
+    </w:p>
+    <w:p>
+      <w:pPr>
+        <w:pStyle w:val="BodyText"/>
+      </w:pPr>
+      <w:r>
+        <w:rPr>
+          <w:b/>
+          <w:bCs/>
+        </w:rPr>
         <w:t xml:space="preserve">Best heading</w:t>
       </w:r>
       <w:r>
@@ -911,7 +1522,7 @@
         <w:t xml:space="preserve">(when appropriate and not overstating findings)</w:t>
       </w:r>
     </w:p>
-    <w:bookmarkEnd w:id="18"/>
+    <w:bookmarkEnd w:id="21"/>
     <w:sectPr>
       <w:footnotePr>
         <w:numRestart w:val="eachSect"/>
@@ -1251,6 +1862,12 @@
     <w:lvlOverride w:ilvl="8">
       <w:startOverride w:val="1"/>
     </w:lvlOverride>
+  </w:num>
+  <w:num w:numId="1005">
+    <w:abstractNumId w:val="991"/>
+  </w:num>
+  <w:num w:numId="1006">
+    <w:abstractNumId w:val="991"/>
   </w:num>
 </w:numbering>
 </file>

</xml_diff>

<commit_message>
Deploying to gh-pages from @ Morrison-Lab/psw@4722d03e20b2ab4161859a37cd0d4490195ceeba 🚀
</commit_message>
<xml_diff>
--- a/chapters/paper-organization.docx
+++ b/chapters/paper-organization.docx
@@ -15,7 +15,7 @@
         <w:pStyle w:val="Date"/>
       </w:pPr>
       <w:r>
-        <w:t xml:space="preserve">Last modified: 2026-10-05 10:12:22 (UTC)</w:t>
+        <w:t xml:space="preserve">Last modified: 2026-10-05 10:34:59 (UTC)</w:t>
       </w:r>
     </w:p>
     <w:p>
@@ -1523,6 +1523,168 @@
       </w:r>
     </w:p>
     <w:bookmarkEnd w:id="21"/>
+    <w:bookmarkStart w:id="22" w:name="links-to-videos-and-other-media"/>
+    <w:p>
+      <w:pPr>
+        <w:pStyle w:val="Heading2"/>
+      </w:pPr>
+      <w:r>
+        <w:t xml:space="preserve">5 Links to videos and other media</w:t>
+      </w:r>
+    </w:p>
+    <w:p>
+      <w:pPr>
+        <w:pStyle w:val="FirstParagraph"/>
+      </w:pPr>
+      <w:r>
+        <w:t xml:space="preserve">Put each link to a video, podcast, demo or other external material</w:t>
+      </w:r>
+      <w:r>
+        <w:t xml:space="preserve"> </w:t>
+      </w:r>
+      <w:r>
+        <w:t xml:space="preserve">in a short note right after the text the material supports.</w:t>
+      </w:r>
+      <w:r>
+        <w:t xml:space="preserve"> </w:t>
+      </w:r>
+      <w:r>
+        <w:t xml:space="preserve">Do not collect the links in a list at the end of the document.</w:t>
+      </w:r>
+      <w:r>
+        <w:t xml:space="preserve"> </w:t>
+      </w:r>
+      <w:r>
+        <w:t xml:space="preserve">If the material covers several sections,</w:t>
+      </w:r>
+      <w:r>
+        <w:t xml:space="preserve"> </w:t>
+      </w:r>
+      <w:r>
+        <w:t xml:space="preserve">put the note after the first section the material supports.</w:t>
+      </w:r>
+      <w:r>
+        <w:t xml:space="preserve"> </w:t>
+      </w:r>
+      <w:r>
+        <w:t xml:space="preserve">If the text the note supports is a question followed by its answer,</w:t>
+      </w:r>
+      <w:r>
+        <w:t xml:space="preserve"> </w:t>
+      </w:r>
+      <w:r>
+        <w:t xml:space="preserve">put the note after the answer, not between them.</w:t>
+      </w:r>
+    </w:p>
+    <w:p>
+      <w:pPr>
+        <w:pStyle w:val="BodyText"/>
+      </w:pPr>
+      <w:r>
+        <w:t xml:space="preserve">A reader who has just finished a section is ready to use material about it.</w:t>
+      </w:r>
+      <w:r>
+        <w:t xml:space="preserve"> </w:t>
+      </w:r>
+      <w:r>
+        <w:t xml:space="preserve">The same reader at the end of the document must guess which link goes with which section,</w:t>
+      </w:r>
+      <w:r>
+        <w:t xml:space="preserve"> </w:t>
+      </w:r>
+      <w:r>
+        <w:t xml:space="preserve">and may never reach the list.</w:t>
+      </w:r>
+    </w:p>
+    <w:p>
+      <w:pPr>
+        <w:pStyle w:val="BodyText"/>
+      </w:pPr>
+      <w:r>
+        <w:t xml:space="preserve">For each link:</w:t>
+      </w:r>
+    </w:p>
+    <w:p>
+      <w:pPr>
+        <w:pStyle w:val="Compact"/>
+        <w:numPr>
+          <w:ilvl w:val="0"/>
+          <w:numId w:val="1007"/>
+        </w:numPr>
+      </w:pPr>
+      <w:r>
+        <w:t xml:space="preserve">Write one line, such as</w:t>
+      </w:r>
+      <w:r>
+        <w:t xml:space="preserve"> </w:t>
+      </w:r>
+      <w:r>
+        <w:t xml:space="preserve">“Video: Weinberger derives the descent direction (from 3:09).”</w:t>
+      </w:r>
+    </w:p>
+    <w:p>
+      <w:pPr>
+        <w:pStyle w:val="Compact"/>
+        <w:numPr>
+          <w:ilvl w:val="0"/>
+          <w:numId w:val="1007"/>
+        </w:numPr>
+      </w:pPr>
+      <w:r>
+        <w:t xml:space="preserve">Name the speaker and say what the material shows, in simple, literal words.</w:t>
+      </w:r>
+    </w:p>
+    <w:p>
+      <w:pPr>
+        <w:pStyle w:val="Compact"/>
+        <w:numPr>
+          <w:ilvl w:val="0"/>
+          <w:numId w:val="1007"/>
+        </w:numPr>
+      </w:pPr>
+      <w:r>
+        <w:t xml:space="preserve">Link the exact start time when the material covers more than the topic.</w:t>
+      </w:r>
+    </w:p>
+    <w:p>
+      <w:pPr>
+        <w:pStyle w:val="Compact"/>
+        <w:numPr>
+          <w:ilvl w:val="0"/>
+          <w:numId w:val="1007"/>
+        </w:numPr>
+      </w:pPr>
+      <w:r>
+        <w:t xml:space="preserve">Cite the source.</w:t>
+      </w:r>
+    </w:p>
+    <w:p>
+      <w:pPr>
+        <w:pStyle w:val="FirstParagraph"/>
+      </w:pPr>
+      <w:r>
+        <w:t xml:space="preserve">Link public sites freely.</w:t>
+      </w:r>
+      <w:r>
+        <w:t xml:space="preserve"> </w:t>
+      </w:r>
+      <w:r>
+        <w:t xml:space="preserve">Anyone can open them,</w:t>
+      </w:r>
+      <w:r>
+        <w:t xml:space="preserve"> </w:t>
+      </w:r>
+      <w:r>
+        <w:t xml:space="preserve">so a link costs the reader nothing.</w:t>
+      </w:r>
+      <w:r>
+        <w:t xml:space="preserve"> </w:t>
+      </w:r>
+      <w:r>
+        <w:t xml:space="preserve">Do not link private repositories, such as ones that hold graded homework or exams.</w:t>
+      </w:r>
+    </w:p>
+    <w:bookmarkEnd w:id="22"/>
     <w:sectPr>
       <w:footnotePr>
         <w:numRestart w:val="eachSect"/>
@@ -1867,6 +2029,9 @@
     <w:abstractNumId w:val="991"/>
   </w:num>
   <w:num w:numId="1006">
+    <w:abstractNumId w:val="991"/>
+  </w:num>
+  <w:num w:numId="1007">
     <w:abstractNumId w:val="991"/>
   </w:num>
 </w:numbering>

</xml_diff>

<commit_message>
Deploying to gh-pages from @ Morrison-Lab/psw@46c044d29c950943c85b54fe914d35a3bde9a65f 🚀
</commit_message>
<xml_diff>
--- a/chapters/paper-organization.docx
+++ b/chapters/paper-organization.docx
@@ -15,7 +15,7 @@
         <w:pStyle w:val="Date"/>
       </w:pPr>
       <w:r>
-        <w:t xml:space="preserve">Last modified: 2026-10-05 18:48:57 (UTC)</w:t>
+        <w:t xml:space="preserve">Last modified: 2026-10-05 19:03:56 (UTC)</w:t>
       </w:r>
     </w:p>
     <w:p>
@@ -769,7 +769,7 @@
     <w:bookmarkEnd w:id="14"/>
     <w:bookmarkEnd w:id="15"/>
     <w:bookmarkEnd w:id="16"/>
-    <w:bookmarkStart w:id="20" w:name="figures-and-tables"/>
+    <w:bookmarkStart w:id="22" w:name="figures-and-tables"/>
     <w:p>
       <w:pPr>
         <w:pStyle w:val="Heading2"/>
@@ -814,7 +814,7 @@
           <w:rPr>
             <w:rStyle w:val="Hyperlink"/>
           </w:rPr>
-          <w:t xml:space="preserve">Section 3.2</w:t>
+          <w:t xml:space="preserve">Section 3.3</w:t>
         </w:r>
       </w:hyperlink>
       <w:r>
@@ -859,13 +859,13 @@
         <w:t xml:space="preserve">without reading the main text.</w:t>
       </w:r>
     </w:p>
-    <w:bookmarkStart w:id="17" w:name="captions-are-captions-not-headings"/>
+    <w:bookmarkStart w:id="18" w:name="label-variables-in-plain-words"/>
     <w:p>
       <w:pPr>
         <w:pStyle w:val="Heading3"/>
       </w:pPr>
       <w:r>
-        <w:t xml:space="preserve">3.1 Captions are captions, not headings</w:t>
+        <w:t xml:space="preserve">3.1 Label variables in plain words</w:t>
       </w:r>
     </w:p>
     <w:p>
@@ -873,251 +873,13 @@
         <w:pStyle w:val="FirstParagraph"/>
       </w:pPr>
       <w:r>
-        <w:t xml:space="preserve">Give every figure and table a numbered caption,</w:t>
-      </w:r>
-      <w:r>
-        <w:t xml:space="preserve"> </w:t>
-      </w:r>
-      <w:r>
-        <w:t xml:space="preserve">including those in the supplementary material.</w:t>
-      </w:r>
-      <w:r>
-        <w:t xml:space="preserve"> </w:t>
-      </w:r>
-      <w:r>
-        <w:t xml:space="preserve">A table without a caption is incomplete,</w:t>
-      </w:r>
-      <w:r>
-        <w:t xml:space="preserve"> </w:t>
-      </w:r>
-      <w:r>
-        <w:t xml:space="preserve">even when its contents are correct.</w:t>
-      </w:r>
-    </w:p>
-    <w:p>
-      <w:pPr>
-        <w:pStyle w:val="BodyText"/>
-      </w:pPr>
-      <w:r>
-        <w:t xml:space="preserve">Attach each caption to its figure or table</w:t>
-      </w:r>
-      <w:r>
-        <w:t xml:space="preserve"> </w:t>
-      </w:r>
-      <w:r>
-        <w:t xml:space="preserve">with your writing tool’s caption feature</w:t>
-      </w:r>
-      <w:r>
-        <w:t xml:space="preserve"> </w:t>
-      </w:r>
-      <w:r>
-        <w:t xml:space="preserve">(in Quarto, the last line of a</w:t>
-      </w:r>
-      <w:r>
-        <w:t xml:space="preserve"> </w:t>
-      </w:r>
-      <w:r>
-        <w:rPr>
-          <w:rStyle w:val="VerbatimChar"/>
-        </w:rPr>
-        <w:t xml:space="preserve">#fig-</w:t>
-      </w:r>
-      <w:r>
-        <w:t xml:space="preserve"> </w:t>
-      </w:r>
-      <w:r>
-        <w:t xml:space="preserve">or</w:t>
-      </w:r>
-      <w:r>
-        <w:t xml:space="preserve"> </w:t>
-      </w:r>
-      <w:r>
-        <w:rPr>
-          <w:rStyle w:val="VerbatimChar"/>
-        </w:rPr>
-        <w:t xml:space="preserve">#tbl-</w:t>
-      </w:r>
-      <w:r>
-        <w:t xml:space="preserve"> </w:t>
-      </w:r>
-      <w:r>
-        <w:t xml:space="preserve">div),</w:t>
-      </w:r>
-      <w:r>
-        <w:t xml:space="preserve"> </w:t>
-      </w:r>
-      <w:r>
-        <w:t xml:space="preserve">not as a section heading.</w:t>
-      </w:r>
-    </w:p>
-    <w:p>
-      <w:pPr>
-        <w:pStyle w:val="BodyText"/>
-      </w:pPr>
-      <w:r>
-        <w:rPr>
-          <w:b/>
-          <w:bCs/>
-        </w:rPr>
-        <w:t xml:space="preserve">Poor caption</w:t>
-      </w:r>
-      <w:r>
-        <w:t xml:space="preserve">: a section heading that reads</w:t>
-      </w:r>
-      <w:r>
-        <w:t xml:space="preserve"> </w:t>
-      </w:r>
-      <w:r>
-        <w:t xml:space="preserve">“Supplementary Figure S43: Distribution of follow-up time”</w:t>
-      </w:r>
-      <w:r>
-        <w:t xml:space="preserve">,</w:t>
-      </w:r>
-      <w:r>
-        <w:t xml:space="preserve"> </w:t>
-      </w:r>
-      <w:r>
-        <w:t xml:space="preserve">placed above the figure</w:t>
-      </w:r>
-    </w:p>
-    <w:p>
-      <w:pPr>
-        <w:pStyle w:val="BodyText"/>
-      </w:pPr>
-      <w:r>
-        <w:rPr>
-          <w:b/>
-          <w:bCs/>
-        </w:rPr>
-        <w:t xml:space="preserve">Better caption</w:t>
-      </w:r>
-      <w:r>
-        <w:t xml:space="preserve">:</w:t>
-      </w:r>
-      <w:r>
-        <w:t xml:space="preserve"> </w:t>
-      </w:r>
-      <w:r>
-        <w:t xml:space="preserve">“Distribution of follow-up time”</w:t>
-      </w:r>
-      <w:r>
-        <w:t xml:space="preserve">,</w:t>
-      </w:r>
-      <w:r>
-        <w:t xml:space="preserve"> </w:t>
-      </w:r>
-      <w:r>
-        <w:t xml:space="preserve">written as a caption attached to the figure,</w:t>
-      </w:r>
-      <w:r>
-        <w:t xml:space="preserve"> </w:t>
-      </w:r>
-      <w:r>
-        <w:t xml:space="preserve">with its label and number generated by your writing tool</w:t>
-      </w:r>
-      <w:r>
-        <w:t xml:space="preserve"> </w:t>
-      </w:r>
-      <w:r>
-        <w:t xml:space="preserve">rather than typed by hand</w:t>
-      </w:r>
-      <w:r>
-        <w:t xml:space="preserve"> </w:t>
-      </w:r>
-      <w:r>
-        <w:t xml:space="preserve">(a supplementary</w:t>
-      </w:r>
-      <w:r>
-        <w:t xml:space="preserve"> </w:t>
-      </w:r>
-      <w:r>
-        <w:t xml:space="preserve">“S”</w:t>
-      </w:r>
-      <w:r>
-        <w:t xml:space="preserve"> </w:t>
-      </w:r>
-      <w:r>
-        <w:t xml:space="preserve">prefix may need extra setup in the tool)</w:t>
-      </w:r>
-    </w:p>
-    <w:p>
-      <w:pPr>
-        <w:pStyle w:val="BodyText"/>
-      </w:pPr>
-      <w:r>
-        <w:t xml:space="preserve">A heading posing as a caption usually appears in the table of contents,</w:t>
-      </w:r>
-      <w:r>
-        <w:t xml:space="preserve"> </w:t>
-      </w:r>
-      <w:r>
-        <w:t xml:space="preserve">takes on heading styling,</w:t>
-      </w:r>
-      <w:r>
-        <w:t xml:space="preserve"> </w:t>
-      </w:r>
-      <w:r>
-        <w:t xml:space="preserve">and is not attached to its figure.</w:t>
-      </w:r>
-      <w:r>
-        <w:t xml:space="preserve"> </w:t>
-      </w:r>
-      <w:r>
-        <w:t xml:space="preserve">Its number is typed by hand,</w:t>
-      </w:r>
-      <w:r>
-        <w:t xml:space="preserve"> </w:t>
-      </w:r>
-      <w:r>
-        <w:t xml:space="preserve">so it falls out of step with the real numbering</w:t>
-      </w:r>
-      <w:r>
-        <w:t xml:space="preserve"> </w:t>
-      </w:r>
-      <w:r>
-        <w:t xml:space="preserve">when figures are added, removed, or reordered.</w:t>
-      </w:r>
-    </w:p>
-    <w:bookmarkEnd w:id="17"/>
-    <w:bookmarkStart w:id="18" w:name="sec-submission-layout"/>
-    <w:p>
-      <w:pPr>
-        <w:pStyle w:val="Heading3"/>
-      </w:pPr>
-      <w:r>
-        <w:t xml:space="preserve">3.2 Manuscript layout for journal submission</w:t>
-      </w:r>
-    </w:p>
-    <w:p>
-      <w:pPr>
-        <w:pStyle w:val="FirstParagraph"/>
-      </w:pPr>
-      <w:r>
-        <w:t xml:space="preserve">Many journals ask for figures and tables</w:t>
-      </w:r>
-      <w:r>
-        <w:t xml:space="preserve"> </w:t>
-      </w:r>
-      <w:r>
-        <w:t xml:space="preserve">to follow the main text of a submitted manuscript</w:t>
-      </w:r>
-      <w:r>
-        <w:t xml:space="preserve"> </w:t>
-      </w:r>
-      <w:r>
-        <w:t xml:space="preserve">rather than appear inline.</w:t>
-      </w:r>
-      <w:r>
-        <w:t xml:space="preserve"> </w:t>
-      </w:r>
-      <w:r>
-        <w:t xml:space="preserve">Unless the journal’s instructions say otherwise,</w:t>
-      </w:r>
-      <w:r>
-        <w:t xml:space="preserve"> </w:t>
-      </w:r>
-      <w:r>
-        <w:t xml:space="preserve">lay out a submission manuscript as follows:</w:t>
+        <w:t xml:space="preserve">A figure or table is read by people, not by the code that made it.</w:t>
+      </w:r>
+      <w:r>
+        <w:t xml:space="preserve"> </w:t>
+      </w:r>
+      <w:r>
+        <w:t xml:space="preserve">Replace every variable name from the data with a label a reader understands:</w:t>
       </w:r>
     </w:p>
     <w:p>
@@ -1129,32 +891,7 @@
         </w:numPr>
       </w:pPr>
       <w:r>
-        <w:rPr>
-          <w:b/>
-          <w:bCs/>
-        </w:rPr>
-        <w:t xml:space="preserve">Put all main-text figures and tables at the end of the main manuscript</w:t>
-      </w:r>
-      <w:r>
-        <w:t xml:space="preserve">,</w:t>
-      </w:r>
-      <w:r>
-        <w:t xml:space="preserve"> </w:t>
-      </w:r>
-      <w:r>
-        <w:t xml:space="preserve">after the main text and the references,</w:t>
-      </w:r>
-      <w:r>
-        <w:t xml:space="preserve"> </w:t>
-      </w:r>
-      <w:r>
-        <w:t xml:space="preserve">and before the supplementary material.</w:t>
-      </w:r>
-      <w:r>
-        <w:t xml:space="preserve"> </w:t>
-      </w:r>
-      <w:r>
-        <w:t xml:space="preserve">The main text still cites each one by number.</w:t>
+        <w:t xml:space="preserve">turn underscores and other code punctuation into spaces;</w:t>
       </w:r>
     </w:p>
     <w:p>
@@ -1166,20 +903,7 @@
         </w:numPr>
       </w:pPr>
       <w:r>
-        <w:rPr>
-          <w:b/>
-          <w:bCs/>
-        </w:rPr>
-        <w:t xml:space="preserve">Insert a page break before the supplementary material header</w:t>
-      </w:r>
-      <w:r>
-        <w:t xml:space="preserve">,</w:t>
-      </w:r>
-      <w:r>
-        <w:t xml:space="preserve"> </w:t>
-      </w:r>
-      <w:r>
-        <w:t xml:space="preserve">so the supplement starts on a new page.</w:t>
+        <w:t xml:space="preserve">use ordinary capitalization;</w:t>
       </w:r>
     </w:p>
     <w:p>
@@ -1191,53 +915,185 @@
         </w:numPr>
       </w:pPr>
       <w:r>
+        <w:t xml:space="preserve">spell out abbreviations and acronyms where space allows;</w:t>
+      </w:r>
+    </w:p>
+    <w:p>
+      <w:pPr>
+        <w:pStyle w:val="Compact"/>
+        <w:numPr>
+          <w:ilvl w:val="0"/>
+          <w:numId w:val="1005"/>
+        </w:numPr>
+      </w:pPr>
+      <w:r>
+        <w:t xml:space="preserve">give the unit of every measured quantity, in parentheses;</w:t>
+      </w:r>
+    </w:p>
+    <w:p>
+      <w:pPr>
+        <w:pStyle w:val="Compact"/>
+        <w:numPr>
+          <w:ilvl w:val="0"/>
+          <w:numId w:val="1005"/>
+        </w:numPr>
+      </w:pPr>
+      <w:r>
+        <w:t xml:space="preserve">relabel category levels the same way, including legend entries.</w:t>
+      </w:r>
+    </w:p>
+    <w:p>
+      <w:pPr>
+        <w:pStyle w:val="FirstParagraph"/>
+      </w:pPr>
+      <w:r>
+        <w:t xml:space="preserve">Use the same label for a variable in every figure, table and paragraph,</w:t>
+      </w:r>
+      <w:r>
+        <w:t xml:space="preserve"> </w:t>
+      </w:r>
+      <w:r>
+        <w:t xml:space="preserve">so a reader can match them up.</w:t>
+      </w:r>
+    </w:p>
+    <w:bookmarkStart w:id="17" w:name="exm-figure-labels"/>
+    <w:p>
+      <w:pPr>
+        <w:pStyle w:val="BodyText"/>
+      </w:pPr>
+      <w:r>
         <w:rPr>
           <w:b/>
           <w:bCs/>
         </w:rPr>
-        <w:t xml:space="preserve">Keep each caption with its figure or table.</w:t>
-      </w:r>
-      <w:r>
-        <w:t xml:space="preserve"> </w:t>
-      </w:r>
-      <w:r>
-        <w:t xml:space="preserve">Insert a page break before the first figure or table</w:t>
-      </w:r>
-      <w:r>
-        <w:t xml:space="preserve"> </w:t>
-      </w:r>
-      <w:r>
-        <w:t xml:space="preserve">and between consecutive ones,</w:t>
-      </w:r>
-      <w:r>
-        <w:t xml:space="preserve"> </w:t>
-      </w:r>
-      <w:r>
-        <w:t xml:space="preserve">so that each one starts on a page where it fits with its caption.</w:t>
-      </w:r>
-      <w:r>
-        <w:t xml:space="preserve"> </w:t>
-      </w:r>
-      <w:r>
-        <w:t xml:space="preserve">Do not let a caption fall on a different page from its figure or table,</w:t>
-      </w:r>
-      <w:r>
-        <w:t xml:space="preserve"> </w:t>
-      </w:r>
-      <w:r>
-        <w:t xml:space="preserve">or split across a page break,</w:t>
-      </w:r>
-      <w:r>
-        <w:t xml:space="preserve"> </w:t>
-      </w:r>
-      <w:r>
-        <w:t xml:space="preserve">unless it cannot be avoided,</w:t>
-      </w:r>
-      <w:r>
-        <w:t xml:space="preserve"> </w:t>
-      </w:r>
-      <w:r>
-        <w:t xml:space="preserve">as when a figure or table and its caption together are taller than a full page.</w:t>
+        <w:t xml:space="preserve">Example 1 (Relabeling axes and a legend)</w:t>
+      </w:r>
+      <w:r>
+        <w:t xml:space="preserve"> </w:t>
+      </w:r>
+      <w:r>
+        <w:t xml:space="preserve"> </w:t>
+      </w:r>
+    </w:p>
+    <w:p>
+      <w:pPr>
+        <w:pStyle w:val="BlockText"/>
+      </w:pPr>
+      <w:r>
+        <w:t xml:space="preserve">❌ x-axis</w:t>
+      </w:r>
+      <w:r>
+        <w:t xml:space="preserve"> </w:t>
+      </w:r>
+      <w:r>
+        <w:rPr>
+          <w:rStyle w:val="VerbatimChar"/>
+        </w:rPr>
+        <w:t xml:space="preserve">age_yrs</w:t>
+      </w:r>
+      <w:r>
+        <w:t xml:space="preserve">, y-axis</w:t>
+      </w:r>
+      <w:r>
+        <w:t xml:space="preserve"> </w:t>
+      </w:r>
+      <w:r>
+        <w:rPr>
+          <w:rStyle w:val="VerbatimChar"/>
+        </w:rPr>
+        <w:t xml:space="preserve">sbp</w:t>
+      </w:r>
+      <w:r>
+        <w:t xml:space="preserve">, legend</w:t>
+      </w:r>
+      <w:r>
+        <w:t xml:space="preserve"> </w:t>
+      </w:r>
+      <w:r>
+        <w:rPr>
+          <w:rStyle w:val="VerbatimChar"/>
+        </w:rPr>
+        <w:t xml:space="preserve">trt_grp</w:t>
+      </w:r>
+      <w:r>
+        <w:t xml:space="preserve">:</w:t>
+      </w:r>
+      <w:r>
+        <w:t xml:space="preserve"> </w:t>
+      </w:r>
+      <w:r>
+        <w:rPr>
+          <w:rStyle w:val="VerbatimChar"/>
+        </w:rPr>
+        <w:t xml:space="preserve">ctrl</w:t>
+      </w:r>
+      <w:r>
+        <w:t xml:space="preserve">,</w:t>
+      </w:r>
+      <w:r>
+        <w:t xml:space="preserve"> </w:t>
+      </w:r>
+      <w:r>
+        <w:rPr>
+          <w:rStyle w:val="VerbatimChar"/>
+        </w:rPr>
+        <w:t xml:space="preserve">tx</w:t>
+      </w:r>
+    </w:p>
+    <w:p>
+      <w:pPr>
+        <w:pStyle w:val="BlockText"/>
+      </w:pPr>
+      <w:r>
+        <w:t xml:space="preserve">✅ x-axis</w:t>
+      </w:r>
+      <w:r>
+        <w:t xml:space="preserve"> </w:t>
+      </w:r>
+      <w:r>
+        <w:t xml:space="preserve">“Age (years)”</w:t>
+      </w:r>
+      <w:r>
+        <w:t xml:space="preserve">, y-axis</w:t>
+      </w:r>
+      <w:r>
+        <w:t xml:space="preserve"> </w:t>
+      </w:r>
+      <w:r>
+        <w:t xml:space="preserve">“Systolic blood pressure (mm Hg)”</w:t>
+      </w:r>
+      <w:r>
+        <w:t xml:space="preserve">,</w:t>
+      </w:r>
+      <w:r>
+        <w:t xml:space="preserve"> </w:t>
+      </w:r>
+      <w:r>
+        <w:t xml:space="preserve">legend</w:t>
+      </w:r>
+      <w:r>
+        <w:t xml:space="preserve"> </w:t>
+      </w:r>
+      <w:r>
+        <w:t xml:space="preserve">“Treatment group”</w:t>
+      </w:r>
+      <w:r>
+        <w:t xml:space="preserve">:</w:t>
+      </w:r>
+      <w:r>
+        <w:t xml:space="preserve"> </w:t>
+      </w:r>
+      <w:r>
+        <w:t xml:space="preserve">“Control”</w:t>
+      </w:r>
+      <w:r>
+        <w:t xml:space="preserve">,</w:t>
+      </w:r>
+      <w:r>
+        <w:t xml:space="preserve"> </w:t>
+      </w:r>
+      <w:r>
+        <w:t xml:space="preserve">“Treatment”</w:t>
       </w:r>
     </w:p>
     <w:p>
@@ -1245,83 +1101,72 @@
         <w:pStyle w:val="FirstParagraph"/>
       </w:pPr>
       <w:r>
-        <w:t xml:space="preserve">In Quarto,</w:t>
-      </w:r>
-      <w:r>
-        <w:t xml:space="preserve"> </w:t>
-      </w:r>
-      <w:r>
-        <w:t xml:space="preserve">the</w:t>
-      </w:r>
-      <w:r>
-        <w:t xml:space="preserve"> </w:t>
-      </w:r>
-      <w:r>
-        <w:rPr>
-          <w:rStyle w:val="VerbatimChar"/>
-        </w:rPr>
-        <w:t xml:space="preserve">{{&lt; pagebreak &gt;}}</w:t>
-      </w:r>
-      <w:r>
-        <w:t xml:space="preserve"> </w:t>
-      </w:r>
-      <w:r>
-        <w:t xml:space="preserve">shortcode inserts a page break</w:t>
-      </w:r>
-      <w:r>
-        <w:t xml:space="preserve"> </w:t>
-      </w:r>
-      <w:r>
-        <w:t xml:space="preserve">in PDF and Word output,</w:t>
-      </w:r>
-      <w:r>
-        <w:t xml:space="preserve"> </w:t>
-      </w:r>
-      <w:r>
-        <w:t xml:space="preserve">and a</w:t>
-      </w:r>
-      <w:r>
-        <w:t xml:space="preserve"> </w:t>
-      </w:r>
-      <w:r>
-        <w:rPr>
-          <w:rStyle w:val="VerbatimChar"/>
-        </w:rPr>
-        <w:t xml:space="preserve">::: {#refs}</w:t>
-      </w:r>
-      <w:r>
-        <w:t xml:space="preserve"> </w:t>
-      </w:r>
-      <w:r>
-        <w:t xml:space="preserve">div places the references</w:t>
-      </w:r>
-      <w:r>
-        <w:t xml:space="preserve"> </w:t>
-      </w:r>
-      <w:r>
-        <w:t xml:space="preserve">where you put the div</w:t>
-      </w:r>
-      <w:r>
-        <w:t xml:space="preserve"> </w:t>
-      </w:r>
-      <w:r>
-        <w:t xml:space="preserve">instead of at the end of the document.</w:t>
-      </w:r>
-      <w:r>
-        <w:t xml:space="preserve"> </w:t>
-      </w:r>
-      <w:r>
-        <w:t xml:space="preserve">Write the figures and tables after that div.</w:t>
-      </w:r>
-    </w:p>
+        <w:t xml:space="preserve">In R with</w:t>
+      </w:r>
+      <w:r>
+        <w:t xml:space="preserve"> </w:t>
+      </w:r>
+      <w:r>
+        <w:rPr>
+          <w:rStyle w:val="VerbatimChar"/>
+        </w:rPr>
+        <w:t xml:space="preserve">ggplot2</w:t>
+      </w:r>
+      <w:r>
+        <w:t xml:space="preserve">,</w:t>
+      </w:r>
+      <w:r>
+        <w:t xml:space="preserve"> </w:t>
+      </w:r>
+      <w:r>
+        <w:t xml:space="preserve">set the axis and legend titles with</w:t>
+      </w:r>
+      <w:r>
+        <w:t xml:space="preserve"> </w:t>
+      </w:r>
+      <w:r>
+        <w:rPr>
+          <w:rStyle w:val="VerbatimChar"/>
+        </w:rPr>
+        <w:t xml:space="preserve">labs()</w:t>
+      </w:r>
+      <w:r>
+        <w:t xml:space="preserve">,</w:t>
+      </w:r>
+      <w:r>
+        <w:t xml:space="preserve"> </w:t>
+      </w:r>
+      <w:r>
+        <w:t xml:space="preserve">and recode the category levels before plotting,</w:t>
+      </w:r>
+      <w:r>
+        <w:t xml:space="preserve"> </w:t>
+      </w:r>
+      <w:r>
+        <w:t xml:space="preserve">for example with</w:t>
+      </w:r>
+      <w:r>
+        <w:t xml:space="preserve"> </w:t>
+      </w:r>
+      <w:r>
+        <w:rPr>
+          <w:rStyle w:val="VerbatimChar"/>
+        </w:rPr>
+        <w:t xml:space="preserve">forcats::fct_recode()</w:t>
+      </w:r>
+      <w:r>
+        <w:t xml:space="preserve">.</w:t>
+      </w:r>
+    </w:p>
+    <w:bookmarkEnd w:id="17"/>
     <w:bookmarkEnd w:id="18"/>
-    <w:bookmarkStart w:id="19" w:name="check-the-rendered-layout"/>
+    <w:bookmarkStart w:id="19" w:name="captions-are-captions-not-headings"/>
     <w:p>
       <w:pPr>
         <w:pStyle w:val="Heading3"/>
       </w:pPr>
       <w:r>
-        <w:t xml:space="preserve">3.3 Check the rendered layout</w:t>
+        <w:t xml:space="preserve">3.2 Captions are captions, not headings</w:t>
       </w:r>
     </w:p>
     <w:p>
@@ -1329,49 +1174,251 @@
         <w:pStyle w:val="FirstParagraph"/>
       </w:pPr>
       <w:r>
-        <w:t xml:space="preserve">Captions, page breaks, and figure placement</w:t>
-      </w:r>
-      <w:r>
-        <w:t xml:space="preserve"> </w:t>
-      </w:r>
-      <w:r>
-        <w:t xml:space="preserve">are properties of the rendered document’s layout.</w:t>
-      </w:r>
-      <w:r>
-        <w:t xml:space="preserve"> </w:t>
-      </w:r>
-      <w:r>
-        <w:t xml:space="preserve">Problems with them are easy to miss when reading the source,</w:t>
-      </w:r>
-      <w:r>
-        <w:t xml:space="preserve"> </w:t>
-      </w:r>
-      <w:r>
-        <w:t xml:space="preserve">and a check of the text and numbers alone will not catch them.</w:t>
-      </w:r>
-      <w:r>
-        <w:t xml:space="preserve"> </w:t>
-      </w:r>
-      <w:r>
-        <w:t xml:space="preserve">Before calling a rendered manuscript reviewed,</w:t>
-      </w:r>
-      <w:r>
-        <w:t xml:space="preserve"> </w:t>
-      </w:r>
-      <w:r>
-        <w:t xml:space="preserve">page through the PDF or Word output</w:t>
-      </w:r>
-      <w:r>
-        <w:t xml:space="preserve"> </w:t>
-      </w:r>
-      <w:r>
-        <w:t xml:space="preserve">and check its layout,</w:t>
-      </w:r>
-      <w:r>
-        <w:t xml:space="preserve"> </w:t>
-      </w:r>
-      <w:r>
-        <w:t xml:space="preserve">not only its text and numbers:</w:t>
+        <w:t xml:space="preserve">Give every figure and table a numbered caption,</w:t>
+      </w:r>
+      <w:r>
+        <w:t xml:space="preserve"> </w:t>
+      </w:r>
+      <w:r>
+        <w:t xml:space="preserve">including those in the supplementary material.</w:t>
+      </w:r>
+      <w:r>
+        <w:t xml:space="preserve"> </w:t>
+      </w:r>
+      <w:r>
+        <w:t xml:space="preserve">A table without a caption is incomplete,</w:t>
+      </w:r>
+      <w:r>
+        <w:t xml:space="preserve"> </w:t>
+      </w:r>
+      <w:r>
+        <w:t xml:space="preserve">even when its contents are correct.</w:t>
+      </w:r>
+    </w:p>
+    <w:p>
+      <w:pPr>
+        <w:pStyle w:val="BodyText"/>
+      </w:pPr>
+      <w:r>
+        <w:t xml:space="preserve">Attach each caption to its figure or table</w:t>
+      </w:r>
+      <w:r>
+        <w:t xml:space="preserve"> </w:t>
+      </w:r>
+      <w:r>
+        <w:t xml:space="preserve">with your writing tool’s caption feature</w:t>
+      </w:r>
+      <w:r>
+        <w:t xml:space="preserve"> </w:t>
+      </w:r>
+      <w:r>
+        <w:t xml:space="preserve">(in Quarto, the last line of a</w:t>
+      </w:r>
+      <w:r>
+        <w:t xml:space="preserve"> </w:t>
+      </w:r>
+      <w:r>
+        <w:rPr>
+          <w:rStyle w:val="VerbatimChar"/>
+        </w:rPr>
+        <w:t xml:space="preserve">#fig-</w:t>
+      </w:r>
+      <w:r>
+        <w:t xml:space="preserve"> </w:t>
+      </w:r>
+      <w:r>
+        <w:t xml:space="preserve">or</w:t>
+      </w:r>
+      <w:r>
+        <w:t xml:space="preserve"> </w:t>
+      </w:r>
+      <w:r>
+        <w:rPr>
+          <w:rStyle w:val="VerbatimChar"/>
+        </w:rPr>
+        <w:t xml:space="preserve">#tbl-</w:t>
+      </w:r>
+      <w:r>
+        <w:t xml:space="preserve"> </w:t>
+      </w:r>
+      <w:r>
+        <w:t xml:space="preserve">div),</w:t>
+      </w:r>
+      <w:r>
+        <w:t xml:space="preserve"> </w:t>
+      </w:r>
+      <w:r>
+        <w:t xml:space="preserve">not as a section heading.</w:t>
+      </w:r>
+    </w:p>
+    <w:p>
+      <w:pPr>
+        <w:pStyle w:val="BodyText"/>
+      </w:pPr>
+      <w:r>
+        <w:rPr>
+          <w:b/>
+          <w:bCs/>
+        </w:rPr>
+        <w:t xml:space="preserve">Poor caption</w:t>
+      </w:r>
+      <w:r>
+        <w:t xml:space="preserve">: a section heading that reads</w:t>
+      </w:r>
+      <w:r>
+        <w:t xml:space="preserve"> </w:t>
+      </w:r>
+      <w:r>
+        <w:t xml:space="preserve">“Supplementary Figure S43: Distribution of follow-up time”</w:t>
+      </w:r>
+      <w:r>
+        <w:t xml:space="preserve">,</w:t>
+      </w:r>
+      <w:r>
+        <w:t xml:space="preserve"> </w:t>
+      </w:r>
+      <w:r>
+        <w:t xml:space="preserve">placed above the figure</w:t>
+      </w:r>
+    </w:p>
+    <w:p>
+      <w:pPr>
+        <w:pStyle w:val="BodyText"/>
+      </w:pPr>
+      <w:r>
+        <w:rPr>
+          <w:b/>
+          <w:bCs/>
+        </w:rPr>
+        <w:t xml:space="preserve">Better caption</w:t>
+      </w:r>
+      <w:r>
+        <w:t xml:space="preserve">:</w:t>
+      </w:r>
+      <w:r>
+        <w:t xml:space="preserve"> </w:t>
+      </w:r>
+      <w:r>
+        <w:t xml:space="preserve">“Distribution of follow-up time”</w:t>
+      </w:r>
+      <w:r>
+        <w:t xml:space="preserve">,</w:t>
+      </w:r>
+      <w:r>
+        <w:t xml:space="preserve"> </w:t>
+      </w:r>
+      <w:r>
+        <w:t xml:space="preserve">written as a caption attached to the figure,</w:t>
+      </w:r>
+      <w:r>
+        <w:t xml:space="preserve"> </w:t>
+      </w:r>
+      <w:r>
+        <w:t xml:space="preserve">with its label and number generated by your writing tool</w:t>
+      </w:r>
+      <w:r>
+        <w:t xml:space="preserve"> </w:t>
+      </w:r>
+      <w:r>
+        <w:t xml:space="preserve">rather than typed by hand</w:t>
+      </w:r>
+      <w:r>
+        <w:t xml:space="preserve"> </w:t>
+      </w:r>
+      <w:r>
+        <w:t xml:space="preserve">(a supplementary</w:t>
+      </w:r>
+      <w:r>
+        <w:t xml:space="preserve"> </w:t>
+      </w:r>
+      <w:r>
+        <w:t xml:space="preserve">“S”</w:t>
+      </w:r>
+      <w:r>
+        <w:t xml:space="preserve"> </w:t>
+      </w:r>
+      <w:r>
+        <w:t xml:space="preserve">prefix may need extra setup in the tool)</w:t>
+      </w:r>
+    </w:p>
+    <w:p>
+      <w:pPr>
+        <w:pStyle w:val="BodyText"/>
+      </w:pPr>
+      <w:r>
+        <w:t xml:space="preserve">A heading posing as a caption usually appears in the table of contents,</w:t>
+      </w:r>
+      <w:r>
+        <w:t xml:space="preserve"> </w:t>
+      </w:r>
+      <w:r>
+        <w:t xml:space="preserve">takes on heading styling,</w:t>
+      </w:r>
+      <w:r>
+        <w:t xml:space="preserve"> </w:t>
+      </w:r>
+      <w:r>
+        <w:t xml:space="preserve">and is not attached to its figure.</w:t>
+      </w:r>
+      <w:r>
+        <w:t xml:space="preserve"> </w:t>
+      </w:r>
+      <w:r>
+        <w:t xml:space="preserve">Its number is typed by hand,</w:t>
+      </w:r>
+      <w:r>
+        <w:t xml:space="preserve"> </w:t>
+      </w:r>
+      <w:r>
+        <w:t xml:space="preserve">so it falls out of step with the real numbering</w:t>
+      </w:r>
+      <w:r>
+        <w:t xml:space="preserve"> </w:t>
+      </w:r>
+      <w:r>
+        <w:t xml:space="preserve">when figures are added, removed, or reordered.</w:t>
+      </w:r>
+    </w:p>
+    <w:bookmarkEnd w:id="19"/>
+    <w:bookmarkStart w:id="20" w:name="sec-submission-layout"/>
+    <w:p>
+      <w:pPr>
+        <w:pStyle w:val="Heading3"/>
+      </w:pPr>
+      <w:r>
+        <w:t xml:space="preserve">3.3 Manuscript layout for journal submission</w:t>
+      </w:r>
+    </w:p>
+    <w:p>
+      <w:pPr>
+        <w:pStyle w:val="FirstParagraph"/>
+      </w:pPr>
+      <w:r>
+        <w:t xml:space="preserve">Many journals ask for figures and tables</w:t>
+      </w:r>
+      <w:r>
+        <w:t xml:space="preserve"> </w:t>
+      </w:r>
+      <w:r>
+        <w:t xml:space="preserve">to follow the main text of a submitted manuscript</w:t>
+      </w:r>
+      <w:r>
+        <w:t xml:space="preserve"> </w:t>
+      </w:r>
+      <w:r>
+        <w:t xml:space="preserve">rather than appear inline.</w:t>
+      </w:r>
+      <w:r>
+        <w:t xml:space="preserve"> </w:t>
+      </w:r>
+      <w:r>
+        <w:t xml:space="preserve">Unless the journal’s instructions say otherwise,</w:t>
+      </w:r>
+      <w:r>
+        <w:t xml:space="preserve"> </w:t>
+      </w:r>
+      <w:r>
+        <w:t xml:space="preserve">lay out a submission manuscript as follows:</w:t>
       </w:r>
     </w:p>
     <w:p>
@@ -1383,7 +1430,32 @@
         </w:numPr>
       </w:pPr>
       <w:r>
-        <w:t xml:space="preserve">Does every figure and table have a numbered caption?</w:t>
+        <w:rPr>
+          <w:b/>
+          <w:bCs/>
+        </w:rPr>
+        <w:t xml:space="preserve">Put all main-text figures and tables at the end of the main manuscript</w:t>
+      </w:r>
+      <w:r>
+        <w:t xml:space="preserve">,</w:t>
+      </w:r>
+      <w:r>
+        <w:t xml:space="preserve"> </w:t>
+      </w:r>
+      <w:r>
+        <w:t xml:space="preserve">after the main text and the references,</w:t>
+      </w:r>
+      <w:r>
+        <w:t xml:space="preserve"> </w:t>
+      </w:r>
+      <w:r>
+        <w:t xml:space="preserve">and before the supplementary material.</w:t>
+      </w:r>
+      <w:r>
+        <w:t xml:space="preserve"> </w:t>
+      </w:r>
+      <w:r>
+        <w:t xml:space="preserve">The main text still cites each one by number.</w:t>
       </w:r>
     </w:p>
     <w:p>
@@ -1395,7 +1467,20 @@
         </w:numPr>
       </w:pPr>
       <w:r>
-        <w:t xml:space="preserve">Does each caption sit on the same page as its figure or table?</w:t>
+        <w:rPr>
+          <w:b/>
+          <w:bCs/>
+        </w:rPr>
+        <w:t xml:space="preserve">Insert a page break before the supplementary material header</w:t>
+      </w:r>
+      <w:r>
+        <w:t xml:space="preserve">,</w:t>
+      </w:r>
+      <w:r>
+        <w:t xml:space="preserve"> </w:t>
+      </w:r>
+      <w:r>
+        <w:t xml:space="preserve">so the supplement starts on a new page.</w:t>
       </w:r>
     </w:p>
     <w:p>
@@ -1407,129 +1492,53 @@
         </w:numPr>
       </w:pPr>
       <w:r>
-        <w:t xml:space="preserve">For a journal submission,</w:t>
-      </w:r>
-      <w:r>
-        <w:t xml:space="preserve"> </w:t>
-      </w:r>
-      <w:r>
-        <w:t xml:space="preserve">do the main-text figures and tables come after the references</w:t>
-      </w:r>
-      <w:r>
-        <w:t xml:space="preserve"> </w:t>
-      </w:r>
-      <w:r>
-        <w:t xml:space="preserve">and before the supplement,</w:t>
-      </w:r>
-      <w:r>
-        <w:t xml:space="preserve"> </w:t>
-      </w:r>
-      <w:r>
-        <w:t xml:space="preserve">and does the supplementary material start on a new page?</w:t>
-      </w:r>
-    </w:p>
-    <w:bookmarkEnd w:id="19"/>
-    <w:bookmarkEnd w:id="20"/>
-    <w:bookmarkStart w:id="21" w:name="subsection-headings"/>
-    <w:p>
-      <w:pPr>
-        <w:pStyle w:val="Heading2"/>
-      </w:pPr>
-      <w:r>
-        <w:t xml:space="preserve">4 Subsection headings</w:t>
-      </w:r>
-    </w:p>
-    <w:p>
-      <w:pPr>
-        <w:pStyle w:val="FirstParagraph"/>
-      </w:pPr>
-      <w:r>
-        <w:t xml:space="preserve">Use descriptive subsection headings to guide readers through your results.</w:t>
-      </w:r>
-      <w:r>
-        <w:t xml:space="preserve"> </w:t>
-      </w:r>
-      <w:r>
-        <w:t xml:space="preserve">Headings should clearly indicate the content of each section.</w:t>
-      </w:r>
-    </w:p>
-    <w:p>
-      <w:pPr>
-        <w:pStyle w:val="BodyText"/>
-      </w:pPr>
-      <w:r>
         <w:rPr>
           <w:b/>
           <w:bCs/>
         </w:rPr>
-        <w:t xml:space="preserve">Poor heading</w:t>
-      </w:r>
-      <w:r>
-        <w:t xml:space="preserve">:</w:t>
-      </w:r>
-      <w:r>
-        <w:t xml:space="preserve"> </w:t>
-      </w:r>
-      <w:r>
-        <w:t xml:space="preserve">“Analysis 1”</w:t>
-      </w:r>
-    </w:p>
-    <w:p>
-      <w:pPr>
-        <w:pStyle w:val="BodyText"/>
-      </w:pPr>
-      <w:r>
-        <w:rPr>
-          <w:b/>
-          <w:bCs/>
-        </w:rPr>
-        <w:t xml:space="preserve">Better heading</w:t>
-      </w:r>
-      <w:r>
-        <w:t xml:space="preserve">:</w:t>
-      </w:r>
-      <w:r>
-        <w:t xml:space="preserve"> </w:t>
-      </w:r>
-      <w:r>
-        <w:t xml:space="preserve">“Association between treatment and mortality”</w:t>
-      </w:r>
-    </w:p>
-    <w:p>
-      <w:pPr>
-        <w:pStyle w:val="BodyText"/>
-      </w:pPr>
-      <w:r>
-        <w:rPr>
-          <w:b/>
-          <w:bCs/>
-        </w:rPr>
-        <w:t xml:space="preserve">Best heading</w:t>
-      </w:r>
-      <w:r>
-        <w:t xml:space="preserve">:</w:t>
-      </w:r>
-      <w:r>
-        <w:t xml:space="preserve"> </w:t>
-      </w:r>
-      <w:r>
-        <w:t xml:space="preserve">“Treatment reduced mortality by 30%”</w:t>
-      </w:r>
-      <w:r>
-        <w:t xml:space="preserve"> </w:t>
-      </w:r>
-      <w:r>
-        <w:t xml:space="preserve">(when appropriate and not overstating findings)</w:t>
-      </w:r>
-    </w:p>
-    <w:bookmarkEnd w:id="21"/>
-    <w:bookmarkStart w:id="22" w:name="links-to-videos-and-other-media"/>
-    <w:p>
-      <w:pPr>
-        <w:pStyle w:val="Heading2"/>
-      </w:pPr>
-      <w:r>
-        <w:t xml:space="preserve">5 Links to videos and other media</w:t>
+        <w:t xml:space="preserve">Keep each caption with its figure or table.</w:t>
+      </w:r>
+      <w:r>
+        <w:t xml:space="preserve"> </w:t>
+      </w:r>
+      <w:r>
+        <w:t xml:space="preserve">Insert a page break before the first figure or table</w:t>
+      </w:r>
+      <w:r>
+        <w:t xml:space="preserve"> </w:t>
+      </w:r>
+      <w:r>
+        <w:t xml:space="preserve">and between consecutive ones,</w:t>
+      </w:r>
+      <w:r>
+        <w:t xml:space="preserve"> </w:t>
+      </w:r>
+      <w:r>
+        <w:t xml:space="preserve">so that each one starts on a page where it fits with its caption.</w:t>
+      </w:r>
+      <w:r>
+        <w:t xml:space="preserve"> </w:t>
+      </w:r>
+      <w:r>
+        <w:t xml:space="preserve">Do not let a caption fall on a different page from its figure or table,</w:t>
+      </w:r>
+      <w:r>
+        <w:t xml:space="preserve"> </w:t>
+      </w:r>
+      <w:r>
+        <w:t xml:space="preserve">or split across a page break,</w:t>
+      </w:r>
+      <w:r>
+        <w:t xml:space="preserve"> </w:t>
+      </w:r>
+      <w:r>
+        <w:t xml:space="preserve">unless it cannot be avoided,</w:t>
+      </w:r>
+      <w:r>
+        <w:t xml:space="preserve"> </w:t>
+      </w:r>
+      <w:r>
+        <w:t xml:space="preserve">as when a figure or table and its caption together are taller than a full page.</w:t>
       </w:r>
     </w:p>
     <w:p>
@@ -1537,71 +1546,133 @@
         <w:pStyle w:val="FirstParagraph"/>
       </w:pPr>
       <w:r>
-        <w:t xml:space="preserve">Put each link to a video, podcast, demo or other external material</w:t>
-      </w:r>
-      <w:r>
-        <w:t xml:space="preserve"> </w:t>
-      </w:r>
-      <w:r>
-        <w:t xml:space="preserve">in a short note right after the text the material supports.</w:t>
-      </w:r>
-      <w:r>
-        <w:t xml:space="preserve"> </w:t>
-      </w:r>
-      <w:r>
-        <w:t xml:space="preserve">Do not collect the links in a list at the end of the document.</w:t>
-      </w:r>
-      <w:r>
-        <w:t xml:space="preserve"> </w:t>
-      </w:r>
-      <w:r>
-        <w:t xml:space="preserve">If the material covers several sections,</w:t>
-      </w:r>
-      <w:r>
-        <w:t xml:space="preserve"> </w:t>
-      </w:r>
-      <w:r>
-        <w:t xml:space="preserve">put the note after the first section the material supports.</w:t>
-      </w:r>
-      <w:r>
-        <w:t xml:space="preserve"> </w:t>
-      </w:r>
-      <w:r>
-        <w:t xml:space="preserve">If the text the note supports is a question followed by its answer,</w:t>
-      </w:r>
-      <w:r>
-        <w:t xml:space="preserve"> </w:t>
-      </w:r>
-      <w:r>
-        <w:t xml:space="preserve">put the note after the answer, not between them.</w:t>
-      </w:r>
-    </w:p>
-    <w:p>
-      <w:pPr>
-        <w:pStyle w:val="BodyText"/>
-      </w:pPr>
-      <w:r>
-        <w:t xml:space="preserve">A reader who has just finished a section is ready to use material about it.</w:t>
-      </w:r>
-      <w:r>
-        <w:t xml:space="preserve"> </w:t>
-      </w:r>
-      <w:r>
-        <w:t xml:space="preserve">The same reader at the end of the document must guess which link goes with which section,</w:t>
-      </w:r>
-      <w:r>
-        <w:t xml:space="preserve"> </w:t>
-      </w:r>
-      <w:r>
-        <w:t xml:space="preserve">and may never reach the list.</w:t>
-      </w:r>
-    </w:p>
-    <w:p>
-      <w:pPr>
-        <w:pStyle w:val="BodyText"/>
-      </w:pPr>
-      <w:r>
-        <w:t xml:space="preserve">For each link:</w:t>
+        <w:t xml:space="preserve">In Quarto,</w:t>
+      </w:r>
+      <w:r>
+        <w:t xml:space="preserve"> </w:t>
+      </w:r>
+      <w:r>
+        <w:t xml:space="preserve">the</w:t>
+      </w:r>
+      <w:r>
+        <w:t xml:space="preserve"> </w:t>
+      </w:r>
+      <w:r>
+        <w:rPr>
+          <w:rStyle w:val="VerbatimChar"/>
+        </w:rPr>
+        <w:t xml:space="preserve">{{&lt; pagebreak &gt;}}</w:t>
+      </w:r>
+      <w:r>
+        <w:t xml:space="preserve"> </w:t>
+      </w:r>
+      <w:r>
+        <w:t xml:space="preserve">shortcode inserts a page break</w:t>
+      </w:r>
+      <w:r>
+        <w:t xml:space="preserve"> </w:t>
+      </w:r>
+      <w:r>
+        <w:t xml:space="preserve">in PDF and Word output,</w:t>
+      </w:r>
+      <w:r>
+        <w:t xml:space="preserve"> </w:t>
+      </w:r>
+      <w:r>
+        <w:t xml:space="preserve">and a</w:t>
+      </w:r>
+      <w:r>
+        <w:t xml:space="preserve"> </w:t>
+      </w:r>
+      <w:r>
+        <w:rPr>
+          <w:rStyle w:val="VerbatimChar"/>
+        </w:rPr>
+        <w:t xml:space="preserve">::: {#refs}</w:t>
+      </w:r>
+      <w:r>
+        <w:t xml:space="preserve"> </w:t>
+      </w:r>
+      <w:r>
+        <w:t xml:space="preserve">div places the references</w:t>
+      </w:r>
+      <w:r>
+        <w:t xml:space="preserve"> </w:t>
+      </w:r>
+      <w:r>
+        <w:t xml:space="preserve">where you put the div</w:t>
+      </w:r>
+      <w:r>
+        <w:t xml:space="preserve"> </w:t>
+      </w:r>
+      <w:r>
+        <w:t xml:space="preserve">instead of at the end of the document.</w:t>
+      </w:r>
+      <w:r>
+        <w:t xml:space="preserve"> </w:t>
+      </w:r>
+      <w:r>
+        <w:t xml:space="preserve">Write the figures and tables after that div.</w:t>
+      </w:r>
+    </w:p>
+    <w:bookmarkEnd w:id="20"/>
+    <w:bookmarkStart w:id="21" w:name="check-the-rendered-layout"/>
+    <w:p>
+      <w:pPr>
+        <w:pStyle w:val="Heading3"/>
+      </w:pPr>
+      <w:r>
+        <w:t xml:space="preserve">3.4 Check the rendered layout</w:t>
+      </w:r>
+    </w:p>
+    <w:p>
+      <w:pPr>
+        <w:pStyle w:val="FirstParagraph"/>
+      </w:pPr>
+      <w:r>
+        <w:t xml:space="preserve">Captions, page breaks, and figure placement</w:t>
+      </w:r>
+      <w:r>
+        <w:t xml:space="preserve"> </w:t>
+      </w:r>
+      <w:r>
+        <w:t xml:space="preserve">are properties of the rendered document’s layout.</w:t>
+      </w:r>
+      <w:r>
+        <w:t xml:space="preserve"> </w:t>
+      </w:r>
+      <w:r>
+        <w:t xml:space="preserve">Problems with them are easy to miss when reading the source,</w:t>
+      </w:r>
+      <w:r>
+        <w:t xml:space="preserve"> </w:t>
+      </w:r>
+      <w:r>
+        <w:t xml:space="preserve">and a check of the text and numbers alone will not catch them.</w:t>
+      </w:r>
+      <w:r>
+        <w:t xml:space="preserve"> </w:t>
+      </w:r>
+      <w:r>
+        <w:t xml:space="preserve">Before calling a rendered manuscript reviewed,</w:t>
+      </w:r>
+      <w:r>
+        <w:t xml:space="preserve"> </w:t>
+      </w:r>
+      <w:r>
+        <w:t xml:space="preserve">page through the PDF or Word output</w:t>
+      </w:r>
+      <w:r>
+        <w:t xml:space="preserve"> </w:t>
+      </w:r>
+      <w:r>
+        <w:t xml:space="preserve">and check its layout,</w:t>
+      </w:r>
+      <w:r>
+        <w:t xml:space="preserve"> </w:t>
+      </w:r>
+      <w:r>
+        <w:t xml:space="preserve">not only its text and numbers:</w:t>
       </w:r>
     </w:p>
     <w:p>
@@ -1613,13 +1684,7 @@
         </w:numPr>
       </w:pPr>
       <w:r>
-        <w:t xml:space="preserve">Write one line, such as</w:t>
-      </w:r>
-      <w:r>
-        <w:t xml:space="preserve"> </w:t>
-      </w:r>
-      <w:r>
-        <w:t xml:space="preserve">“Video: Weinberger derives the descent direction (from 3:09).”</w:t>
+        <w:t xml:space="preserve">Does every figure and table have a numbered caption?</w:t>
       </w:r>
     </w:p>
     <w:p>
@@ -1631,7 +1696,7 @@
         </w:numPr>
       </w:pPr>
       <w:r>
-        <w:t xml:space="preserve">Name the speaker and say what the material shows, in simple, literal words.</w:t>
+        <w:t xml:space="preserve">Does each caption sit on the same page as its figure or table?</w:t>
       </w:r>
     </w:p>
     <w:p>
@@ -1643,7 +1708,201 @@
         </w:numPr>
       </w:pPr>
       <w:r>
-        <w:t xml:space="preserve">Link the exact start time when the material covers more than the topic.</w:t>
+        <w:t xml:space="preserve">For a journal submission,</w:t>
+      </w:r>
+      <w:r>
+        <w:t xml:space="preserve"> </w:t>
+      </w:r>
+      <w:r>
+        <w:t xml:space="preserve">do the main-text figures and tables come after the references</w:t>
+      </w:r>
+      <w:r>
+        <w:t xml:space="preserve"> </w:t>
+      </w:r>
+      <w:r>
+        <w:t xml:space="preserve">and before the supplement,</w:t>
+      </w:r>
+      <w:r>
+        <w:t xml:space="preserve"> </w:t>
+      </w:r>
+      <w:r>
+        <w:t xml:space="preserve">and does the supplementary material start on a new page?</w:t>
+      </w:r>
+    </w:p>
+    <w:bookmarkEnd w:id="21"/>
+    <w:bookmarkEnd w:id="22"/>
+    <w:bookmarkStart w:id="23" w:name="subsection-headings"/>
+    <w:p>
+      <w:pPr>
+        <w:pStyle w:val="Heading2"/>
+      </w:pPr>
+      <w:r>
+        <w:t xml:space="preserve">4 Subsection headings</w:t>
+      </w:r>
+    </w:p>
+    <w:p>
+      <w:pPr>
+        <w:pStyle w:val="FirstParagraph"/>
+      </w:pPr>
+      <w:r>
+        <w:t xml:space="preserve">Use descriptive subsection headings to guide readers through your results.</w:t>
+      </w:r>
+      <w:r>
+        <w:t xml:space="preserve"> </w:t>
+      </w:r>
+      <w:r>
+        <w:t xml:space="preserve">Headings should clearly indicate the content of each section.</w:t>
+      </w:r>
+    </w:p>
+    <w:p>
+      <w:pPr>
+        <w:pStyle w:val="BodyText"/>
+      </w:pPr>
+      <w:r>
+        <w:rPr>
+          <w:b/>
+          <w:bCs/>
+        </w:rPr>
+        <w:t xml:space="preserve">Poor heading</w:t>
+      </w:r>
+      <w:r>
+        <w:t xml:space="preserve">:</w:t>
+      </w:r>
+      <w:r>
+        <w:t xml:space="preserve"> </w:t>
+      </w:r>
+      <w:r>
+        <w:t xml:space="preserve">“Analysis 1”</w:t>
+      </w:r>
+    </w:p>
+    <w:p>
+      <w:pPr>
+        <w:pStyle w:val="BodyText"/>
+      </w:pPr>
+      <w:r>
+        <w:rPr>
+          <w:b/>
+          <w:bCs/>
+        </w:rPr>
+        <w:t xml:space="preserve">Better heading</w:t>
+      </w:r>
+      <w:r>
+        <w:t xml:space="preserve">:</w:t>
+      </w:r>
+      <w:r>
+        <w:t xml:space="preserve"> </w:t>
+      </w:r>
+      <w:r>
+        <w:t xml:space="preserve">“Association between treatment and mortality”</w:t>
+      </w:r>
+    </w:p>
+    <w:p>
+      <w:pPr>
+        <w:pStyle w:val="BodyText"/>
+      </w:pPr>
+      <w:r>
+        <w:rPr>
+          <w:b/>
+          <w:bCs/>
+        </w:rPr>
+        <w:t xml:space="preserve">Best heading</w:t>
+      </w:r>
+      <w:r>
+        <w:t xml:space="preserve">:</w:t>
+      </w:r>
+      <w:r>
+        <w:t xml:space="preserve"> </w:t>
+      </w:r>
+      <w:r>
+        <w:t xml:space="preserve">“Treatment reduced mortality by 30%”</w:t>
+      </w:r>
+      <w:r>
+        <w:t xml:space="preserve"> </w:t>
+      </w:r>
+      <w:r>
+        <w:t xml:space="preserve">(when appropriate and not overstating findings)</w:t>
+      </w:r>
+    </w:p>
+    <w:bookmarkEnd w:id="23"/>
+    <w:bookmarkStart w:id="24" w:name="links-to-videos-and-other-media"/>
+    <w:p>
+      <w:pPr>
+        <w:pStyle w:val="Heading2"/>
+      </w:pPr>
+      <w:r>
+        <w:t xml:space="preserve">5 Links to videos and other media</w:t>
+      </w:r>
+    </w:p>
+    <w:p>
+      <w:pPr>
+        <w:pStyle w:val="FirstParagraph"/>
+      </w:pPr>
+      <w:r>
+        <w:t xml:space="preserve">Put each link to a video, podcast, demo or other external material</w:t>
+      </w:r>
+      <w:r>
+        <w:t xml:space="preserve"> </w:t>
+      </w:r>
+      <w:r>
+        <w:t xml:space="preserve">in a short note right after the text the material supports.</w:t>
+      </w:r>
+      <w:r>
+        <w:t xml:space="preserve"> </w:t>
+      </w:r>
+      <w:r>
+        <w:t xml:space="preserve">Do not collect the links in a list at the end of the document.</w:t>
+      </w:r>
+      <w:r>
+        <w:t xml:space="preserve"> </w:t>
+      </w:r>
+      <w:r>
+        <w:t xml:space="preserve">If the material covers several sections,</w:t>
+      </w:r>
+      <w:r>
+        <w:t xml:space="preserve"> </w:t>
+      </w:r>
+      <w:r>
+        <w:t xml:space="preserve">put the note after the first section the material supports.</w:t>
+      </w:r>
+      <w:r>
+        <w:t xml:space="preserve"> </w:t>
+      </w:r>
+      <w:r>
+        <w:t xml:space="preserve">If the text the note supports is a question followed by its answer,</w:t>
+      </w:r>
+      <w:r>
+        <w:t xml:space="preserve"> </w:t>
+      </w:r>
+      <w:r>
+        <w:t xml:space="preserve">put the note after the answer, not between them.</w:t>
+      </w:r>
+    </w:p>
+    <w:p>
+      <w:pPr>
+        <w:pStyle w:val="BodyText"/>
+      </w:pPr>
+      <w:r>
+        <w:t xml:space="preserve">A reader who has just finished a section is ready to use material about it.</w:t>
+      </w:r>
+      <w:r>
+        <w:t xml:space="preserve"> </w:t>
+      </w:r>
+      <w:r>
+        <w:t xml:space="preserve">The same reader at the end of the document must guess which link goes with which section,</w:t>
+      </w:r>
+      <w:r>
+        <w:t xml:space="preserve"> </w:t>
+      </w:r>
+      <w:r>
+        <w:t xml:space="preserve">and may never reach the list.</w:t>
+      </w:r>
+    </w:p>
+    <w:p>
+      <w:pPr>
+        <w:pStyle w:val="BodyText"/>
+      </w:pPr>
+      <w:r>
+        <w:t xml:space="preserve">For each link:</w:t>
       </w:r>
     </w:p>
     <w:p>
@@ -1651,10 +1910,52 @@
         <w:pStyle w:val="Compact"/>
         <w:numPr>
           <w:ilvl w:val="0"/>
-          <w:numId w:val="1007"/>
+          <w:numId w:val="1008"/>
         </w:numPr>
       </w:pPr>
       <w:r>
+        <w:t xml:space="preserve">Write one line, such as</w:t>
+      </w:r>
+      <w:r>
+        <w:t xml:space="preserve"> </w:t>
+      </w:r>
+      <w:r>
+        <w:t xml:space="preserve">“Video: Weinberger derives the descent direction (from 3:09).”</w:t>
+      </w:r>
+    </w:p>
+    <w:p>
+      <w:pPr>
+        <w:pStyle w:val="Compact"/>
+        <w:numPr>
+          <w:ilvl w:val="0"/>
+          <w:numId w:val="1008"/>
+        </w:numPr>
+      </w:pPr>
+      <w:r>
+        <w:t xml:space="preserve">Name the speaker and say what the material shows, in simple, literal words.</w:t>
+      </w:r>
+    </w:p>
+    <w:p>
+      <w:pPr>
+        <w:pStyle w:val="Compact"/>
+        <w:numPr>
+          <w:ilvl w:val="0"/>
+          <w:numId w:val="1008"/>
+        </w:numPr>
+      </w:pPr>
+      <w:r>
+        <w:t xml:space="preserve">Link the exact start time when the material covers more than the topic.</w:t>
+      </w:r>
+    </w:p>
+    <w:p>
+      <w:pPr>
+        <w:pStyle w:val="Compact"/>
+        <w:numPr>
+          <w:ilvl w:val="0"/>
+          <w:numId w:val="1008"/>
+        </w:numPr>
+      </w:pPr>
+      <w:r>
         <w:t xml:space="preserve">Cite the source.</w:t>
       </w:r>
     </w:p>
@@ -1684,7 +1985,7 @@
         <w:t xml:space="preserve">Do not link private repositories, such as ones that hold graded homework or exams.</w:t>
       </w:r>
     </w:p>
-    <w:bookmarkEnd w:id="22"/>
+    <w:bookmarkEnd w:id="24"/>
     <w:sectPr>
       <w:footnotePr>
         <w:numRestart w:val="eachSect"/>
@@ -2032,6 +2333,9 @@
     <w:abstractNumId w:val="991"/>
   </w:num>
   <w:num w:numId="1007">
+    <w:abstractNumId w:val="991"/>
+  </w:num>
+  <w:num w:numId="1008">
     <w:abstractNumId w:val="991"/>
   </w:num>
 </w:numbering>

</xml_diff>

<commit_message>
Deploying to gh-pages from @ Morrison-Lab/psw@4e4a9f7114390e5318e768925ee99fb2a9f77417 🚀
</commit_message>
<xml_diff>
--- a/chapters/paper-organization.docx
+++ b/chapters/paper-organization.docx
@@ -15,7 +15,7 @@
         <w:pStyle w:val="Date"/>
       </w:pPr>
       <w:r>
-        <w:t xml:space="preserve">Last modified: 2026-10-16 04:57:30 (PDT)</w:t>
+        <w:t xml:space="preserve">Last modified: 2026-10-16 05:04:39 (PDT)</w:t>
       </w:r>
     </w:p>
     <w:p>
@@ -1824,13 +1824,13 @@
       </w:r>
     </w:p>
     <w:bookmarkEnd w:id="23"/>
-    <w:bookmarkStart w:id="24" w:name="links-to-videos-and-other-media"/>
+    <w:bookmarkStart w:id="25" w:name="avoid-forward-references"/>
     <w:p>
       <w:pPr>
         <w:pStyle w:val="Heading2"/>
       </w:pPr>
       <w:r>
-        <w:t xml:space="preserve">5 Links to videos and other media</w:t>
+        <w:t xml:space="preserve">5 Avoid forward references</w:t>
       </w:r>
     </w:p>
     <w:p>
@@ -1838,71 +1838,13 @@
         <w:pStyle w:val="FirstParagraph"/>
       </w:pPr>
       <w:r>
-        <w:t xml:space="preserve">Put each link to a video, podcast, demo or other external material</w:t>
-      </w:r>
-      <w:r>
-        <w:t xml:space="preserve"> </w:t>
-      </w:r>
-      <w:r>
-        <w:t xml:space="preserve">in a short note right after the text the material supports.</w:t>
-      </w:r>
-      <w:r>
-        <w:t xml:space="preserve"> </w:t>
-      </w:r>
-      <w:r>
-        <w:t xml:space="preserve">Do not collect the links in a list at the end of the document.</w:t>
-      </w:r>
-      <w:r>
-        <w:t xml:space="preserve"> </w:t>
-      </w:r>
-      <w:r>
-        <w:t xml:space="preserve">If the material covers several sections,</w:t>
-      </w:r>
-      <w:r>
-        <w:t xml:space="preserve"> </w:t>
-      </w:r>
-      <w:r>
-        <w:t xml:space="preserve">put the note after the first section the material supports.</w:t>
-      </w:r>
-      <w:r>
-        <w:t xml:space="preserve"> </w:t>
-      </w:r>
-      <w:r>
-        <w:t xml:space="preserve">If the text the note supports is a question followed by its answer,</w:t>
-      </w:r>
-      <w:r>
-        <w:t xml:space="preserve"> </w:t>
-      </w:r>
-      <w:r>
-        <w:t xml:space="preserve">put the note after the answer, not between them.</w:t>
-      </w:r>
-    </w:p>
-    <w:p>
-      <w:pPr>
-        <w:pStyle w:val="BodyText"/>
-      </w:pPr>
-      <w:r>
-        <w:t xml:space="preserve">A reader who has just finished a section is ready to use material about it.</w:t>
-      </w:r>
-      <w:r>
-        <w:t xml:space="preserve"> </w:t>
-      </w:r>
-      <w:r>
-        <w:t xml:space="preserve">The same reader at the end of the document must guess which link goes with which section,</w:t>
-      </w:r>
-      <w:r>
-        <w:t xml:space="preserve"> </w:t>
-      </w:r>
-      <w:r>
-        <w:t xml:space="preserve">and may never reach the list.</w:t>
-      </w:r>
-    </w:p>
-    <w:p>
-      <w:pPr>
-        <w:pStyle w:val="BodyText"/>
-      </w:pPr>
-      <w:r>
-        <w:t xml:space="preserve">For each link:</w:t>
+        <w:t xml:space="preserve">A forward reference points the reader to content they have not reached yet.</w:t>
+      </w:r>
+      <w:r>
+        <w:t xml:space="preserve"> </w:t>
+      </w:r>
+      <w:r>
+        <w:t xml:space="preserve">Common forms are:</w:t>
       </w:r>
     </w:p>
     <w:p>
@@ -1914,13 +1856,7 @@
         </w:numPr>
       </w:pPr>
       <w:r>
-        <w:t xml:space="preserve">Write one line, such as</w:t>
-      </w:r>
-      <w:r>
-        <w:t xml:space="preserve"> </w:t>
-      </w:r>
-      <w:r>
-        <w:t xml:space="preserve">“Video: Weinberger derives the descent direction (from 3:09).”</w:t>
+        <w:t xml:space="preserve">“as discussed below”</w:t>
       </w:r>
     </w:p>
     <w:p>
@@ -1932,7 +1868,7 @@
         </w:numPr>
       </w:pPr>
       <w:r>
-        <w:t xml:space="preserve">Name the speaker and say what the material shows, in simple, literal words.</w:t>
+        <w:t xml:space="preserve">“see the next section”</w:t>
       </w:r>
     </w:p>
     <w:p>
@@ -1944,7 +1880,209 @@
         </w:numPr>
       </w:pPr>
       <w:r>
-        <w:t xml:space="preserve">Link the exact start time when the material covers more than the topic.</w:t>
+        <w:t xml:space="preserve">“we will return to this later”</w:t>
+      </w:r>
+    </w:p>
+    <w:p>
+      <w:pPr>
+        <w:pStyle w:val="FirstParagraph"/>
+      </w:pPr>
+      <w:r>
+        <w:t xml:space="preserve">The reader must hold an unresolved pointer</w:t>
+      </w:r>
+      <w:r>
+        <w:t xml:space="preserve"> </w:t>
+      </w:r>
+      <w:r>
+        <w:t xml:space="preserve">while reading the sentence that depends on it.</w:t>
+      </w:r>
+    </w:p>
+    <w:p>
+      <w:pPr>
+        <w:pStyle w:val="BodyText"/>
+      </w:pPr>
+      <w:r>
+        <w:t xml:space="preserve">Fix a forward reference by moving the content ahead of the pointer.</w:t>
+      </w:r>
+      <w:r>
+        <w:t xml:space="preserve"> </w:t>
+      </w:r>
+      <w:r>
+        <w:t xml:space="preserve">Then change</w:t>
+      </w:r>
+      <w:r>
+        <w:t xml:space="preserve"> </w:t>
+      </w:r>
+      <w:r>
+        <w:t xml:space="preserve">“below”</w:t>
+      </w:r>
+      <w:r>
+        <w:t xml:space="preserve"> </w:t>
+      </w:r>
+      <w:r>
+        <w:t xml:space="preserve">to</w:t>
+      </w:r>
+      <w:r>
+        <w:t xml:space="preserve"> </w:t>
+      </w:r>
+      <w:r>
+        <w:t xml:space="preserve">“above”</w:t>
+      </w:r>
+      <w:r>
+        <w:t xml:space="preserve">, or delete the pointer.</w:t>
+      </w:r>
+    </w:p>
+    <w:p>
+      <w:pPr>
+        <w:pStyle w:val="BodyText"/>
+      </w:pPr>
+      <w:r>
+        <w:t xml:space="preserve">If moving the content would break the order of the argument,</w:t>
+      </w:r>
+      <w:r>
+        <w:t xml:space="preserve"> </w:t>
+      </w:r>
+      <w:r>
+        <w:t xml:space="preserve">keep the pointer, and make it a working link.</w:t>
+      </w:r>
+      <w:r>
+        <w:t xml:space="preserve"> </w:t>
+      </w:r>
+      <w:r>
+        <w:t xml:space="preserve">Say what the link points to and where it is,</w:t>
+      </w:r>
+      <w:r>
+        <w:t xml:space="preserve"> </w:t>
+      </w:r>
+      <w:r>
+        <w:t xml:space="preserve">as in</w:t>
+      </w:r>
+      <w:r>
+        <w:t xml:space="preserve"> </w:t>
+      </w:r>
+      <w:r>
+        <w:t xml:space="preserve">“Table 2 (later in this section)”</w:t>
+      </w:r>
+      <w:r>
+        <w:t xml:space="preserve">, with</w:t>
+      </w:r>
+      <w:r>
+        <w:t xml:space="preserve"> </w:t>
+      </w:r>
+      <w:r>
+        <w:t xml:space="preserve">“Table 2”</w:t>
+      </w:r>
+      <w:r>
+        <w:t xml:space="preserve"> </w:t>
+      </w:r>
+      <w:r>
+        <w:t xml:space="preserve">linked to the table.</w:t>
+      </w:r>
+      <w:r>
+        <w:t xml:space="preserve"> </w:t>
+      </w:r>
+      <w:r>
+        <w:t xml:space="preserve">Do not delete the link and leave only the name.</w:t>
+      </w:r>
+      <w:r>
+        <w:t xml:space="preserve"> </w:t>
+      </w:r>
+      <w:r>
+        <w:t xml:space="preserve">The reader then loses both the warning and the jump.</w:t>
+      </w:r>
+    </w:p>
+    <w:bookmarkStart w:id="24" w:name="exm-forward-reference"/>
+    <w:p>
+      <w:pPr>
+        <w:pStyle w:val="BodyText"/>
+      </w:pPr>
+      <w:r>
+        <w:rPr>
+          <w:b/>
+          <w:bCs/>
+        </w:rPr>
+        <w:t xml:space="preserve">Example 2 (Removing a forward reference)</w:t>
+      </w:r>
+      <w:r>
+        <w:t xml:space="preserve"> </w:t>
+      </w:r>
+      <w:r>
+        <w:t xml:space="preserve"> </w:t>
+      </w:r>
+    </w:p>
+    <w:p>
+      <w:pPr>
+        <w:pStyle w:val="BlockText"/>
+      </w:pPr>
+      <w:r>
+        <w:t xml:space="preserve">❌ The adjusted estimates, discussed in the next section, differ from the crude estimates.</w:t>
+      </w:r>
+      <w:r>
+        <w:t xml:space="preserve"> </w:t>
+      </w:r>
+      <w:r>
+        <w:t xml:space="preserve">The adjustment, described below, uses age and sex.</w:t>
+      </w:r>
+    </w:p>
+    <w:p>
+      <w:pPr>
+        <w:pStyle w:val="BlockText"/>
+      </w:pPr>
+      <w:r>
+        <w:t xml:space="preserve">✅ The adjustment uses age and sex.</w:t>
+      </w:r>
+      <w:r>
+        <w:t xml:space="preserve"> </w:t>
+      </w:r>
+      <w:r>
+        <w:t xml:space="preserve">The adjusted estimates differ from the crude estimates.</w:t>
+      </w:r>
+    </w:p>
+    <w:p>
+      <w:pPr>
+        <w:pStyle w:val="FirstParagraph"/>
+      </w:pPr>
+      <w:r>
+        <w:t xml:space="preserve">In the ❌ version, both pointers send the reader to content that comes later,</w:t>
+      </w:r>
+      <w:r>
+        <w:t xml:space="preserve"> </w:t>
+      </w:r>
+      <w:r>
+        <w:t xml:space="preserve">so the reader sees</w:t>
+      </w:r>
+      <w:r>
+        <w:t xml:space="preserve"> </w:t>
+      </w:r>
+      <w:r>
+        <w:t xml:space="preserve">“adjusted”</w:t>
+      </w:r>
+      <w:r>
+        <w:t xml:space="preserve"> </w:t>
+      </w:r>
+      <w:r>
+        <w:t xml:space="preserve">before the paper says what was adjusted.</w:t>
+      </w:r>
+      <w:r>
+        <w:t xml:space="preserve"> </w:t>
+      </w:r>
+      <w:r>
+        <w:t xml:space="preserve">In the ✅ version, the sentence that defines the adjustment comes first,</w:t>
+      </w:r>
+      <w:r>
+        <w:t xml:space="preserve"> </w:t>
+      </w:r>
+      <w:r>
+        <w:t xml:space="preserve">so neither pointer is needed.</w:t>
+      </w:r>
+    </w:p>
+    <w:bookmarkEnd w:id="24"/>
+    <w:p>
+      <w:pPr>
+        <w:pStyle w:val="BodyText"/>
+      </w:pPr>
+      <w:r>
+        <w:t xml:space="preserve">Two cases are not forward references to fix:</w:t>
       </w:r>
     </w:p>
     <w:p>
@@ -1952,10 +2090,285 @@
         <w:pStyle w:val="Compact"/>
         <w:numPr>
           <w:ilvl w:val="0"/>
-          <w:numId w:val="1008"/>
+          <w:numId w:val="1009"/>
         </w:numPr>
       </w:pPr>
       <w:r>
+        <w:t xml:space="preserve">An overview near the start that previews the structure,</w:t>
+      </w:r>
+      <w:r>
+        <w:t xml:space="preserve"> </w:t>
+      </w:r>
+      <w:r>
+        <w:t xml:space="preserve">such as</w:t>
+      </w:r>
+      <w:r>
+        <w:t xml:space="preserve"> </w:t>
+      </w:r>
+      <w:r>
+        <w:t xml:space="preserve">“Section 2 describes the data, and Section 3 gives the results”</w:t>
+      </w:r>
+      <w:r>
+        <w:t xml:space="preserve">.</w:t>
+      </w:r>
+      <w:r>
+        <w:t xml:space="preserve"> </w:t>
+      </w:r>
+      <w:r>
+        <w:t xml:space="preserve">The reader is not meant to resolve the preview immediately.</w:t>
+      </w:r>
+    </w:p>
+    <w:p>
+      <w:pPr>
+        <w:pStyle w:val="Compact"/>
+        <w:numPr>
+          <w:ilvl w:val="0"/>
+          <w:numId w:val="1009"/>
+        </w:numPr>
+      </w:pPr>
+      <w:r>
+        <w:t xml:space="preserve">A sentence that names a figure or table placed beside it, such as</w:t>
+      </w:r>
+      <w:r>
+        <w:t xml:space="preserve"> </w:t>
+      </w:r>
+      <w:r>
+        <w:t xml:space="preserve">“Table 2 shows the estimates”</w:t>
+      </w:r>
+      <w:r>
+        <w:t xml:space="preserve">.</w:t>
+      </w:r>
+      <w:r>
+        <w:t xml:space="preserve"> </w:t>
+      </w:r>
+      <w:r>
+        <w:t xml:space="preserve">The reader meets the table at once.</w:t>
+      </w:r>
+    </w:p>
+    <w:p>
+      <w:pPr>
+        <w:pStyle w:val="FirstParagraph"/>
+      </w:pPr>
+      <w:r>
+        <w:t xml:space="preserve">A word such as</w:t>
+      </w:r>
+      <w:r>
+        <w:t xml:space="preserve"> </w:t>
+      </w:r>
+      <w:r>
+        <w:t xml:space="preserve">“below”</w:t>
+      </w:r>
+      <w:r>
+        <w:t xml:space="preserve"> </w:t>
+      </w:r>
+      <w:r>
+        <w:t xml:space="preserve">in an ordinary comparison, as in</w:t>
+      </w:r>
+      <w:r>
+        <w:t xml:space="preserve"> </w:t>
+      </w:r>
+      <w:r>
+        <w:t xml:space="preserve">“values below the detection limit”</w:t>
+      </w:r>
+      <w:r>
+        <w:t xml:space="preserve">,</w:t>
+      </w:r>
+      <w:r>
+        <w:t xml:space="preserve"> </w:t>
+      </w:r>
+      <w:r>
+        <w:t xml:space="preserve">is not a pointer at all.</w:t>
+      </w:r>
+    </w:p>
+    <w:p>
+      <w:pPr>
+        <w:pStyle w:val="BodyText"/>
+      </w:pPr>
+      <w:r>
+        <w:t xml:space="preserve">When you insert or move a section, check the references that name a position,</w:t>
+      </w:r>
+      <w:r>
+        <w:t xml:space="preserve"> </w:t>
+      </w:r>
+      <w:r>
+        <w:t xml:space="preserve">such as</w:t>
+      </w:r>
+      <w:r>
+        <w:t xml:space="preserve"> </w:t>
+      </w:r>
+      <w:r>
+        <w:t xml:space="preserve">“the two sections above”</w:t>
+      </w:r>
+      <w:r>
+        <w:t xml:space="preserve"> </w:t>
+      </w:r>
+      <w:r>
+        <w:t xml:space="preserve">or</w:t>
+      </w:r>
+      <w:r>
+        <w:t xml:space="preserve"> </w:t>
+      </w:r>
+      <w:r>
+        <w:t xml:space="preserve">“the previous section”</w:t>
+      </w:r>
+      <w:r>
+        <w:t xml:space="preserve">.</w:t>
+      </w:r>
+      <w:r>
+        <w:t xml:space="preserve"> </w:t>
+      </w:r>
+      <w:r>
+        <w:t xml:space="preserve">Name the target instead, as in</w:t>
+      </w:r>
+      <w:r>
+        <w:t xml:space="preserve"> </w:t>
+      </w:r>
+      <w:r>
+        <w:t xml:space="preserve">“the sections on mortality and morbidity”</w:t>
+      </w:r>
+      <w:r>
+        <w:t xml:space="preserve">,</w:t>
+      </w:r>
+      <w:r>
+        <w:t xml:space="preserve"> </w:t>
+      </w:r>
+      <w:r>
+        <w:t xml:space="preserve">so that a later insertion does not make the position wrong.</w:t>
+      </w:r>
+    </w:p>
+    <w:bookmarkEnd w:id="25"/>
+    <w:bookmarkStart w:id="26" w:name="links-to-videos-and-other-media"/>
+    <w:p>
+      <w:pPr>
+        <w:pStyle w:val="Heading2"/>
+      </w:pPr>
+      <w:r>
+        <w:t xml:space="preserve">6 Links to videos and other media</w:t>
+      </w:r>
+    </w:p>
+    <w:p>
+      <w:pPr>
+        <w:pStyle w:val="FirstParagraph"/>
+      </w:pPr>
+      <w:r>
+        <w:t xml:space="preserve">Put each link to a video, podcast, demo or other external material</w:t>
+      </w:r>
+      <w:r>
+        <w:t xml:space="preserve"> </w:t>
+      </w:r>
+      <w:r>
+        <w:t xml:space="preserve">in a short note right after the text the material supports.</w:t>
+      </w:r>
+      <w:r>
+        <w:t xml:space="preserve"> </w:t>
+      </w:r>
+      <w:r>
+        <w:t xml:space="preserve">Do not collect the links in a list at the end of the document.</w:t>
+      </w:r>
+      <w:r>
+        <w:t xml:space="preserve"> </w:t>
+      </w:r>
+      <w:r>
+        <w:t xml:space="preserve">If the material covers several sections,</w:t>
+      </w:r>
+      <w:r>
+        <w:t xml:space="preserve"> </w:t>
+      </w:r>
+      <w:r>
+        <w:t xml:space="preserve">put the note after the first section the material supports.</w:t>
+      </w:r>
+      <w:r>
+        <w:t xml:space="preserve"> </w:t>
+      </w:r>
+      <w:r>
+        <w:t xml:space="preserve">If the text the note supports is a question followed by its answer,</w:t>
+      </w:r>
+      <w:r>
+        <w:t xml:space="preserve"> </w:t>
+      </w:r>
+      <w:r>
+        <w:t xml:space="preserve">put the note after the answer, not between them.</w:t>
+      </w:r>
+    </w:p>
+    <w:p>
+      <w:pPr>
+        <w:pStyle w:val="BodyText"/>
+      </w:pPr>
+      <w:r>
+        <w:t xml:space="preserve">A reader who has just finished a section is ready to use material about it.</w:t>
+      </w:r>
+      <w:r>
+        <w:t xml:space="preserve"> </w:t>
+      </w:r>
+      <w:r>
+        <w:t xml:space="preserve">The same reader at the end of the document must guess which link goes with which section,</w:t>
+      </w:r>
+      <w:r>
+        <w:t xml:space="preserve"> </w:t>
+      </w:r>
+      <w:r>
+        <w:t xml:space="preserve">and may never reach the list.</w:t>
+      </w:r>
+    </w:p>
+    <w:p>
+      <w:pPr>
+        <w:pStyle w:val="BodyText"/>
+      </w:pPr>
+      <w:r>
+        <w:t xml:space="preserve">For each link:</w:t>
+      </w:r>
+    </w:p>
+    <w:p>
+      <w:pPr>
+        <w:pStyle w:val="Compact"/>
+        <w:numPr>
+          <w:ilvl w:val="0"/>
+          <w:numId w:val="1010"/>
+        </w:numPr>
+      </w:pPr>
+      <w:r>
+        <w:t xml:space="preserve">Write one line, such as</w:t>
+      </w:r>
+      <w:r>
+        <w:t xml:space="preserve"> </w:t>
+      </w:r>
+      <w:r>
+        <w:t xml:space="preserve">“Video: Weinberger derives the descent direction (from 3:09).”</w:t>
+      </w:r>
+    </w:p>
+    <w:p>
+      <w:pPr>
+        <w:pStyle w:val="Compact"/>
+        <w:numPr>
+          <w:ilvl w:val="0"/>
+          <w:numId w:val="1010"/>
+        </w:numPr>
+      </w:pPr>
+      <w:r>
+        <w:t xml:space="preserve">Name the speaker and say what the material shows, in simple, literal words.</w:t>
+      </w:r>
+    </w:p>
+    <w:p>
+      <w:pPr>
+        <w:pStyle w:val="Compact"/>
+        <w:numPr>
+          <w:ilvl w:val="0"/>
+          <w:numId w:val="1010"/>
+        </w:numPr>
+      </w:pPr>
+      <w:r>
+        <w:t xml:space="preserve">Link the exact start time when the material covers more than the topic.</w:t>
+      </w:r>
+    </w:p>
+    <w:p>
+      <w:pPr>
+        <w:pStyle w:val="Compact"/>
+        <w:numPr>
+          <w:ilvl w:val="0"/>
+          <w:numId w:val="1010"/>
+        </w:numPr>
+      </w:pPr>
+      <w:r>
         <w:t xml:space="preserve">Cite the source.</w:t>
       </w:r>
     </w:p>
@@ -1985,7 +2398,7 @@
         <w:t xml:space="preserve">Do not link private repositories, such as ones that hold graded homework or exams.</w:t>
       </w:r>
     </w:p>
-    <w:bookmarkEnd w:id="24"/>
+    <w:bookmarkEnd w:id="26"/>
     <w:sectPr>
       <w:footnotePr>
         <w:numRestart w:val="eachSect"/>
@@ -2336,6 +2749,12 @@
     <w:abstractNumId w:val="991"/>
   </w:num>
   <w:num w:numId="1008">
+    <w:abstractNumId w:val="991"/>
+  </w:num>
+  <w:num w:numId="1009">
+    <w:abstractNumId w:val="991"/>
+  </w:num>
+  <w:num w:numId="1010">
     <w:abstractNumId w:val="991"/>
   </w:num>
 </w:numbering>

</xml_diff>

<commit_message>
Deploying to gh-pages from @ Morrison-Lab/psw@3ece89a543adb8fc3fdd5c03b1d1365ee57b3a75 🚀
</commit_message>
<xml_diff>
--- a/chapters/paper-organization.docx
+++ b/chapters/paper-organization.docx
@@ -15,7 +15,7 @@
         <w:pStyle w:val="Date"/>
       </w:pPr>
       <w:r>
-        <w:t xml:space="preserve">Last modified: 2026-10-16 05:04:39 (PDT)</w:t>
+        <w:t xml:space="preserve">Last modified: 2026-10-16 05:10:12 (PDT)</w:t>
       </w:r>
     </w:p>
     <w:p>
@@ -44,13 +44,13 @@
         <w:t xml:space="preserve">from your research question through your methods to your results and conclusions.</w:t>
       </w:r>
     </w:p>
-    <w:bookmarkStart w:id="9" w:name="standard-paper-structure"/>
+    <w:bookmarkStart w:id="9" w:name="write-to-clarify-your-thinking"/>
     <w:p>
       <w:pPr>
         <w:pStyle w:val="Heading2"/>
       </w:pPr>
       <w:r>
-        <w:t xml:space="preserve">1 Standard paper structure</w:t>
+        <w:t xml:space="preserve">1 Write to clarify your thinking</w:t>
       </w:r>
     </w:p>
     <w:p>
@@ -58,7 +58,19 @@
         <w:pStyle w:val="FirstParagraph"/>
       </w:pPr>
       <w:r>
-        <w:t xml:space="preserve">Most scientific papers follow the IMRaD structure:</w:t>
+        <w:t xml:space="preserve">Write down a question or an idea as soon as you have it,</w:t>
+      </w:r>
+      <w:r>
+        <w:t xml:space="preserve"> </w:t>
+      </w:r>
+      <w:r>
+        <w:t xml:space="preserve">before you search for an answer.</w:t>
+      </w:r>
+      <w:r>
+        <w:t xml:space="preserve"> </w:t>
+      </w:r>
+      <w:r>
+        <w:t xml:space="preserve">Writing it down helps you in these ways:</w:t>
       </w:r>
     </w:p>
     <w:p>
@@ -70,14 +82,7 @@
         </w:numPr>
       </w:pPr>
       <w:r>
-        <w:rPr>
-          <w:b/>
-          <w:bCs/>
-        </w:rPr>
-        <w:t xml:space="preserve">Introduction</w:t>
-      </w:r>
-      <w:r>
-        <w:t xml:space="preserve">: Present the research question and background</w:t>
+        <w:t xml:space="preserve">You see what you need to know.</w:t>
       </w:r>
     </w:p>
     <w:p>
@@ -89,14 +94,7 @@
         </w:numPr>
       </w:pPr>
       <w:r>
-        <w:rPr>
-          <w:b/>
-          <w:bCs/>
-        </w:rPr>
-        <w:t xml:space="preserve">Methods</w:t>
-      </w:r>
-      <w:r>
-        <w:t xml:space="preserve">: Describe how the study was conducted</w:t>
+        <w:t xml:space="preserve">You state the problem more precisely.</w:t>
       </w:r>
     </w:p>
     <w:p>
@@ -108,33 +106,7 @@
         </w:numPr>
       </w:pPr>
       <w:r>
-        <w:rPr>
-          <w:b/>
-          <w:bCs/>
-        </w:rPr>
-        <w:t xml:space="preserve">Results</w:t>
-      </w:r>
-      <w:r>
-        <w:t xml:space="preserve">: Present the findings</w:t>
-      </w:r>
-    </w:p>
-    <w:p>
-      <w:pPr>
-        <w:pStyle w:val="Compact"/>
-        <w:numPr>
-          <w:ilvl w:val="0"/>
-          <w:numId w:val="1001"/>
-        </w:numPr>
-      </w:pPr>
-      <w:r>
-        <w:rPr>
-          <w:b/>
-          <w:bCs/>
-        </w:rPr>
-        <w:t xml:space="preserve">Discussion</w:t>
-      </w:r>
-      <w:r>
-        <w:t xml:space="preserve">: Interpret the findings and their implications</w:t>
+        <w:t xml:space="preserve">You often answer the question yourself while writing it.</w:t>
       </w:r>
     </w:p>
     <w:p>
@@ -142,17 +114,32 @@
         <w:pStyle w:val="FirstParagraph"/>
       </w:pPr>
       <w:r>
-        <w:t xml:space="preserve">Some papers combine Results and Discussion into a single section.</w:t>
+        <w:t xml:space="preserve">The computer scientist Leslie Lamport argues that a person</w:t>
+      </w:r>
+      <w:r>
+        <w:t xml:space="preserve"> </w:t>
+      </w:r>
+      <w:r>
+        <w:t xml:space="preserve">who thinks without writing only thinks that they are thinking</w:t>
+      </w:r>
+      <w:r>
+        <w:t xml:space="preserve"> </w:t>
+      </w:r>
+      <w:r>
+        <w:t xml:space="preserve">(Lamport 2019)</w:t>
+      </w:r>
+      <w:r>
+        <w:t xml:space="preserve">.</w:t>
       </w:r>
     </w:p>
     <w:bookmarkEnd w:id="9"/>
-    <w:bookmarkStart w:id="16" w:name="organizing-the-results-section"/>
+    <w:bookmarkStart w:id="10" w:name="standard-paper-structure"/>
     <w:p>
       <w:pPr>
         <w:pStyle w:val="Heading2"/>
       </w:pPr>
       <w:r>
-        <w:t xml:space="preserve">2 Organizing the Results section</w:t>
+        <w:t xml:space="preserve">2 Standard paper structure</w:t>
       </w:r>
     </w:p>
     <w:p>
@@ -160,42 +147,7 @@
         <w:pStyle w:val="FirstParagraph"/>
       </w:pPr>
       <w:r>
-        <w:t xml:space="preserve">The Results section presents your findings clearly and logically.</w:t>
-      </w:r>
-      <w:r>
-        <w:t xml:space="preserve"> </w:t>
-      </w:r>
-      <w:r>
-        <w:t xml:space="preserve">How you organize this section depends on your research design</w:t>
-      </w:r>
-      <w:r>
-        <w:t xml:space="preserve"> </w:t>
-      </w:r>
-      <w:r>
-        <w:t xml:space="preserve">and the complexity of your analyses.</w:t>
-      </w:r>
-    </w:p>
-    <w:bookmarkStart w:id="10" w:name="single-outcome-studies"/>
-    <w:p>
-      <w:pPr>
-        <w:pStyle w:val="Heading3"/>
-      </w:pPr>
-      <w:r>
-        <w:t xml:space="preserve">2.1 Single outcome studies</w:t>
-      </w:r>
-    </w:p>
-    <w:p>
-      <w:pPr>
-        <w:pStyle w:val="FirstParagraph"/>
-      </w:pPr>
-      <w:r>
-        <w:t xml:space="preserve">When analyzing a single primary outcome,</w:t>
-      </w:r>
-      <w:r>
-        <w:t xml:space="preserve"> </w:t>
-      </w:r>
-      <w:r>
-        <w:t xml:space="preserve">organize results by:</w:t>
+        <w:t xml:space="preserve">Most scientific papers follow the IMRaD structure:</w:t>
       </w:r>
     </w:p>
     <w:p>
@@ -207,7 +159,14 @@
         </w:numPr>
       </w:pPr>
       <w:r>
-        <w:t xml:space="preserve">Descriptive statistics first</w:t>
+        <w:rPr>
+          <w:b/>
+          <w:bCs/>
+        </w:rPr>
+        <w:t xml:space="preserve">Introduction</w:t>
+      </w:r>
+      <w:r>
+        <w:t xml:space="preserve">: Present the research question and background</w:t>
       </w:r>
     </w:p>
     <w:p>
@@ -219,7 +178,14 @@
         </w:numPr>
       </w:pPr>
       <w:r>
-        <w:t xml:space="preserve">Main analysis results</w:t>
+        <w:rPr>
+          <w:b/>
+          <w:bCs/>
+        </w:rPr>
+        <w:t xml:space="preserve">Methods</w:t>
+      </w:r>
+      <w:r>
+        <w:t xml:space="preserve">: Describe how the study was conducted</w:t>
       </w:r>
     </w:p>
     <w:p>
@@ -231,62 +197,33 @@
         </w:numPr>
       </w:pPr>
       <w:r>
-        <w:t xml:space="preserve">Sensitivity analyses or subgroup analyses</w:t>
-      </w:r>
-    </w:p>
-    <w:bookmarkEnd w:id="10"/>
-    <w:bookmarkStart w:id="15" w:name="multiple-outcomes-analyzed-separately"/>
-    <w:p>
-      <w:pPr>
-        <w:pStyle w:val="Heading3"/>
-      </w:pPr>
-      <w:r>
-        <w:t xml:space="preserve">2.2 Multiple outcomes analyzed separately</w:t>
-      </w:r>
-    </w:p>
-    <w:p>
-      <w:pPr>
-        <w:pStyle w:val="FirstParagraph"/>
-      </w:pPr>
-      <w:r>
-        <w:t xml:space="preserve">When analyzing multiple outcomes separately,</w:t>
-      </w:r>
-      <w:r>
-        <w:t xml:space="preserve"> </w:t>
-      </w:r>
-      <w:r>
         <w:rPr>
           <w:b/>
           <w:bCs/>
         </w:rPr>
-        <w:t xml:space="preserve">group your results section by outcome</w:t>
-      </w:r>
-      <w:r>
-        <w:t xml:space="preserve"> </w:t>
-      </w:r>
-      <w:r>
-        <w:t xml:space="preserve">rather than by analysis type.</w:t>
-      </w:r>
-      <w:r>
-        <w:t xml:space="preserve"> </w:t>
-      </w:r>
-      <w:r>
-        <w:t xml:space="preserve">This organization improves clarity and readability</w:t>
-      </w:r>
-      <w:r>
-        <w:t xml:space="preserve"> </w:t>
-      </w:r>
-      <w:r>
-        <w:t xml:space="preserve">by keeping all information about each outcome together.</w:t>
-      </w:r>
-    </w:p>
-    <w:bookmarkStart w:id="11" w:name="why-group-by-outcome"/>
-    <w:p>
-      <w:pPr>
-        <w:pStyle w:val="Heading4"/>
-      </w:pPr>
-      <w:r>
-        <w:t xml:space="preserve">Why group by outcome</w:t>
+        <w:t xml:space="preserve">Results</w:t>
+      </w:r>
+      <w:r>
+        <w:t xml:space="preserve">: Present the findings</w:t>
+      </w:r>
+    </w:p>
+    <w:p>
+      <w:pPr>
+        <w:pStyle w:val="Compact"/>
+        <w:numPr>
+          <w:ilvl w:val="0"/>
+          <w:numId w:val="1002"/>
+        </w:numPr>
+      </w:pPr>
+      <w:r>
+        <w:rPr>
+          <w:b/>
+          <w:bCs/>
+        </w:rPr>
+        <w:t xml:space="preserve">Discussion</w:t>
+      </w:r>
+      <w:r>
+        <w:t xml:space="preserve">: Interpret the findings and their implications</w:t>
       </w:r>
     </w:p>
     <w:p>
@@ -294,7 +231,60 @@
         <w:pStyle w:val="FirstParagraph"/>
       </w:pPr>
       <w:r>
-        <w:t xml:space="preserve">Grouping by outcome helps readers:</w:t>
+        <w:t xml:space="preserve">Some papers combine Results and Discussion into a single section.</w:t>
+      </w:r>
+    </w:p>
+    <w:bookmarkEnd w:id="10"/>
+    <w:bookmarkStart w:id="17" w:name="organizing-the-results-section"/>
+    <w:p>
+      <w:pPr>
+        <w:pStyle w:val="Heading2"/>
+      </w:pPr>
+      <w:r>
+        <w:t xml:space="preserve">3 Organizing the Results section</w:t>
+      </w:r>
+    </w:p>
+    <w:p>
+      <w:pPr>
+        <w:pStyle w:val="FirstParagraph"/>
+      </w:pPr>
+      <w:r>
+        <w:t xml:space="preserve">The Results section presents your findings clearly and logically.</w:t>
+      </w:r>
+      <w:r>
+        <w:t xml:space="preserve"> </w:t>
+      </w:r>
+      <w:r>
+        <w:t xml:space="preserve">How you organize this section depends on your research design</w:t>
+      </w:r>
+      <w:r>
+        <w:t xml:space="preserve"> </w:t>
+      </w:r>
+      <w:r>
+        <w:t xml:space="preserve">and the complexity of your analyses.</w:t>
+      </w:r>
+    </w:p>
+    <w:bookmarkStart w:id="11" w:name="single-outcome-studies"/>
+    <w:p>
+      <w:pPr>
+        <w:pStyle w:val="Heading3"/>
+      </w:pPr>
+      <w:r>
+        <w:t xml:space="preserve">3.1 Single outcome studies</w:t>
+      </w:r>
+    </w:p>
+    <w:p>
+      <w:pPr>
+        <w:pStyle w:val="FirstParagraph"/>
+      </w:pPr>
+      <w:r>
+        <w:t xml:space="preserve">When analyzing a single primary outcome,</w:t>
+      </w:r>
+      <w:r>
+        <w:t xml:space="preserve"> </w:t>
+      </w:r>
+      <w:r>
+        <w:t xml:space="preserve">organize results by:</w:t>
       </w:r>
     </w:p>
     <w:p>
@@ -306,7 +296,7 @@
         </w:numPr>
       </w:pPr>
       <w:r>
-        <w:t xml:space="preserve">Follow the story of each outcome from descriptive statistics through final results</w:t>
+        <w:t xml:space="preserve">Descriptive statistics first</w:t>
       </w:r>
     </w:p>
     <w:p>
@@ -318,7 +308,7 @@
         </w:numPr>
       </w:pPr>
       <w:r>
-        <w:t xml:space="preserve">Compare findings across outcomes more easily</w:t>
+        <w:t xml:space="preserve">Main analysis results</w:t>
       </w:r>
     </w:p>
     <w:p>
@@ -330,29 +320,62 @@
         </w:numPr>
       </w:pPr>
       <w:r>
-        <w:t xml:space="preserve">Understand the complete picture for each outcome before moving to the next</w:t>
-      </w:r>
-    </w:p>
-    <w:p>
-      <w:pPr>
-        <w:pStyle w:val="Compact"/>
-        <w:numPr>
-          <w:ilvl w:val="0"/>
-          <w:numId w:val="1003"/>
-        </w:numPr>
-      </w:pPr>
-      <w:r>
-        <w:t xml:space="preserve">Navigate directly to outcomes of interest</w:t>
+        <w:t xml:space="preserve">Sensitivity analyses or subgroup analyses</w:t>
       </w:r>
     </w:p>
     <w:bookmarkEnd w:id="11"/>
-    <w:bookmarkStart w:id="12" w:name="how-to-organize-by-outcome"/>
+    <w:bookmarkStart w:id="16" w:name="multiple-outcomes-analyzed-separately"/>
+    <w:p>
+      <w:pPr>
+        <w:pStyle w:val="Heading3"/>
+      </w:pPr>
+      <w:r>
+        <w:t xml:space="preserve">3.2 Multiple outcomes analyzed separately</w:t>
+      </w:r>
+    </w:p>
+    <w:p>
+      <w:pPr>
+        <w:pStyle w:val="FirstParagraph"/>
+      </w:pPr>
+      <w:r>
+        <w:t xml:space="preserve">When analyzing multiple outcomes separately,</w:t>
+      </w:r>
+      <w:r>
+        <w:t xml:space="preserve"> </w:t>
+      </w:r>
+      <w:r>
+        <w:rPr>
+          <w:b/>
+          <w:bCs/>
+        </w:rPr>
+        <w:t xml:space="preserve">group your results section by outcome</w:t>
+      </w:r>
+      <w:r>
+        <w:t xml:space="preserve"> </w:t>
+      </w:r>
+      <w:r>
+        <w:t xml:space="preserve">rather than by analysis type.</w:t>
+      </w:r>
+      <w:r>
+        <w:t xml:space="preserve"> </w:t>
+      </w:r>
+      <w:r>
+        <w:t xml:space="preserve">This organization improves clarity and readability</w:t>
+      </w:r>
+      <w:r>
+        <w:t xml:space="preserve"> </w:t>
+      </w:r>
+      <w:r>
+        <w:t xml:space="preserve">by keeping all information about each outcome together.</w:t>
+      </w:r>
+    </w:p>
+    <w:bookmarkStart w:id="12" w:name="why-group-by-outcome"/>
     <w:p>
       <w:pPr>
         <w:pStyle w:val="Heading4"/>
       </w:pPr>
       <w:r>
-        <w:t xml:space="preserve">How to organize by outcome</w:t>
+        <w:t xml:space="preserve">Why group by outcome</w:t>
       </w:r>
     </w:p>
     <w:p>
@@ -360,13 +383,7 @@
         <w:pStyle w:val="FirstParagraph"/>
       </w:pPr>
       <w:r>
-        <w:t xml:space="preserve">For each outcome,</w:t>
-      </w:r>
-      <w:r>
-        <w:t xml:space="preserve"> </w:t>
-      </w:r>
-      <w:r>
-        <w:t xml:space="preserve">present:</w:t>
+        <w:t xml:space="preserve">Grouping by outcome helps readers:</w:t>
       </w:r>
     </w:p>
     <w:p>
@@ -378,7 +395,7 @@
         </w:numPr>
       </w:pPr>
       <w:r>
-        <w:t xml:space="preserve">Descriptive statistics</w:t>
+        <w:t xml:space="preserve">Follow the story of each outcome from descriptive statistics through final results</w:t>
       </w:r>
     </w:p>
     <w:p>
@@ -390,7 +407,7 @@
         </w:numPr>
       </w:pPr>
       <w:r>
-        <w:t xml:space="preserve">Main analysis results</w:t>
+        <w:t xml:space="preserve">Compare findings across outcomes more easily</w:t>
       </w:r>
     </w:p>
     <w:p>
@@ -402,7 +419,7 @@
         </w:numPr>
       </w:pPr>
       <w:r>
-        <w:t xml:space="preserve">Sensitivity analyses</w:t>
+        <w:t xml:space="preserve">Understand the complete picture for each outcome before moving to the next</w:t>
       </w:r>
     </w:p>
     <w:p>
@@ -414,6 +431,78 @@
         </w:numPr>
       </w:pPr>
       <w:r>
+        <w:t xml:space="preserve">Navigate directly to outcomes of interest</w:t>
+      </w:r>
+    </w:p>
+    <w:bookmarkEnd w:id="12"/>
+    <w:bookmarkStart w:id="13" w:name="how-to-organize-by-outcome"/>
+    <w:p>
+      <w:pPr>
+        <w:pStyle w:val="Heading4"/>
+      </w:pPr>
+      <w:r>
+        <w:t xml:space="preserve">How to organize by outcome</w:t>
+      </w:r>
+    </w:p>
+    <w:p>
+      <w:pPr>
+        <w:pStyle w:val="FirstParagraph"/>
+      </w:pPr>
+      <w:r>
+        <w:t xml:space="preserve">For each outcome,</w:t>
+      </w:r>
+      <w:r>
+        <w:t xml:space="preserve"> </w:t>
+      </w:r>
+      <w:r>
+        <w:t xml:space="preserve">present:</w:t>
+      </w:r>
+    </w:p>
+    <w:p>
+      <w:pPr>
+        <w:pStyle w:val="Compact"/>
+        <w:numPr>
+          <w:ilvl w:val="0"/>
+          <w:numId w:val="1005"/>
+        </w:numPr>
+      </w:pPr>
+      <w:r>
+        <w:t xml:space="preserve">Descriptive statistics</w:t>
+      </w:r>
+    </w:p>
+    <w:p>
+      <w:pPr>
+        <w:pStyle w:val="Compact"/>
+        <w:numPr>
+          <w:ilvl w:val="0"/>
+          <w:numId w:val="1005"/>
+        </w:numPr>
+      </w:pPr>
+      <w:r>
+        <w:t xml:space="preserve">Main analysis results</w:t>
+      </w:r>
+    </w:p>
+    <w:p>
+      <w:pPr>
+        <w:pStyle w:val="Compact"/>
+        <w:numPr>
+          <w:ilvl w:val="0"/>
+          <w:numId w:val="1005"/>
+        </w:numPr>
+      </w:pPr>
+      <w:r>
+        <w:t xml:space="preserve">Sensitivity analyses</w:t>
+      </w:r>
+    </w:p>
+    <w:p>
+      <w:pPr>
+        <w:pStyle w:val="Compact"/>
+        <w:numPr>
+          <w:ilvl w:val="0"/>
+          <w:numId w:val="1005"/>
+        </w:numPr>
+      </w:pPr>
+      <w:r>
         <w:t xml:space="preserve">Subgroup analyses (if applicable)</w:t>
       </w:r>
     </w:p>
@@ -575,8 +664,8 @@
         <w:t xml:space="preserve">    └── Subgroup analyses</w:t>
       </w:r>
     </w:p>
-    <w:bookmarkEnd w:id="12"/>
-    <w:bookmarkStart w:id="13" w:name="what-to-avoid"/>
+    <w:bookmarkEnd w:id="13"/>
+    <w:bookmarkStart w:id="14" w:name="what-to-avoid"/>
     <w:p>
       <w:pPr>
         <w:pStyle w:val="Heading4"/>
@@ -736,8 +825,8 @@
         <w:t xml:space="preserve">to understand the complete story for any single outcome.</w:t>
       </w:r>
     </w:p>
-    <w:bookmarkEnd w:id="13"/>
-    <w:bookmarkStart w:id="14" w:name="exception-shared-descriptive-statistics"/>
+    <w:bookmarkEnd w:id="14"/>
+    <w:bookmarkStart w:id="15" w:name="exception-shared-descriptive-statistics"/>
     <w:p>
       <w:pPr>
         <w:pStyle w:val="Heading4"/>
@@ -766,16 +855,16 @@
         <w:t xml:space="preserve">present them once at the beginning before discussing individual outcomes.</w:t>
       </w:r>
     </w:p>
-    <w:bookmarkEnd w:id="14"/>
     <w:bookmarkEnd w:id="15"/>
     <w:bookmarkEnd w:id="16"/>
-    <w:bookmarkStart w:id="22" w:name="figures-and-tables"/>
+    <w:bookmarkEnd w:id="17"/>
+    <w:bookmarkStart w:id="23" w:name="figures-and-tables"/>
     <w:p>
       <w:pPr>
         <w:pStyle w:val="Heading2"/>
       </w:pPr>
       <w:r>
-        <w:t xml:space="preserve">3 Figures and tables</w:t>
+        <w:t xml:space="preserve">4 Figures and tables</w:t>
       </w:r>
     </w:p>
     <w:p>
@@ -814,7 +903,7 @@
           <w:rPr>
             <w:rStyle w:val="Hyperlink"/>
           </w:rPr>
-          <w:t xml:space="preserve">Section 3.3</w:t>
+          <w:t xml:space="preserve">Section 4.3</w:t>
         </w:r>
       </w:hyperlink>
       <w:r>
@@ -859,13 +948,13 @@
         <w:t xml:space="preserve">without reading the main text.</w:t>
       </w:r>
     </w:p>
-    <w:bookmarkStart w:id="18" w:name="label-variables-in-plain-words"/>
+    <w:bookmarkStart w:id="19" w:name="label-variables-in-plain-words"/>
     <w:p>
       <w:pPr>
         <w:pStyle w:val="Heading3"/>
       </w:pPr>
       <w:r>
-        <w:t xml:space="preserve">3.1 Label variables in plain words</w:t>
+        <w:t xml:space="preserve">4.1 Label variables in plain words</w:t>
       </w:r>
     </w:p>
     <w:p>
@@ -880,545 +969,6 @@
       </w:r>
       <w:r>
         <w:t xml:space="preserve">Replace every variable name from the data with a label a reader understands:</w:t>
-      </w:r>
-    </w:p>
-    <w:p>
-      <w:pPr>
-        <w:pStyle w:val="Compact"/>
-        <w:numPr>
-          <w:ilvl w:val="0"/>
-          <w:numId w:val="1005"/>
-        </w:numPr>
-      </w:pPr>
-      <w:r>
-        <w:t xml:space="preserve">turn underscores and other code punctuation into spaces;</w:t>
-      </w:r>
-    </w:p>
-    <w:p>
-      <w:pPr>
-        <w:pStyle w:val="Compact"/>
-        <w:numPr>
-          <w:ilvl w:val="0"/>
-          <w:numId w:val="1005"/>
-        </w:numPr>
-      </w:pPr>
-      <w:r>
-        <w:t xml:space="preserve">use ordinary capitalization;</w:t>
-      </w:r>
-    </w:p>
-    <w:p>
-      <w:pPr>
-        <w:pStyle w:val="Compact"/>
-        <w:numPr>
-          <w:ilvl w:val="0"/>
-          <w:numId w:val="1005"/>
-        </w:numPr>
-      </w:pPr>
-      <w:r>
-        <w:t xml:space="preserve">spell out abbreviations and acronyms where space allows;</w:t>
-      </w:r>
-    </w:p>
-    <w:p>
-      <w:pPr>
-        <w:pStyle w:val="Compact"/>
-        <w:numPr>
-          <w:ilvl w:val="0"/>
-          <w:numId w:val="1005"/>
-        </w:numPr>
-      </w:pPr>
-      <w:r>
-        <w:t xml:space="preserve">give the unit of every measured quantity, in parentheses;</w:t>
-      </w:r>
-    </w:p>
-    <w:p>
-      <w:pPr>
-        <w:pStyle w:val="Compact"/>
-        <w:numPr>
-          <w:ilvl w:val="0"/>
-          <w:numId w:val="1005"/>
-        </w:numPr>
-      </w:pPr>
-      <w:r>
-        <w:t xml:space="preserve">relabel category levels the same way, including legend entries.</w:t>
-      </w:r>
-    </w:p>
-    <w:p>
-      <w:pPr>
-        <w:pStyle w:val="FirstParagraph"/>
-      </w:pPr>
-      <w:r>
-        <w:t xml:space="preserve">Use the same label for a variable in every figure, table and paragraph,</w:t>
-      </w:r>
-      <w:r>
-        <w:t xml:space="preserve"> </w:t>
-      </w:r>
-      <w:r>
-        <w:t xml:space="preserve">so a reader can match them up.</w:t>
-      </w:r>
-    </w:p>
-    <w:bookmarkStart w:id="17" w:name="exm-figure-labels"/>
-    <w:p>
-      <w:pPr>
-        <w:pStyle w:val="BodyText"/>
-      </w:pPr>
-      <w:r>
-        <w:rPr>
-          <w:b/>
-          <w:bCs/>
-        </w:rPr>
-        <w:t xml:space="preserve">Example 1 (Relabeling axes and a legend)</w:t>
-      </w:r>
-      <w:r>
-        <w:t xml:space="preserve"> </w:t>
-      </w:r>
-      <w:r>
-        <w:t xml:space="preserve"> </w:t>
-      </w:r>
-    </w:p>
-    <w:p>
-      <w:pPr>
-        <w:pStyle w:val="BlockText"/>
-      </w:pPr>
-      <w:r>
-        <w:t xml:space="preserve">❌ x-axis</w:t>
-      </w:r>
-      <w:r>
-        <w:t xml:space="preserve"> </w:t>
-      </w:r>
-      <w:r>
-        <w:rPr>
-          <w:rStyle w:val="VerbatimChar"/>
-        </w:rPr>
-        <w:t xml:space="preserve">age_yrs</w:t>
-      </w:r>
-      <w:r>
-        <w:t xml:space="preserve">, y-axis</w:t>
-      </w:r>
-      <w:r>
-        <w:t xml:space="preserve"> </w:t>
-      </w:r>
-      <w:r>
-        <w:rPr>
-          <w:rStyle w:val="VerbatimChar"/>
-        </w:rPr>
-        <w:t xml:space="preserve">sbp</w:t>
-      </w:r>
-      <w:r>
-        <w:t xml:space="preserve">, legend</w:t>
-      </w:r>
-      <w:r>
-        <w:t xml:space="preserve"> </w:t>
-      </w:r>
-      <w:r>
-        <w:rPr>
-          <w:rStyle w:val="VerbatimChar"/>
-        </w:rPr>
-        <w:t xml:space="preserve">trt_grp</w:t>
-      </w:r>
-      <w:r>
-        <w:t xml:space="preserve">:</w:t>
-      </w:r>
-      <w:r>
-        <w:t xml:space="preserve"> </w:t>
-      </w:r>
-      <w:r>
-        <w:rPr>
-          <w:rStyle w:val="VerbatimChar"/>
-        </w:rPr>
-        <w:t xml:space="preserve">ctrl</w:t>
-      </w:r>
-      <w:r>
-        <w:t xml:space="preserve">,</w:t>
-      </w:r>
-      <w:r>
-        <w:t xml:space="preserve"> </w:t>
-      </w:r>
-      <w:r>
-        <w:rPr>
-          <w:rStyle w:val="VerbatimChar"/>
-        </w:rPr>
-        <w:t xml:space="preserve">tx</w:t>
-      </w:r>
-    </w:p>
-    <w:p>
-      <w:pPr>
-        <w:pStyle w:val="BlockText"/>
-      </w:pPr>
-      <w:r>
-        <w:t xml:space="preserve">✅ x-axis</w:t>
-      </w:r>
-      <w:r>
-        <w:t xml:space="preserve"> </w:t>
-      </w:r>
-      <w:r>
-        <w:t xml:space="preserve">“Age (years)”</w:t>
-      </w:r>
-      <w:r>
-        <w:t xml:space="preserve">, y-axis</w:t>
-      </w:r>
-      <w:r>
-        <w:t xml:space="preserve"> </w:t>
-      </w:r>
-      <w:r>
-        <w:t xml:space="preserve">“Systolic blood pressure (mm Hg)”</w:t>
-      </w:r>
-      <w:r>
-        <w:t xml:space="preserve">,</w:t>
-      </w:r>
-      <w:r>
-        <w:t xml:space="preserve"> </w:t>
-      </w:r>
-      <w:r>
-        <w:t xml:space="preserve">legend</w:t>
-      </w:r>
-      <w:r>
-        <w:t xml:space="preserve"> </w:t>
-      </w:r>
-      <w:r>
-        <w:t xml:space="preserve">“Treatment group”</w:t>
-      </w:r>
-      <w:r>
-        <w:t xml:space="preserve">:</w:t>
-      </w:r>
-      <w:r>
-        <w:t xml:space="preserve"> </w:t>
-      </w:r>
-      <w:r>
-        <w:t xml:space="preserve">“Control”</w:t>
-      </w:r>
-      <w:r>
-        <w:t xml:space="preserve">,</w:t>
-      </w:r>
-      <w:r>
-        <w:t xml:space="preserve"> </w:t>
-      </w:r>
-      <w:r>
-        <w:t xml:space="preserve">“Treatment”</w:t>
-      </w:r>
-    </w:p>
-    <w:p>
-      <w:pPr>
-        <w:pStyle w:val="FirstParagraph"/>
-      </w:pPr>
-      <w:r>
-        <w:t xml:space="preserve">In R with</w:t>
-      </w:r>
-      <w:r>
-        <w:t xml:space="preserve"> </w:t>
-      </w:r>
-      <w:r>
-        <w:rPr>
-          <w:rStyle w:val="VerbatimChar"/>
-        </w:rPr>
-        <w:t xml:space="preserve">ggplot2</w:t>
-      </w:r>
-      <w:r>
-        <w:t xml:space="preserve">,</w:t>
-      </w:r>
-      <w:r>
-        <w:t xml:space="preserve"> </w:t>
-      </w:r>
-      <w:r>
-        <w:t xml:space="preserve">set the axis and legend titles with</w:t>
-      </w:r>
-      <w:r>
-        <w:t xml:space="preserve"> </w:t>
-      </w:r>
-      <w:r>
-        <w:rPr>
-          <w:rStyle w:val="VerbatimChar"/>
-        </w:rPr>
-        <w:t xml:space="preserve">labs()</w:t>
-      </w:r>
-      <w:r>
-        <w:t xml:space="preserve">,</w:t>
-      </w:r>
-      <w:r>
-        <w:t xml:space="preserve"> </w:t>
-      </w:r>
-      <w:r>
-        <w:t xml:space="preserve">and recode the category levels before plotting,</w:t>
-      </w:r>
-      <w:r>
-        <w:t xml:space="preserve"> </w:t>
-      </w:r>
-      <w:r>
-        <w:t xml:space="preserve">for example with</w:t>
-      </w:r>
-      <w:r>
-        <w:t xml:space="preserve"> </w:t>
-      </w:r>
-      <w:r>
-        <w:rPr>
-          <w:rStyle w:val="VerbatimChar"/>
-        </w:rPr>
-        <w:t xml:space="preserve">forcats::fct_recode()</w:t>
-      </w:r>
-      <w:r>
-        <w:t xml:space="preserve">.</w:t>
-      </w:r>
-    </w:p>
-    <w:bookmarkEnd w:id="17"/>
-    <w:bookmarkEnd w:id="18"/>
-    <w:bookmarkStart w:id="19" w:name="captions-are-captions-not-headings"/>
-    <w:p>
-      <w:pPr>
-        <w:pStyle w:val="Heading3"/>
-      </w:pPr>
-      <w:r>
-        <w:t xml:space="preserve">3.2 Captions are captions, not headings</w:t>
-      </w:r>
-    </w:p>
-    <w:p>
-      <w:pPr>
-        <w:pStyle w:val="FirstParagraph"/>
-      </w:pPr>
-      <w:r>
-        <w:t xml:space="preserve">Give every figure and table a numbered caption,</w:t>
-      </w:r>
-      <w:r>
-        <w:t xml:space="preserve"> </w:t>
-      </w:r>
-      <w:r>
-        <w:t xml:space="preserve">including those in the supplementary material.</w:t>
-      </w:r>
-      <w:r>
-        <w:t xml:space="preserve"> </w:t>
-      </w:r>
-      <w:r>
-        <w:t xml:space="preserve">A table without a caption is incomplete,</w:t>
-      </w:r>
-      <w:r>
-        <w:t xml:space="preserve"> </w:t>
-      </w:r>
-      <w:r>
-        <w:t xml:space="preserve">even when its contents are correct.</w:t>
-      </w:r>
-    </w:p>
-    <w:p>
-      <w:pPr>
-        <w:pStyle w:val="BodyText"/>
-      </w:pPr>
-      <w:r>
-        <w:t xml:space="preserve">Attach each caption to its figure or table</w:t>
-      </w:r>
-      <w:r>
-        <w:t xml:space="preserve"> </w:t>
-      </w:r>
-      <w:r>
-        <w:t xml:space="preserve">with your writing tool’s caption feature</w:t>
-      </w:r>
-      <w:r>
-        <w:t xml:space="preserve"> </w:t>
-      </w:r>
-      <w:r>
-        <w:t xml:space="preserve">(in Quarto, the last line of a</w:t>
-      </w:r>
-      <w:r>
-        <w:t xml:space="preserve"> </w:t>
-      </w:r>
-      <w:r>
-        <w:rPr>
-          <w:rStyle w:val="VerbatimChar"/>
-        </w:rPr>
-        <w:t xml:space="preserve">#fig-</w:t>
-      </w:r>
-      <w:r>
-        <w:t xml:space="preserve"> </w:t>
-      </w:r>
-      <w:r>
-        <w:t xml:space="preserve">or</w:t>
-      </w:r>
-      <w:r>
-        <w:t xml:space="preserve"> </w:t>
-      </w:r>
-      <w:r>
-        <w:rPr>
-          <w:rStyle w:val="VerbatimChar"/>
-        </w:rPr>
-        <w:t xml:space="preserve">#tbl-</w:t>
-      </w:r>
-      <w:r>
-        <w:t xml:space="preserve"> </w:t>
-      </w:r>
-      <w:r>
-        <w:t xml:space="preserve">div),</w:t>
-      </w:r>
-      <w:r>
-        <w:t xml:space="preserve"> </w:t>
-      </w:r>
-      <w:r>
-        <w:t xml:space="preserve">not as a section heading.</w:t>
-      </w:r>
-    </w:p>
-    <w:p>
-      <w:pPr>
-        <w:pStyle w:val="BodyText"/>
-      </w:pPr>
-      <w:r>
-        <w:rPr>
-          <w:b/>
-          <w:bCs/>
-        </w:rPr>
-        <w:t xml:space="preserve">Poor caption</w:t>
-      </w:r>
-      <w:r>
-        <w:t xml:space="preserve">: a section heading that reads</w:t>
-      </w:r>
-      <w:r>
-        <w:t xml:space="preserve"> </w:t>
-      </w:r>
-      <w:r>
-        <w:t xml:space="preserve">“Supplementary Figure S43: Distribution of follow-up time”</w:t>
-      </w:r>
-      <w:r>
-        <w:t xml:space="preserve">,</w:t>
-      </w:r>
-      <w:r>
-        <w:t xml:space="preserve"> </w:t>
-      </w:r>
-      <w:r>
-        <w:t xml:space="preserve">placed above the figure</w:t>
-      </w:r>
-    </w:p>
-    <w:p>
-      <w:pPr>
-        <w:pStyle w:val="BodyText"/>
-      </w:pPr>
-      <w:r>
-        <w:rPr>
-          <w:b/>
-          <w:bCs/>
-        </w:rPr>
-        <w:t xml:space="preserve">Better caption</w:t>
-      </w:r>
-      <w:r>
-        <w:t xml:space="preserve">:</w:t>
-      </w:r>
-      <w:r>
-        <w:t xml:space="preserve"> </w:t>
-      </w:r>
-      <w:r>
-        <w:t xml:space="preserve">“Distribution of follow-up time”</w:t>
-      </w:r>
-      <w:r>
-        <w:t xml:space="preserve">,</w:t>
-      </w:r>
-      <w:r>
-        <w:t xml:space="preserve"> </w:t>
-      </w:r>
-      <w:r>
-        <w:t xml:space="preserve">written as a caption attached to the figure,</w:t>
-      </w:r>
-      <w:r>
-        <w:t xml:space="preserve"> </w:t>
-      </w:r>
-      <w:r>
-        <w:t xml:space="preserve">with its label and number generated by your writing tool</w:t>
-      </w:r>
-      <w:r>
-        <w:t xml:space="preserve"> </w:t>
-      </w:r>
-      <w:r>
-        <w:t xml:space="preserve">rather than typed by hand</w:t>
-      </w:r>
-      <w:r>
-        <w:t xml:space="preserve"> </w:t>
-      </w:r>
-      <w:r>
-        <w:t xml:space="preserve">(a supplementary</w:t>
-      </w:r>
-      <w:r>
-        <w:t xml:space="preserve"> </w:t>
-      </w:r>
-      <w:r>
-        <w:t xml:space="preserve">“S”</w:t>
-      </w:r>
-      <w:r>
-        <w:t xml:space="preserve"> </w:t>
-      </w:r>
-      <w:r>
-        <w:t xml:space="preserve">prefix may need extra setup in the tool)</w:t>
-      </w:r>
-    </w:p>
-    <w:p>
-      <w:pPr>
-        <w:pStyle w:val="BodyText"/>
-      </w:pPr>
-      <w:r>
-        <w:t xml:space="preserve">A heading posing as a caption usually appears in the table of contents,</w:t>
-      </w:r>
-      <w:r>
-        <w:t xml:space="preserve"> </w:t>
-      </w:r>
-      <w:r>
-        <w:t xml:space="preserve">takes on heading styling,</w:t>
-      </w:r>
-      <w:r>
-        <w:t xml:space="preserve"> </w:t>
-      </w:r>
-      <w:r>
-        <w:t xml:space="preserve">and is not attached to its figure.</w:t>
-      </w:r>
-      <w:r>
-        <w:t xml:space="preserve"> </w:t>
-      </w:r>
-      <w:r>
-        <w:t xml:space="preserve">Its number is typed by hand,</w:t>
-      </w:r>
-      <w:r>
-        <w:t xml:space="preserve"> </w:t>
-      </w:r>
-      <w:r>
-        <w:t xml:space="preserve">so it falls out of step with the real numbering</w:t>
-      </w:r>
-      <w:r>
-        <w:t xml:space="preserve"> </w:t>
-      </w:r>
-      <w:r>
-        <w:t xml:space="preserve">when figures are added, removed, or reordered.</w:t>
-      </w:r>
-    </w:p>
-    <w:bookmarkEnd w:id="19"/>
-    <w:bookmarkStart w:id="20" w:name="sec-submission-layout"/>
-    <w:p>
-      <w:pPr>
-        <w:pStyle w:val="Heading3"/>
-      </w:pPr>
-      <w:r>
-        <w:t xml:space="preserve">3.3 Manuscript layout for journal submission</w:t>
-      </w:r>
-    </w:p>
-    <w:p>
-      <w:pPr>
-        <w:pStyle w:val="FirstParagraph"/>
-      </w:pPr>
-      <w:r>
-        <w:t xml:space="preserve">Many journals ask for figures and tables</w:t>
-      </w:r>
-      <w:r>
-        <w:t xml:space="preserve"> </w:t>
-      </w:r>
-      <w:r>
-        <w:t xml:space="preserve">to follow the main text of a submitted manuscript</w:t>
-      </w:r>
-      <w:r>
-        <w:t xml:space="preserve"> </w:t>
-      </w:r>
-      <w:r>
-        <w:t xml:space="preserve">rather than appear inline.</w:t>
-      </w:r>
-      <w:r>
-        <w:t xml:space="preserve"> </w:t>
-      </w:r>
-      <w:r>
-        <w:t xml:space="preserve">Unless the journal’s instructions say otherwise,</w:t>
-      </w:r>
-      <w:r>
-        <w:t xml:space="preserve"> </w:t>
-      </w:r>
-      <w:r>
-        <w:t xml:space="preserve">lay out a submission manuscript as follows:</w:t>
       </w:r>
     </w:p>
     <w:p>
@@ -1430,32 +980,7 @@
         </w:numPr>
       </w:pPr>
       <w:r>
-        <w:rPr>
-          <w:b/>
-          <w:bCs/>
-        </w:rPr>
-        <w:t xml:space="preserve">Put all main-text figures and tables at the end of the main manuscript</w:t>
-      </w:r>
-      <w:r>
-        <w:t xml:space="preserve">,</w:t>
-      </w:r>
-      <w:r>
-        <w:t xml:space="preserve"> </w:t>
-      </w:r>
-      <w:r>
-        <w:t xml:space="preserve">after the main text and the references,</w:t>
-      </w:r>
-      <w:r>
-        <w:t xml:space="preserve"> </w:t>
-      </w:r>
-      <w:r>
-        <w:t xml:space="preserve">and before the supplementary material.</w:t>
-      </w:r>
-      <w:r>
-        <w:t xml:space="preserve"> </w:t>
-      </w:r>
-      <w:r>
-        <w:t xml:space="preserve">The main text still cites each one by number.</w:t>
+        <w:t xml:space="preserve">turn underscores and other code punctuation into spaces;</w:t>
       </w:r>
     </w:p>
     <w:p>
@@ -1467,20 +992,7 @@
         </w:numPr>
       </w:pPr>
       <w:r>
-        <w:rPr>
-          <w:b/>
-          <w:bCs/>
-        </w:rPr>
-        <w:t xml:space="preserve">Insert a page break before the supplementary material header</w:t>
-      </w:r>
-      <w:r>
-        <w:t xml:space="preserve">,</w:t>
-      </w:r>
-      <w:r>
-        <w:t xml:space="preserve"> </w:t>
-      </w:r>
-      <w:r>
-        <w:t xml:space="preserve">so the supplement starts on a new page.</w:t>
+        <w:t xml:space="preserve">use ordinary capitalization;</w:t>
       </w:r>
     </w:p>
     <w:p>
@@ -1492,53 +1004,185 @@
         </w:numPr>
       </w:pPr>
       <w:r>
+        <w:t xml:space="preserve">spell out abbreviations and acronyms where space allows;</w:t>
+      </w:r>
+    </w:p>
+    <w:p>
+      <w:pPr>
+        <w:pStyle w:val="Compact"/>
+        <w:numPr>
+          <w:ilvl w:val="0"/>
+          <w:numId w:val="1006"/>
+        </w:numPr>
+      </w:pPr>
+      <w:r>
+        <w:t xml:space="preserve">give the unit of every measured quantity, in parentheses;</w:t>
+      </w:r>
+    </w:p>
+    <w:p>
+      <w:pPr>
+        <w:pStyle w:val="Compact"/>
+        <w:numPr>
+          <w:ilvl w:val="0"/>
+          <w:numId w:val="1006"/>
+        </w:numPr>
+      </w:pPr>
+      <w:r>
+        <w:t xml:space="preserve">relabel category levels the same way, including legend entries.</w:t>
+      </w:r>
+    </w:p>
+    <w:p>
+      <w:pPr>
+        <w:pStyle w:val="FirstParagraph"/>
+      </w:pPr>
+      <w:r>
+        <w:t xml:space="preserve">Use the same label for a variable in every figure, table and paragraph,</w:t>
+      </w:r>
+      <w:r>
+        <w:t xml:space="preserve"> </w:t>
+      </w:r>
+      <w:r>
+        <w:t xml:space="preserve">so a reader can match them up.</w:t>
+      </w:r>
+    </w:p>
+    <w:bookmarkStart w:id="18" w:name="exm-figure-labels"/>
+    <w:p>
+      <w:pPr>
+        <w:pStyle w:val="BodyText"/>
+      </w:pPr>
+      <w:r>
         <w:rPr>
           <w:b/>
           <w:bCs/>
         </w:rPr>
-        <w:t xml:space="preserve">Keep each caption with its figure or table.</w:t>
-      </w:r>
-      <w:r>
-        <w:t xml:space="preserve"> </w:t>
-      </w:r>
-      <w:r>
-        <w:t xml:space="preserve">Insert a page break before the first figure or table</w:t>
-      </w:r>
-      <w:r>
-        <w:t xml:space="preserve"> </w:t>
-      </w:r>
-      <w:r>
-        <w:t xml:space="preserve">and between consecutive ones,</w:t>
-      </w:r>
-      <w:r>
-        <w:t xml:space="preserve"> </w:t>
-      </w:r>
-      <w:r>
-        <w:t xml:space="preserve">so that each one starts on a page where it fits with its caption.</w:t>
-      </w:r>
-      <w:r>
-        <w:t xml:space="preserve"> </w:t>
-      </w:r>
-      <w:r>
-        <w:t xml:space="preserve">Do not let a caption fall on a different page from its figure or table,</w:t>
-      </w:r>
-      <w:r>
-        <w:t xml:space="preserve"> </w:t>
-      </w:r>
-      <w:r>
-        <w:t xml:space="preserve">or split across a page break,</w:t>
-      </w:r>
-      <w:r>
-        <w:t xml:space="preserve"> </w:t>
-      </w:r>
-      <w:r>
-        <w:t xml:space="preserve">unless it cannot be avoided,</w:t>
-      </w:r>
-      <w:r>
-        <w:t xml:space="preserve"> </w:t>
-      </w:r>
-      <w:r>
-        <w:t xml:space="preserve">as when a figure or table and its caption together are taller than a full page.</w:t>
+        <w:t xml:space="preserve">Example 1 (Relabeling axes and a legend)</w:t>
+      </w:r>
+      <w:r>
+        <w:t xml:space="preserve"> </w:t>
+      </w:r>
+      <w:r>
+        <w:t xml:space="preserve"> </w:t>
+      </w:r>
+    </w:p>
+    <w:p>
+      <w:pPr>
+        <w:pStyle w:val="BlockText"/>
+      </w:pPr>
+      <w:r>
+        <w:t xml:space="preserve">❌ x-axis</w:t>
+      </w:r>
+      <w:r>
+        <w:t xml:space="preserve"> </w:t>
+      </w:r>
+      <w:r>
+        <w:rPr>
+          <w:rStyle w:val="VerbatimChar"/>
+        </w:rPr>
+        <w:t xml:space="preserve">age_yrs</w:t>
+      </w:r>
+      <w:r>
+        <w:t xml:space="preserve">, y-axis</w:t>
+      </w:r>
+      <w:r>
+        <w:t xml:space="preserve"> </w:t>
+      </w:r>
+      <w:r>
+        <w:rPr>
+          <w:rStyle w:val="VerbatimChar"/>
+        </w:rPr>
+        <w:t xml:space="preserve">sbp</w:t>
+      </w:r>
+      <w:r>
+        <w:t xml:space="preserve">, legend</w:t>
+      </w:r>
+      <w:r>
+        <w:t xml:space="preserve"> </w:t>
+      </w:r>
+      <w:r>
+        <w:rPr>
+          <w:rStyle w:val="VerbatimChar"/>
+        </w:rPr>
+        <w:t xml:space="preserve">trt_grp</w:t>
+      </w:r>
+      <w:r>
+        <w:t xml:space="preserve">:</w:t>
+      </w:r>
+      <w:r>
+        <w:t xml:space="preserve"> </w:t>
+      </w:r>
+      <w:r>
+        <w:rPr>
+          <w:rStyle w:val="VerbatimChar"/>
+        </w:rPr>
+        <w:t xml:space="preserve">ctrl</w:t>
+      </w:r>
+      <w:r>
+        <w:t xml:space="preserve">,</w:t>
+      </w:r>
+      <w:r>
+        <w:t xml:space="preserve"> </w:t>
+      </w:r>
+      <w:r>
+        <w:rPr>
+          <w:rStyle w:val="VerbatimChar"/>
+        </w:rPr>
+        <w:t xml:space="preserve">tx</w:t>
+      </w:r>
+    </w:p>
+    <w:p>
+      <w:pPr>
+        <w:pStyle w:val="BlockText"/>
+      </w:pPr>
+      <w:r>
+        <w:t xml:space="preserve">✅ x-axis</w:t>
+      </w:r>
+      <w:r>
+        <w:t xml:space="preserve"> </w:t>
+      </w:r>
+      <w:r>
+        <w:t xml:space="preserve">“Age (years)”</w:t>
+      </w:r>
+      <w:r>
+        <w:t xml:space="preserve">, y-axis</w:t>
+      </w:r>
+      <w:r>
+        <w:t xml:space="preserve"> </w:t>
+      </w:r>
+      <w:r>
+        <w:t xml:space="preserve">“Systolic blood pressure (mm Hg)”</w:t>
+      </w:r>
+      <w:r>
+        <w:t xml:space="preserve">,</w:t>
+      </w:r>
+      <w:r>
+        <w:t xml:space="preserve"> </w:t>
+      </w:r>
+      <w:r>
+        <w:t xml:space="preserve">legend</w:t>
+      </w:r>
+      <w:r>
+        <w:t xml:space="preserve"> </w:t>
+      </w:r>
+      <w:r>
+        <w:t xml:space="preserve">“Treatment group”</w:t>
+      </w:r>
+      <w:r>
+        <w:t xml:space="preserve">:</w:t>
+      </w:r>
+      <w:r>
+        <w:t xml:space="preserve"> </w:t>
+      </w:r>
+      <w:r>
+        <w:t xml:space="preserve">“Control”</w:t>
+      </w:r>
+      <w:r>
+        <w:t xml:space="preserve">,</w:t>
+      </w:r>
+      <w:r>
+        <w:t xml:space="preserve"> </w:t>
+      </w:r>
+      <w:r>
+        <w:t xml:space="preserve">“Treatment”</w:t>
       </w:r>
     </w:p>
     <w:p>
@@ -1546,13 +1190,7 @@
         <w:pStyle w:val="FirstParagraph"/>
       </w:pPr>
       <w:r>
-        <w:t xml:space="preserve">In Quarto,</w:t>
-      </w:r>
-      <w:r>
-        <w:t xml:space="preserve"> </w:t>
-      </w:r>
-      <w:r>
-        <w:t xml:space="preserve">the</w:t>
+        <w:t xml:space="preserve">In R with</w:t>
       </w:r>
       <w:r>
         <w:t xml:space="preserve"> </w:t>
@@ -1561,25 +1199,16 @@
         <w:rPr>
           <w:rStyle w:val="VerbatimChar"/>
         </w:rPr>
-        <w:t xml:space="preserve">{{&lt; pagebreak &gt;}}</w:t>
-      </w:r>
-      <w:r>
-        <w:t xml:space="preserve"> </w:t>
-      </w:r>
-      <w:r>
-        <w:t xml:space="preserve">shortcode inserts a page break</w:t>
-      </w:r>
-      <w:r>
-        <w:t xml:space="preserve"> </w:t>
-      </w:r>
-      <w:r>
-        <w:t xml:space="preserve">in PDF and Word output,</w:t>
-      </w:r>
-      <w:r>
-        <w:t xml:space="preserve"> </w:t>
-      </w:r>
-      <w:r>
-        <w:t xml:space="preserve">and a</w:t>
+        <w:t xml:space="preserve">ggplot2</w:t>
+      </w:r>
+      <w:r>
+        <w:t xml:space="preserve">,</w:t>
+      </w:r>
+      <w:r>
+        <w:t xml:space="preserve"> </w:t>
+      </w:r>
+      <w:r>
+        <w:t xml:space="preserve">set the axis and legend titles with</w:t>
       </w:r>
       <w:r>
         <w:t xml:space="preserve"> </w:t>
@@ -1588,41 +1217,265 @@
         <w:rPr>
           <w:rStyle w:val="VerbatimChar"/>
         </w:rPr>
-        <w:t xml:space="preserve">::: {#refs}</w:t>
-      </w:r>
-      <w:r>
-        <w:t xml:space="preserve"> </w:t>
-      </w:r>
-      <w:r>
-        <w:t xml:space="preserve">div places the references</w:t>
-      </w:r>
-      <w:r>
-        <w:t xml:space="preserve"> </w:t>
-      </w:r>
-      <w:r>
-        <w:t xml:space="preserve">where you put the div</w:t>
-      </w:r>
-      <w:r>
-        <w:t xml:space="preserve"> </w:t>
-      </w:r>
-      <w:r>
-        <w:t xml:space="preserve">instead of at the end of the document.</w:t>
-      </w:r>
-      <w:r>
-        <w:t xml:space="preserve"> </w:t>
-      </w:r>
-      <w:r>
-        <w:t xml:space="preserve">Write the figures and tables after that div.</w:t>
+        <w:t xml:space="preserve">labs()</w:t>
+      </w:r>
+      <w:r>
+        <w:t xml:space="preserve">,</w:t>
+      </w:r>
+      <w:r>
+        <w:t xml:space="preserve"> </w:t>
+      </w:r>
+      <w:r>
+        <w:t xml:space="preserve">and recode the category levels before plotting,</w:t>
+      </w:r>
+      <w:r>
+        <w:t xml:space="preserve"> </w:t>
+      </w:r>
+      <w:r>
+        <w:t xml:space="preserve">for example with</w:t>
+      </w:r>
+      <w:r>
+        <w:t xml:space="preserve"> </w:t>
+      </w:r>
+      <w:r>
+        <w:rPr>
+          <w:rStyle w:val="VerbatimChar"/>
+        </w:rPr>
+        <w:t xml:space="preserve">forcats::fct_recode()</w:t>
+      </w:r>
+      <w:r>
+        <w:t xml:space="preserve">.</w:t>
+      </w:r>
+    </w:p>
+    <w:bookmarkEnd w:id="18"/>
+    <w:bookmarkEnd w:id="19"/>
+    <w:bookmarkStart w:id="20" w:name="captions-are-captions-not-headings"/>
+    <w:p>
+      <w:pPr>
+        <w:pStyle w:val="Heading3"/>
+      </w:pPr>
+      <w:r>
+        <w:t xml:space="preserve">4.2 Captions are captions, not headings</w:t>
+      </w:r>
+    </w:p>
+    <w:p>
+      <w:pPr>
+        <w:pStyle w:val="FirstParagraph"/>
+      </w:pPr>
+      <w:r>
+        <w:t xml:space="preserve">Give every figure and table a numbered caption,</w:t>
+      </w:r>
+      <w:r>
+        <w:t xml:space="preserve"> </w:t>
+      </w:r>
+      <w:r>
+        <w:t xml:space="preserve">including those in the supplementary material.</w:t>
+      </w:r>
+      <w:r>
+        <w:t xml:space="preserve"> </w:t>
+      </w:r>
+      <w:r>
+        <w:t xml:space="preserve">A table without a caption is incomplete,</w:t>
+      </w:r>
+      <w:r>
+        <w:t xml:space="preserve"> </w:t>
+      </w:r>
+      <w:r>
+        <w:t xml:space="preserve">even when its contents are correct.</w:t>
+      </w:r>
+    </w:p>
+    <w:p>
+      <w:pPr>
+        <w:pStyle w:val="BodyText"/>
+      </w:pPr>
+      <w:r>
+        <w:t xml:space="preserve">Attach each caption to its figure or table</w:t>
+      </w:r>
+      <w:r>
+        <w:t xml:space="preserve"> </w:t>
+      </w:r>
+      <w:r>
+        <w:t xml:space="preserve">with your writing tool’s caption feature</w:t>
+      </w:r>
+      <w:r>
+        <w:t xml:space="preserve"> </w:t>
+      </w:r>
+      <w:r>
+        <w:t xml:space="preserve">(in Quarto, the last line of a</w:t>
+      </w:r>
+      <w:r>
+        <w:t xml:space="preserve"> </w:t>
+      </w:r>
+      <w:r>
+        <w:rPr>
+          <w:rStyle w:val="VerbatimChar"/>
+        </w:rPr>
+        <w:t xml:space="preserve">#fig-</w:t>
+      </w:r>
+      <w:r>
+        <w:t xml:space="preserve"> </w:t>
+      </w:r>
+      <w:r>
+        <w:t xml:space="preserve">or</w:t>
+      </w:r>
+      <w:r>
+        <w:t xml:space="preserve"> </w:t>
+      </w:r>
+      <w:r>
+        <w:rPr>
+          <w:rStyle w:val="VerbatimChar"/>
+        </w:rPr>
+        <w:t xml:space="preserve">#tbl-</w:t>
+      </w:r>
+      <w:r>
+        <w:t xml:space="preserve"> </w:t>
+      </w:r>
+      <w:r>
+        <w:t xml:space="preserve">div),</w:t>
+      </w:r>
+      <w:r>
+        <w:t xml:space="preserve"> </w:t>
+      </w:r>
+      <w:r>
+        <w:t xml:space="preserve">not as a section heading.</w:t>
+      </w:r>
+    </w:p>
+    <w:p>
+      <w:pPr>
+        <w:pStyle w:val="BodyText"/>
+      </w:pPr>
+      <w:r>
+        <w:rPr>
+          <w:b/>
+          <w:bCs/>
+        </w:rPr>
+        <w:t xml:space="preserve">Poor caption</w:t>
+      </w:r>
+      <w:r>
+        <w:t xml:space="preserve">: a section heading that reads</w:t>
+      </w:r>
+      <w:r>
+        <w:t xml:space="preserve"> </w:t>
+      </w:r>
+      <w:r>
+        <w:t xml:space="preserve">“Supplementary Figure S43: Distribution of follow-up time”</w:t>
+      </w:r>
+      <w:r>
+        <w:t xml:space="preserve">,</w:t>
+      </w:r>
+      <w:r>
+        <w:t xml:space="preserve"> </w:t>
+      </w:r>
+      <w:r>
+        <w:t xml:space="preserve">placed above the figure</w:t>
+      </w:r>
+    </w:p>
+    <w:p>
+      <w:pPr>
+        <w:pStyle w:val="BodyText"/>
+      </w:pPr>
+      <w:r>
+        <w:rPr>
+          <w:b/>
+          <w:bCs/>
+        </w:rPr>
+        <w:t xml:space="preserve">Better caption</w:t>
+      </w:r>
+      <w:r>
+        <w:t xml:space="preserve">:</w:t>
+      </w:r>
+      <w:r>
+        <w:t xml:space="preserve"> </w:t>
+      </w:r>
+      <w:r>
+        <w:t xml:space="preserve">“Distribution of follow-up time”</w:t>
+      </w:r>
+      <w:r>
+        <w:t xml:space="preserve">,</w:t>
+      </w:r>
+      <w:r>
+        <w:t xml:space="preserve"> </w:t>
+      </w:r>
+      <w:r>
+        <w:t xml:space="preserve">written as a caption attached to the figure,</w:t>
+      </w:r>
+      <w:r>
+        <w:t xml:space="preserve"> </w:t>
+      </w:r>
+      <w:r>
+        <w:t xml:space="preserve">with its label and number generated by your writing tool</w:t>
+      </w:r>
+      <w:r>
+        <w:t xml:space="preserve"> </w:t>
+      </w:r>
+      <w:r>
+        <w:t xml:space="preserve">rather than typed by hand</w:t>
+      </w:r>
+      <w:r>
+        <w:t xml:space="preserve"> </w:t>
+      </w:r>
+      <w:r>
+        <w:t xml:space="preserve">(a supplementary</w:t>
+      </w:r>
+      <w:r>
+        <w:t xml:space="preserve"> </w:t>
+      </w:r>
+      <w:r>
+        <w:t xml:space="preserve">“S”</w:t>
+      </w:r>
+      <w:r>
+        <w:t xml:space="preserve"> </w:t>
+      </w:r>
+      <w:r>
+        <w:t xml:space="preserve">prefix may need extra setup in the tool)</w:t>
+      </w:r>
+    </w:p>
+    <w:p>
+      <w:pPr>
+        <w:pStyle w:val="BodyText"/>
+      </w:pPr>
+      <w:r>
+        <w:t xml:space="preserve">A heading posing as a caption usually appears in the table of contents,</w:t>
+      </w:r>
+      <w:r>
+        <w:t xml:space="preserve"> </w:t>
+      </w:r>
+      <w:r>
+        <w:t xml:space="preserve">takes on heading styling,</w:t>
+      </w:r>
+      <w:r>
+        <w:t xml:space="preserve"> </w:t>
+      </w:r>
+      <w:r>
+        <w:t xml:space="preserve">and is not attached to its figure.</w:t>
+      </w:r>
+      <w:r>
+        <w:t xml:space="preserve"> </w:t>
+      </w:r>
+      <w:r>
+        <w:t xml:space="preserve">Its number is typed by hand,</w:t>
+      </w:r>
+      <w:r>
+        <w:t xml:space="preserve"> </w:t>
+      </w:r>
+      <w:r>
+        <w:t xml:space="preserve">so it falls out of step with the real numbering</w:t>
+      </w:r>
+      <w:r>
+        <w:t xml:space="preserve"> </w:t>
+      </w:r>
+      <w:r>
+        <w:t xml:space="preserve">when figures are added, removed, or reordered.</w:t>
       </w:r>
     </w:p>
     <w:bookmarkEnd w:id="20"/>
-    <w:bookmarkStart w:id="21" w:name="check-the-rendered-layout"/>
+    <w:bookmarkStart w:id="21" w:name="sec-submission-layout"/>
     <w:p>
       <w:pPr>
         <w:pStyle w:val="Heading3"/>
       </w:pPr>
       <w:r>
-        <w:t xml:space="preserve">3.4 Check the rendered layout</w:t>
+        <w:t xml:space="preserve">4.3 Manuscript layout for journal submission</w:t>
       </w:r>
     </w:p>
     <w:p>
@@ -1630,49 +1483,31 @@
         <w:pStyle w:val="FirstParagraph"/>
       </w:pPr>
       <w:r>
-        <w:t xml:space="preserve">Captions, page breaks, and figure placement</w:t>
-      </w:r>
-      <w:r>
-        <w:t xml:space="preserve"> </w:t>
-      </w:r>
-      <w:r>
-        <w:t xml:space="preserve">are properties of the rendered document’s layout.</w:t>
-      </w:r>
-      <w:r>
-        <w:t xml:space="preserve"> </w:t>
-      </w:r>
-      <w:r>
-        <w:t xml:space="preserve">Problems with them are easy to miss when reading the source,</w:t>
-      </w:r>
-      <w:r>
-        <w:t xml:space="preserve"> </w:t>
-      </w:r>
-      <w:r>
-        <w:t xml:space="preserve">and a check of the text and numbers alone will not catch them.</w:t>
-      </w:r>
-      <w:r>
-        <w:t xml:space="preserve"> </w:t>
-      </w:r>
-      <w:r>
-        <w:t xml:space="preserve">Before calling a rendered manuscript reviewed,</w:t>
-      </w:r>
-      <w:r>
-        <w:t xml:space="preserve"> </w:t>
-      </w:r>
-      <w:r>
-        <w:t xml:space="preserve">page through the PDF or Word output</w:t>
-      </w:r>
-      <w:r>
-        <w:t xml:space="preserve"> </w:t>
-      </w:r>
-      <w:r>
-        <w:t xml:space="preserve">and check its layout,</w:t>
-      </w:r>
-      <w:r>
-        <w:t xml:space="preserve"> </w:t>
-      </w:r>
-      <w:r>
-        <w:t xml:space="preserve">not only its text and numbers:</w:t>
+        <w:t xml:space="preserve">Many journals ask for figures and tables</w:t>
+      </w:r>
+      <w:r>
+        <w:t xml:space="preserve"> </w:t>
+      </w:r>
+      <w:r>
+        <w:t xml:space="preserve">to follow the main text of a submitted manuscript</w:t>
+      </w:r>
+      <w:r>
+        <w:t xml:space="preserve"> </w:t>
+      </w:r>
+      <w:r>
+        <w:t xml:space="preserve">rather than appear inline.</w:t>
+      </w:r>
+      <w:r>
+        <w:t xml:space="preserve"> </w:t>
+      </w:r>
+      <w:r>
+        <w:t xml:space="preserve">Unless the journal’s instructions say otherwise,</w:t>
+      </w:r>
+      <w:r>
+        <w:t xml:space="preserve"> </w:t>
+      </w:r>
+      <w:r>
+        <w:t xml:space="preserve">lay out a submission manuscript as follows:</w:t>
       </w:r>
     </w:p>
     <w:p>
@@ -1684,7 +1519,32 @@
         </w:numPr>
       </w:pPr>
       <w:r>
-        <w:t xml:space="preserve">Does every figure and table have a numbered caption?</w:t>
+        <w:rPr>
+          <w:b/>
+          <w:bCs/>
+        </w:rPr>
+        <w:t xml:space="preserve">Put all main-text figures and tables at the end of the main manuscript</w:t>
+      </w:r>
+      <w:r>
+        <w:t xml:space="preserve">,</w:t>
+      </w:r>
+      <w:r>
+        <w:t xml:space="preserve"> </w:t>
+      </w:r>
+      <w:r>
+        <w:t xml:space="preserve">after the main text and the references,</w:t>
+      </w:r>
+      <w:r>
+        <w:t xml:space="preserve"> </w:t>
+      </w:r>
+      <w:r>
+        <w:t xml:space="preserve">and before the supplementary material.</w:t>
+      </w:r>
+      <w:r>
+        <w:t xml:space="preserve"> </w:t>
+      </w:r>
+      <w:r>
+        <w:t xml:space="preserve">The main text still cites each one by number.</w:t>
       </w:r>
     </w:p>
     <w:p>
@@ -1696,7 +1556,20 @@
         </w:numPr>
       </w:pPr>
       <w:r>
-        <w:t xml:space="preserve">Does each caption sit on the same page as its figure or table?</w:t>
+        <w:rPr>
+          <w:b/>
+          <w:bCs/>
+        </w:rPr>
+        <w:t xml:space="preserve">Insert a page break before the supplementary material header</w:t>
+      </w:r>
+      <w:r>
+        <w:t xml:space="preserve">,</w:t>
+      </w:r>
+      <w:r>
+        <w:t xml:space="preserve"> </w:t>
+      </w:r>
+      <w:r>
+        <w:t xml:space="preserve">so the supplement starts on a new page.</w:t>
       </w:r>
     </w:p>
     <w:p>
@@ -1708,129 +1581,53 @@
         </w:numPr>
       </w:pPr>
       <w:r>
-        <w:t xml:space="preserve">For a journal submission,</w:t>
-      </w:r>
-      <w:r>
-        <w:t xml:space="preserve"> </w:t>
-      </w:r>
-      <w:r>
-        <w:t xml:space="preserve">do the main-text figures and tables come after the references</w:t>
-      </w:r>
-      <w:r>
-        <w:t xml:space="preserve"> </w:t>
-      </w:r>
-      <w:r>
-        <w:t xml:space="preserve">and before the supplement,</w:t>
-      </w:r>
-      <w:r>
-        <w:t xml:space="preserve"> </w:t>
-      </w:r>
-      <w:r>
-        <w:t xml:space="preserve">and does the supplementary material start on a new page?</w:t>
-      </w:r>
-    </w:p>
-    <w:bookmarkEnd w:id="21"/>
-    <w:bookmarkEnd w:id="22"/>
-    <w:bookmarkStart w:id="23" w:name="subsection-headings"/>
-    <w:p>
-      <w:pPr>
-        <w:pStyle w:val="Heading2"/>
-      </w:pPr>
-      <w:r>
-        <w:t xml:space="preserve">4 Subsection headings</w:t>
-      </w:r>
-    </w:p>
-    <w:p>
-      <w:pPr>
-        <w:pStyle w:val="FirstParagraph"/>
-      </w:pPr>
-      <w:r>
-        <w:t xml:space="preserve">Use descriptive subsection headings to guide readers through your results.</w:t>
-      </w:r>
-      <w:r>
-        <w:t xml:space="preserve"> </w:t>
-      </w:r>
-      <w:r>
-        <w:t xml:space="preserve">Headings should clearly indicate the content of each section.</w:t>
-      </w:r>
-    </w:p>
-    <w:p>
-      <w:pPr>
-        <w:pStyle w:val="BodyText"/>
-      </w:pPr>
-      <w:r>
         <w:rPr>
           <w:b/>
           <w:bCs/>
         </w:rPr>
-        <w:t xml:space="preserve">Poor heading</w:t>
-      </w:r>
-      <w:r>
-        <w:t xml:space="preserve">:</w:t>
-      </w:r>
-      <w:r>
-        <w:t xml:space="preserve"> </w:t>
-      </w:r>
-      <w:r>
-        <w:t xml:space="preserve">“Analysis 1”</w:t>
-      </w:r>
-    </w:p>
-    <w:p>
-      <w:pPr>
-        <w:pStyle w:val="BodyText"/>
-      </w:pPr>
-      <w:r>
-        <w:rPr>
-          <w:b/>
-          <w:bCs/>
-        </w:rPr>
-        <w:t xml:space="preserve">Better heading</w:t>
-      </w:r>
-      <w:r>
-        <w:t xml:space="preserve">:</w:t>
-      </w:r>
-      <w:r>
-        <w:t xml:space="preserve"> </w:t>
-      </w:r>
-      <w:r>
-        <w:t xml:space="preserve">“Association between treatment and mortality”</w:t>
-      </w:r>
-    </w:p>
-    <w:p>
-      <w:pPr>
-        <w:pStyle w:val="BodyText"/>
-      </w:pPr>
-      <w:r>
-        <w:rPr>
-          <w:b/>
-          <w:bCs/>
-        </w:rPr>
-        <w:t xml:space="preserve">Best heading</w:t>
-      </w:r>
-      <w:r>
-        <w:t xml:space="preserve">:</w:t>
-      </w:r>
-      <w:r>
-        <w:t xml:space="preserve"> </w:t>
-      </w:r>
-      <w:r>
-        <w:t xml:space="preserve">“Treatment reduced mortality by 30%”</w:t>
-      </w:r>
-      <w:r>
-        <w:t xml:space="preserve"> </w:t>
-      </w:r>
-      <w:r>
-        <w:t xml:space="preserve">(when appropriate and not overstating findings)</w:t>
-      </w:r>
-    </w:p>
-    <w:bookmarkEnd w:id="23"/>
-    <w:bookmarkStart w:id="25" w:name="avoid-forward-references"/>
-    <w:p>
-      <w:pPr>
-        <w:pStyle w:val="Heading2"/>
-      </w:pPr>
-      <w:r>
-        <w:t xml:space="preserve">5 Avoid forward references</w:t>
+        <w:t xml:space="preserve">Keep each caption with its figure or table.</w:t>
+      </w:r>
+      <w:r>
+        <w:t xml:space="preserve"> </w:t>
+      </w:r>
+      <w:r>
+        <w:t xml:space="preserve">Insert a page break before the first figure or table</w:t>
+      </w:r>
+      <w:r>
+        <w:t xml:space="preserve"> </w:t>
+      </w:r>
+      <w:r>
+        <w:t xml:space="preserve">and between consecutive ones,</w:t>
+      </w:r>
+      <w:r>
+        <w:t xml:space="preserve"> </w:t>
+      </w:r>
+      <w:r>
+        <w:t xml:space="preserve">so that each one starts on a page where it fits with its caption.</w:t>
+      </w:r>
+      <w:r>
+        <w:t xml:space="preserve"> </w:t>
+      </w:r>
+      <w:r>
+        <w:t xml:space="preserve">Do not let a caption fall on a different page from its figure or table,</w:t>
+      </w:r>
+      <w:r>
+        <w:t xml:space="preserve"> </w:t>
+      </w:r>
+      <w:r>
+        <w:t xml:space="preserve">or split across a page break,</w:t>
+      </w:r>
+      <w:r>
+        <w:t xml:space="preserve"> </w:t>
+      </w:r>
+      <w:r>
+        <w:t xml:space="preserve">unless it cannot be avoided,</w:t>
+      </w:r>
+      <w:r>
+        <w:t xml:space="preserve"> </w:t>
+      </w:r>
+      <w:r>
+        <w:t xml:space="preserve">as when a figure or table and its caption together are taller than a full page.</w:t>
       </w:r>
     </w:p>
     <w:p>
@@ -1838,13 +1635,133 @@
         <w:pStyle w:val="FirstParagraph"/>
       </w:pPr>
       <w:r>
-        <w:t xml:space="preserve">A forward reference points the reader to content they have not reached yet.</w:t>
-      </w:r>
-      <w:r>
-        <w:t xml:space="preserve"> </w:t>
-      </w:r>
-      <w:r>
-        <w:t xml:space="preserve">Common forms are:</w:t>
+        <w:t xml:space="preserve">In Quarto,</w:t>
+      </w:r>
+      <w:r>
+        <w:t xml:space="preserve"> </w:t>
+      </w:r>
+      <w:r>
+        <w:t xml:space="preserve">the</w:t>
+      </w:r>
+      <w:r>
+        <w:t xml:space="preserve"> </w:t>
+      </w:r>
+      <w:r>
+        <w:rPr>
+          <w:rStyle w:val="VerbatimChar"/>
+        </w:rPr>
+        <w:t xml:space="preserve">{{&lt; pagebreak &gt;}}</w:t>
+      </w:r>
+      <w:r>
+        <w:t xml:space="preserve"> </w:t>
+      </w:r>
+      <w:r>
+        <w:t xml:space="preserve">shortcode inserts a page break</w:t>
+      </w:r>
+      <w:r>
+        <w:t xml:space="preserve"> </w:t>
+      </w:r>
+      <w:r>
+        <w:t xml:space="preserve">in PDF and Word output,</w:t>
+      </w:r>
+      <w:r>
+        <w:t xml:space="preserve"> </w:t>
+      </w:r>
+      <w:r>
+        <w:t xml:space="preserve">and a</w:t>
+      </w:r>
+      <w:r>
+        <w:t xml:space="preserve"> </w:t>
+      </w:r>
+      <w:r>
+        <w:rPr>
+          <w:rStyle w:val="VerbatimChar"/>
+        </w:rPr>
+        <w:t xml:space="preserve">::: {#refs}</w:t>
+      </w:r>
+      <w:r>
+        <w:t xml:space="preserve"> </w:t>
+      </w:r>
+      <w:r>
+        <w:t xml:space="preserve">div places the references</w:t>
+      </w:r>
+      <w:r>
+        <w:t xml:space="preserve"> </w:t>
+      </w:r>
+      <w:r>
+        <w:t xml:space="preserve">where you put the div</w:t>
+      </w:r>
+      <w:r>
+        <w:t xml:space="preserve"> </w:t>
+      </w:r>
+      <w:r>
+        <w:t xml:space="preserve">instead of at the end of the document.</w:t>
+      </w:r>
+      <w:r>
+        <w:t xml:space="preserve"> </w:t>
+      </w:r>
+      <w:r>
+        <w:t xml:space="preserve">Write the figures and tables after that div.</w:t>
+      </w:r>
+    </w:p>
+    <w:bookmarkEnd w:id="21"/>
+    <w:bookmarkStart w:id="22" w:name="check-the-rendered-layout"/>
+    <w:p>
+      <w:pPr>
+        <w:pStyle w:val="Heading3"/>
+      </w:pPr>
+      <w:r>
+        <w:t xml:space="preserve">4.4 Check the rendered layout</w:t>
+      </w:r>
+    </w:p>
+    <w:p>
+      <w:pPr>
+        <w:pStyle w:val="FirstParagraph"/>
+      </w:pPr>
+      <w:r>
+        <w:t xml:space="preserve">Captions, page breaks, and figure placement</w:t>
+      </w:r>
+      <w:r>
+        <w:t xml:space="preserve"> </w:t>
+      </w:r>
+      <w:r>
+        <w:t xml:space="preserve">are properties of the rendered document’s layout.</w:t>
+      </w:r>
+      <w:r>
+        <w:t xml:space="preserve"> </w:t>
+      </w:r>
+      <w:r>
+        <w:t xml:space="preserve">Problems with them are easy to miss when reading the source,</w:t>
+      </w:r>
+      <w:r>
+        <w:t xml:space="preserve"> </w:t>
+      </w:r>
+      <w:r>
+        <w:t xml:space="preserve">and a check of the text and numbers alone will not catch them.</w:t>
+      </w:r>
+      <w:r>
+        <w:t xml:space="preserve"> </w:t>
+      </w:r>
+      <w:r>
+        <w:t xml:space="preserve">Before calling a rendered manuscript reviewed,</w:t>
+      </w:r>
+      <w:r>
+        <w:t xml:space="preserve"> </w:t>
+      </w:r>
+      <w:r>
+        <w:t xml:space="preserve">page through the PDF or Word output</w:t>
+      </w:r>
+      <w:r>
+        <w:t xml:space="preserve"> </w:t>
+      </w:r>
+      <w:r>
+        <w:t xml:space="preserve">and check its layout,</w:t>
+      </w:r>
+      <w:r>
+        <w:t xml:space="preserve"> </w:t>
+      </w:r>
+      <w:r>
+        <w:t xml:space="preserve">not only its text and numbers:</w:t>
       </w:r>
     </w:p>
     <w:p>
@@ -1856,7 +1773,7 @@
         </w:numPr>
       </w:pPr>
       <w:r>
-        <w:t xml:space="preserve">“as discussed below”</w:t>
+        <w:t xml:space="preserve">Does every figure and table have a numbered caption?</w:t>
       </w:r>
     </w:p>
     <w:p>
@@ -1868,7 +1785,7 @@
         </w:numPr>
       </w:pPr>
       <w:r>
-        <w:t xml:space="preserve">“see the next section”</w:t>
+        <w:t xml:space="preserve">Does each caption sit on the same page as its figure or table?</w:t>
       </w:r>
     </w:p>
     <w:p>
@@ -1880,7 +1797,36 @@
         </w:numPr>
       </w:pPr>
       <w:r>
-        <w:t xml:space="preserve">“we will return to this later”</w:t>
+        <w:t xml:space="preserve">For a journal submission,</w:t>
+      </w:r>
+      <w:r>
+        <w:t xml:space="preserve"> </w:t>
+      </w:r>
+      <w:r>
+        <w:t xml:space="preserve">do the main-text figures and tables come after the references</w:t>
+      </w:r>
+      <w:r>
+        <w:t xml:space="preserve"> </w:t>
+      </w:r>
+      <w:r>
+        <w:t xml:space="preserve">and before the supplement,</w:t>
+      </w:r>
+      <w:r>
+        <w:t xml:space="preserve"> </w:t>
+      </w:r>
+      <w:r>
+        <w:t xml:space="preserve">and does the supplementary material start on a new page?</w:t>
+      </w:r>
+    </w:p>
+    <w:bookmarkEnd w:id="22"/>
+    <w:bookmarkEnd w:id="23"/>
+    <w:bookmarkStart w:id="24" w:name="subsection-headings"/>
+    <w:p>
+      <w:pPr>
+        <w:pStyle w:val="Heading2"/>
+      </w:pPr>
+      <w:r>
+        <w:t xml:space="preserve">5 Subsection headings</w:t>
       </w:r>
     </w:p>
     <w:p>
@@ -1888,110 +1834,15 @@
         <w:pStyle w:val="FirstParagraph"/>
       </w:pPr>
       <w:r>
-        <w:t xml:space="preserve">The reader must hold an unresolved pointer</w:t>
-      </w:r>
-      <w:r>
-        <w:t xml:space="preserve"> </w:t>
-      </w:r>
-      <w:r>
-        <w:t xml:space="preserve">while reading the sentence that depends on it.</w:t>
-      </w:r>
-    </w:p>
-    <w:p>
-      <w:pPr>
-        <w:pStyle w:val="BodyText"/>
-      </w:pPr>
-      <w:r>
-        <w:t xml:space="preserve">Fix a forward reference by moving the content ahead of the pointer.</w:t>
-      </w:r>
-      <w:r>
-        <w:t xml:space="preserve"> </w:t>
-      </w:r>
-      <w:r>
-        <w:t xml:space="preserve">Then change</w:t>
-      </w:r>
-      <w:r>
-        <w:t xml:space="preserve"> </w:t>
-      </w:r>
-      <w:r>
-        <w:t xml:space="preserve">“below”</w:t>
-      </w:r>
-      <w:r>
-        <w:t xml:space="preserve"> </w:t>
-      </w:r>
-      <w:r>
-        <w:t xml:space="preserve">to</w:t>
-      </w:r>
-      <w:r>
-        <w:t xml:space="preserve"> </w:t>
-      </w:r>
-      <w:r>
-        <w:t xml:space="preserve">“above”</w:t>
-      </w:r>
-      <w:r>
-        <w:t xml:space="preserve">, or delete the pointer.</w:t>
-      </w:r>
-    </w:p>
-    <w:p>
-      <w:pPr>
-        <w:pStyle w:val="BodyText"/>
-      </w:pPr>
-      <w:r>
-        <w:t xml:space="preserve">If moving the content would break the order of the argument,</w:t>
-      </w:r>
-      <w:r>
-        <w:t xml:space="preserve"> </w:t>
-      </w:r>
-      <w:r>
-        <w:t xml:space="preserve">keep the pointer, and make it a working link.</w:t>
-      </w:r>
-      <w:r>
-        <w:t xml:space="preserve"> </w:t>
-      </w:r>
-      <w:r>
-        <w:t xml:space="preserve">Say what the link points to and where it is,</w:t>
-      </w:r>
-      <w:r>
-        <w:t xml:space="preserve"> </w:t>
-      </w:r>
-      <w:r>
-        <w:t xml:space="preserve">as in</w:t>
-      </w:r>
-      <w:r>
-        <w:t xml:space="preserve"> </w:t>
-      </w:r>
-      <w:r>
-        <w:t xml:space="preserve">“Table 2 (later in this section)”</w:t>
-      </w:r>
-      <w:r>
-        <w:t xml:space="preserve">, with</w:t>
-      </w:r>
-      <w:r>
-        <w:t xml:space="preserve"> </w:t>
-      </w:r>
-      <w:r>
-        <w:t xml:space="preserve">“Table 2”</w:t>
-      </w:r>
-      <w:r>
-        <w:t xml:space="preserve"> </w:t>
-      </w:r>
-      <w:r>
-        <w:t xml:space="preserve">linked to the table.</w:t>
-      </w:r>
-      <w:r>
-        <w:t xml:space="preserve"> </w:t>
-      </w:r>
-      <w:r>
-        <w:t xml:space="preserve">Do not delete the link and leave only the name.</w:t>
-      </w:r>
-      <w:r>
-        <w:t xml:space="preserve"> </w:t>
-      </w:r>
-      <w:r>
-        <w:t xml:space="preserve">The reader then loses both the warning and the jump.</w:t>
-      </w:r>
-    </w:p>
-    <w:bookmarkStart w:id="24" w:name="exm-forward-reference"/>
+        <w:t xml:space="preserve">Use descriptive subsection headings to guide readers through your results.</w:t>
+      </w:r>
+      <w:r>
+        <w:t xml:space="preserve"> </w:t>
+      </w:r>
+      <w:r>
+        <w:t xml:space="preserve">Headings should clearly indicate the content of each section.</w:t>
+      </w:r>
+    </w:p>
     <w:p>
       <w:pPr>
         <w:pStyle w:val="BodyText"/>
@@ -2001,41 +1852,74 @@
           <w:b/>
           <w:bCs/>
         </w:rPr>
-        <w:t xml:space="preserve">Example 2 (Removing a forward reference)</w:t>
-      </w:r>
-      <w:r>
-        <w:t xml:space="preserve"> </w:t>
-      </w:r>
-      <w:r>
-        <w:t xml:space="preserve"> </w:t>
-      </w:r>
-    </w:p>
-    <w:p>
-      <w:pPr>
-        <w:pStyle w:val="BlockText"/>
-      </w:pPr>
-      <w:r>
-        <w:t xml:space="preserve">❌ The adjusted estimates, discussed in the next section, differ from the crude estimates.</w:t>
-      </w:r>
-      <w:r>
-        <w:t xml:space="preserve"> </w:t>
-      </w:r>
-      <w:r>
-        <w:t xml:space="preserve">The adjustment, described below, uses age and sex.</w:t>
-      </w:r>
-    </w:p>
-    <w:p>
-      <w:pPr>
-        <w:pStyle w:val="BlockText"/>
-      </w:pPr>
-      <w:r>
-        <w:t xml:space="preserve">✅ The adjustment uses age and sex.</w:t>
-      </w:r>
-      <w:r>
-        <w:t xml:space="preserve"> </w:t>
-      </w:r>
-      <w:r>
-        <w:t xml:space="preserve">The adjusted estimates differ from the crude estimates.</w:t>
+        <w:t xml:space="preserve">Poor heading</w:t>
+      </w:r>
+      <w:r>
+        <w:t xml:space="preserve">:</w:t>
+      </w:r>
+      <w:r>
+        <w:t xml:space="preserve"> </w:t>
+      </w:r>
+      <w:r>
+        <w:t xml:space="preserve">“Analysis 1”</w:t>
+      </w:r>
+    </w:p>
+    <w:p>
+      <w:pPr>
+        <w:pStyle w:val="BodyText"/>
+      </w:pPr>
+      <w:r>
+        <w:rPr>
+          <w:b/>
+          <w:bCs/>
+        </w:rPr>
+        <w:t xml:space="preserve">Better heading</w:t>
+      </w:r>
+      <w:r>
+        <w:t xml:space="preserve">:</w:t>
+      </w:r>
+      <w:r>
+        <w:t xml:space="preserve"> </w:t>
+      </w:r>
+      <w:r>
+        <w:t xml:space="preserve">“Association between treatment and mortality”</w:t>
+      </w:r>
+    </w:p>
+    <w:p>
+      <w:pPr>
+        <w:pStyle w:val="BodyText"/>
+      </w:pPr>
+      <w:r>
+        <w:rPr>
+          <w:b/>
+          <w:bCs/>
+        </w:rPr>
+        <w:t xml:space="preserve">Best heading</w:t>
+      </w:r>
+      <w:r>
+        <w:t xml:space="preserve">:</w:t>
+      </w:r>
+      <w:r>
+        <w:t xml:space="preserve"> </w:t>
+      </w:r>
+      <w:r>
+        <w:t xml:space="preserve">“Treatment reduced mortality by 30%”</w:t>
+      </w:r>
+      <w:r>
+        <w:t xml:space="preserve"> </w:t>
+      </w:r>
+      <w:r>
+        <w:t xml:space="preserve">(when appropriate and not overstating findings)</w:t>
+      </w:r>
+    </w:p>
+    <w:bookmarkEnd w:id="24"/>
+    <w:bookmarkStart w:id="26" w:name="avoid-forward-references"/>
+    <w:p>
+      <w:pPr>
+        <w:pStyle w:val="Heading2"/>
+      </w:pPr>
+      <w:r>
+        <w:t xml:space="preserve">6 Avoid forward references</w:t>
       </w:r>
     </w:p>
     <w:p>
@@ -2043,46 +1927,13 @@
         <w:pStyle w:val="FirstParagraph"/>
       </w:pPr>
       <w:r>
-        <w:t xml:space="preserve">In the ❌ version, both pointers send the reader to content that comes later,</w:t>
-      </w:r>
-      <w:r>
-        <w:t xml:space="preserve"> </w:t>
-      </w:r>
-      <w:r>
-        <w:t xml:space="preserve">so the reader sees</w:t>
-      </w:r>
-      <w:r>
-        <w:t xml:space="preserve"> </w:t>
-      </w:r>
-      <w:r>
-        <w:t xml:space="preserve">“adjusted”</w:t>
-      </w:r>
-      <w:r>
-        <w:t xml:space="preserve"> </w:t>
-      </w:r>
-      <w:r>
-        <w:t xml:space="preserve">before the paper says what was adjusted.</w:t>
-      </w:r>
-      <w:r>
-        <w:t xml:space="preserve"> </w:t>
-      </w:r>
-      <w:r>
-        <w:t xml:space="preserve">In the ✅ version, the sentence that defines the adjustment comes first,</w:t>
-      </w:r>
-      <w:r>
-        <w:t xml:space="preserve"> </w:t>
-      </w:r>
-      <w:r>
-        <w:t xml:space="preserve">so neither pointer is needed.</w:t>
-      </w:r>
-    </w:p>
-    <w:bookmarkEnd w:id="24"/>
-    <w:p>
-      <w:pPr>
-        <w:pStyle w:val="BodyText"/>
-      </w:pPr>
-      <w:r>
-        <w:t xml:space="preserve">Two cases are not forward references to fix:</w:t>
+        <w:t xml:space="preserve">A forward reference points the reader to content they have not reached yet.</w:t>
+      </w:r>
+      <w:r>
+        <w:t xml:space="preserve"> </w:t>
+      </w:r>
+      <w:r>
+        <w:t xml:space="preserve">Common forms are:</w:t>
       </w:r>
     </w:p>
     <w:p>
@@ -2094,28 +1945,7 @@
         </w:numPr>
       </w:pPr>
       <w:r>
-        <w:t xml:space="preserve">An overview near the start that previews the structure,</w:t>
-      </w:r>
-      <w:r>
-        <w:t xml:space="preserve"> </w:t>
-      </w:r>
-      <w:r>
-        <w:t xml:space="preserve">such as</w:t>
-      </w:r>
-      <w:r>
-        <w:t xml:space="preserve"> </w:t>
-      </w:r>
-      <w:r>
-        <w:t xml:space="preserve">“Section 2 describes the data, and Section 3 gives the results”</w:t>
-      </w:r>
-      <w:r>
-        <w:t xml:space="preserve">.</w:t>
-      </w:r>
-      <w:r>
-        <w:t xml:space="preserve"> </w:t>
-      </w:r>
-      <w:r>
-        <w:t xml:space="preserve">The reader is not meant to resolve the preview immediately.</w:t>
+        <w:t xml:space="preserve">“as discussed below”</w:t>
       </w:r>
     </w:p>
     <w:p>
@@ -2127,22 +1957,19 @@
         </w:numPr>
       </w:pPr>
       <w:r>
-        <w:t xml:space="preserve">A sentence that names a figure or table placed beside it, such as</w:t>
-      </w:r>
-      <w:r>
-        <w:t xml:space="preserve"> </w:t>
-      </w:r>
-      <w:r>
-        <w:t xml:space="preserve">“Table 2 shows the estimates”</w:t>
-      </w:r>
-      <w:r>
-        <w:t xml:space="preserve">.</w:t>
-      </w:r>
-      <w:r>
-        <w:t xml:space="preserve"> </w:t>
-      </w:r>
-      <w:r>
-        <w:t xml:space="preserve">The reader meets the table at once.</w:t>
+        <w:t xml:space="preserve">“see the next section”</w:t>
+      </w:r>
+    </w:p>
+    <w:p>
+      <w:pPr>
+        <w:pStyle w:val="Compact"/>
+        <w:numPr>
+          <w:ilvl w:val="0"/>
+          <w:numId w:val="1009"/>
+        </w:numPr>
+      </w:pPr>
+      <w:r>
+        <w:t xml:space="preserve">“we will return to this later”</w:t>
       </w:r>
     </w:p>
     <w:p>
@@ -2150,7 +1977,27 @@
         <w:pStyle w:val="FirstParagraph"/>
       </w:pPr>
       <w:r>
-        <w:t xml:space="preserve">A word such as</w:t>
+        <w:t xml:space="preserve">The reader must hold an unresolved pointer</w:t>
+      </w:r>
+      <w:r>
+        <w:t xml:space="preserve"> </w:t>
+      </w:r>
+      <w:r>
+        <w:t xml:space="preserve">while reading the sentence that depends on it.</w:t>
+      </w:r>
+    </w:p>
+    <w:p>
+      <w:pPr>
+        <w:pStyle w:val="BodyText"/>
+      </w:pPr>
+      <w:r>
+        <w:t xml:space="preserve">Fix a forward reference by moving the content ahead of the pointer.</w:t>
+      </w:r>
+      <w:r>
+        <w:t xml:space="preserve"> </w:t>
+      </w:r>
+      <w:r>
+        <w:t xml:space="preserve">Then change</w:t>
       </w:r>
       <w:r>
         <w:t xml:space="preserve"> </w:t>
@@ -2162,22 +2009,16 @@
         <w:t xml:space="preserve"> </w:t>
       </w:r>
       <w:r>
-        <w:t xml:space="preserve">in an ordinary comparison, as in</w:t>
-      </w:r>
-      <w:r>
-        <w:t xml:space="preserve"> </w:t>
-      </w:r>
-      <w:r>
-        <w:t xml:space="preserve">“values below the detection limit”</w:t>
-      </w:r>
-      <w:r>
-        <w:t xml:space="preserve">,</w:t>
-      </w:r>
-      <w:r>
-        <w:t xml:space="preserve"> </w:t>
-      </w:r>
-      <w:r>
-        <w:t xml:space="preserve">is not a pointer at all.</w:t>
+        <w:t xml:space="preserve">to</w:t>
+      </w:r>
+      <w:r>
+        <w:t xml:space="preserve"> </w:t>
+      </w:r>
+      <w:r>
+        <w:t xml:space="preserve">“above”</w:t>
+      </w:r>
+      <w:r>
+        <w:t xml:space="preserve">, or delete the pointer.</w:t>
       </w:r>
     </w:p>
     <w:p>
@@ -2185,137 +2026,152 @@
         <w:pStyle w:val="BodyText"/>
       </w:pPr>
       <w:r>
-        <w:t xml:space="preserve">When you insert or move a section, check the references that name a position,</w:t>
-      </w:r>
-      <w:r>
-        <w:t xml:space="preserve"> </w:t>
-      </w:r>
-      <w:r>
-        <w:t xml:space="preserve">such as</w:t>
-      </w:r>
-      <w:r>
-        <w:t xml:space="preserve"> </w:t>
-      </w:r>
-      <w:r>
-        <w:t xml:space="preserve">“the two sections above”</w:t>
-      </w:r>
-      <w:r>
-        <w:t xml:space="preserve"> </w:t>
-      </w:r>
-      <w:r>
-        <w:t xml:space="preserve">or</w:t>
-      </w:r>
-      <w:r>
-        <w:t xml:space="preserve"> </w:t>
-      </w:r>
-      <w:r>
-        <w:t xml:space="preserve">“the previous section”</w:t>
-      </w:r>
-      <w:r>
-        <w:t xml:space="preserve">.</w:t>
-      </w:r>
-      <w:r>
-        <w:t xml:space="preserve"> </w:t>
-      </w:r>
-      <w:r>
-        <w:t xml:space="preserve">Name the target instead, as in</w:t>
-      </w:r>
-      <w:r>
-        <w:t xml:space="preserve"> </w:t>
-      </w:r>
-      <w:r>
-        <w:t xml:space="preserve">“the sections on mortality and morbidity”</w:t>
-      </w:r>
-      <w:r>
-        <w:t xml:space="preserve">,</w:t>
-      </w:r>
-      <w:r>
-        <w:t xml:space="preserve"> </w:t>
-      </w:r>
-      <w:r>
-        <w:t xml:space="preserve">so that a later insertion does not make the position wrong.</w:t>
+        <w:t xml:space="preserve">If moving the content would break the order of the argument,</w:t>
+      </w:r>
+      <w:r>
+        <w:t xml:space="preserve"> </w:t>
+      </w:r>
+      <w:r>
+        <w:t xml:space="preserve">keep the pointer, and make it a working link.</w:t>
+      </w:r>
+      <w:r>
+        <w:t xml:space="preserve"> </w:t>
+      </w:r>
+      <w:r>
+        <w:t xml:space="preserve">Say what the link points to and where it is,</w:t>
+      </w:r>
+      <w:r>
+        <w:t xml:space="preserve"> </w:t>
+      </w:r>
+      <w:r>
+        <w:t xml:space="preserve">as in</w:t>
+      </w:r>
+      <w:r>
+        <w:t xml:space="preserve"> </w:t>
+      </w:r>
+      <w:r>
+        <w:t xml:space="preserve">“Table 2 (later in this section)”</w:t>
+      </w:r>
+      <w:r>
+        <w:t xml:space="preserve">, with</w:t>
+      </w:r>
+      <w:r>
+        <w:t xml:space="preserve"> </w:t>
+      </w:r>
+      <w:r>
+        <w:t xml:space="preserve">“Table 2”</w:t>
+      </w:r>
+      <w:r>
+        <w:t xml:space="preserve"> </w:t>
+      </w:r>
+      <w:r>
+        <w:t xml:space="preserve">linked to the table.</w:t>
+      </w:r>
+      <w:r>
+        <w:t xml:space="preserve"> </w:t>
+      </w:r>
+      <w:r>
+        <w:t xml:space="preserve">Do not delete the link and leave only the name.</w:t>
+      </w:r>
+      <w:r>
+        <w:t xml:space="preserve"> </w:t>
+      </w:r>
+      <w:r>
+        <w:t xml:space="preserve">The reader then loses both the warning and the jump.</w:t>
+      </w:r>
+    </w:p>
+    <w:bookmarkStart w:id="25" w:name="exm-forward-reference"/>
+    <w:p>
+      <w:pPr>
+        <w:pStyle w:val="BodyText"/>
+      </w:pPr>
+      <w:r>
+        <w:rPr>
+          <w:b/>
+          <w:bCs/>
+        </w:rPr>
+        <w:t xml:space="preserve">Example 2 (Removing a forward reference)</w:t>
+      </w:r>
+      <w:r>
+        <w:t xml:space="preserve"> </w:t>
+      </w:r>
+      <w:r>
+        <w:t xml:space="preserve"> </w:t>
+      </w:r>
+    </w:p>
+    <w:p>
+      <w:pPr>
+        <w:pStyle w:val="BlockText"/>
+      </w:pPr>
+      <w:r>
+        <w:t xml:space="preserve">❌ The adjusted estimates, discussed in the next section, differ from the crude estimates.</w:t>
+      </w:r>
+      <w:r>
+        <w:t xml:space="preserve"> </w:t>
+      </w:r>
+      <w:r>
+        <w:t xml:space="preserve">The adjustment, described below, uses age and sex.</w:t>
+      </w:r>
+    </w:p>
+    <w:p>
+      <w:pPr>
+        <w:pStyle w:val="BlockText"/>
+      </w:pPr>
+      <w:r>
+        <w:t xml:space="preserve">✅ The adjustment uses age and sex.</w:t>
+      </w:r>
+      <w:r>
+        <w:t xml:space="preserve"> </w:t>
+      </w:r>
+      <w:r>
+        <w:t xml:space="preserve">The adjusted estimates differ from the crude estimates.</w:t>
+      </w:r>
+    </w:p>
+    <w:p>
+      <w:pPr>
+        <w:pStyle w:val="FirstParagraph"/>
+      </w:pPr>
+      <w:r>
+        <w:t xml:space="preserve">In the ❌ version, both pointers send the reader to content that comes later,</w:t>
+      </w:r>
+      <w:r>
+        <w:t xml:space="preserve"> </w:t>
+      </w:r>
+      <w:r>
+        <w:t xml:space="preserve">so the reader sees</w:t>
+      </w:r>
+      <w:r>
+        <w:t xml:space="preserve"> </w:t>
+      </w:r>
+      <w:r>
+        <w:t xml:space="preserve">“adjusted”</w:t>
+      </w:r>
+      <w:r>
+        <w:t xml:space="preserve"> </w:t>
+      </w:r>
+      <w:r>
+        <w:t xml:space="preserve">before the paper says what was adjusted.</w:t>
+      </w:r>
+      <w:r>
+        <w:t xml:space="preserve"> </w:t>
+      </w:r>
+      <w:r>
+        <w:t xml:space="preserve">In the ✅ version, the sentence that defines the adjustment comes first,</w:t>
+      </w:r>
+      <w:r>
+        <w:t xml:space="preserve"> </w:t>
+      </w:r>
+      <w:r>
+        <w:t xml:space="preserve">so neither pointer is needed.</w:t>
       </w:r>
     </w:p>
     <w:bookmarkEnd w:id="25"/>
-    <w:bookmarkStart w:id="26" w:name="links-to-videos-and-other-media"/>
-    <w:p>
-      <w:pPr>
-        <w:pStyle w:val="Heading2"/>
-      </w:pPr>
-      <w:r>
-        <w:t xml:space="preserve">6 Links to videos and other media</w:t>
-      </w:r>
-    </w:p>
-    <w:p>
-      <w:pPr>
-        <w:pStyle w:val="FirstParagraph"/>
-      </w:pPr>
-      <w:r>
-        <w:t xml:space="preserve">Put each link to a video, podcast, demo or other external material</w:t>
-      </w:r>
-      <w:r>
-        <w:t xml:space="preserve"> </w:t>
-      </w:r>
-      <w:r>
-        <w:t xml:space="preserve">in a short note right after the text the material supports.</w:t>
-      </w:r>
-      <w:r>
-        <w:t xml:space="preserve"> </w:t>
-      </w:r>
-      <w:r>
-        <w:t xml:space="preserve">Do not collect the links in a list at the end of the document.</w:t>
-      </w:r>
-      <w:r>
-        <w:t xml:space="preserve"> </w:t>
-      </w:r>
-      <w:r>
-        <w:t xml:space="preserve">If the material covers several sections,</w:t>
-      </w:r>
-      <w:r>
-        <w:t xml:space="preserve"> </w:t>
-      </w:r>
-      <w:r>
-        <w:t xml:space="preserve">put the note after the first section the material supports.</w:t>
-      </w:r>
-      <w:r>
-        <w:t xml:space="preserve"> </w:t>
-      </w:r>
-      <w:r>
-        <w:t xml:space="preserve">If the text the note supports is a question followed by its answer,</w:t>
-      </w:r>
-      <w:r>
-        <w:t xml:space="preserve"> </w:t>
-      </w:r>
-      <w:r>
-        <w:t xml:space="preserve">put the note after the answer, not between them.</w:t>
-      </w:r>
-    </w:p>
     <w:p>
       <w:pPr>
         <w:pStyle w:val="BodyText"/>
       </w:pPr>
       <w:r>
-        <w:t xml:space="preserve">A reader who has just finished a section is ready to use material about it.</w:t>
-      </w:r>
-      <w:r>
-        <w:t xml:space="preserve"> </w:t>
-      </w:r>
-      <w:r>
-        <w:t xml:space="preserve">The same reader at the end of the document must guess which link goes with which section,</w:t>
-      </w:r>
-      <w:r>
-        <w:t xml:space="preserve"> </w:t>
-      </w:r>
-      <w:r>
-        <w:t xml:space="preserve">and may never reach the list.</w:t>
-      </w:r>
-    </w:p>
-    <w:p>
-      <w:pPr>
-        <w:pStyle w:val="BodyText"/>
-      </w:pPr>
-      <w:r>
-        <w:t xml:space="preserve">For each link:</w:t>
+        <w:t xml:space="preserve">Two cases are not forward references to fix:</w:t>
       </w:r>
     </w:p>
     <w:p>
@@ -2327,13 +2183,28 @@
         </w:numPr>
       </w:pPr>
       <w:r>
-        <w:t xml:space="preserve">Write one line, such as</w:t>
-      </w:r>
-      <w:r>
-        <w:t xml:space="preserve"> </w:t>
-      </w:r>
-      <w:r>
-        <w:t xml:space="preserve">“Video: Weinberger derives the descent direction (from 3:09).”</w:t>
+        <w:t xml:space="preserve">An overview near the start that previews the structure,</w:t>
+      </w:r>
+      <w:r>
+        <w:t xml:space="preserve"> </w:t>
+      </w:r>
+      <w:r>
+        <w:t xml:space="preserve">such as</w:t>
+      </w:r>
+      <w:r>
+        <w:t xml:space="preserve"> </w:t>
+      </w:r>
+      <w:r>
+        <w:t xml:space="preserve">“Section 2 describes the data, and Section 3 gives the results”</w:t>
+      </w:r>
+      <w:r>
+        <w:t xml:space="preserve">.</w:t>
+      </w:r>
+      <w:r>
+        <w:t xml:space="preserve"> </w:t>
+      </w:r>
+      <w:r>
+        <w:t xml:space="preserve">The reader is not meant to resolve the preview immediately.</w:t>
       </w:r>
     </w:p>
     <w:p>
@@ -2345,7 +2216,195 @@
         </w:numPr>
       </w:pPr>
       <w:r>
-        <w:t xml:space="preserve">Name the speaker and say what the material shows, in simple, literal words.</w:t>
+        <w:t xml:space="preserve">A sentence that names a figure or table placed beside it, such as</w:t>
+      </w:r>
+      <w:r>
+        <w:t xml:space="preserve"> </w:t>
+      </w:r>
+      <w:r>
+        <w:t xml:space="preserve">“Table 2 shows the estimates”</w:t>
+      </w:r>
+      <w:r>
+        <w:t xml:space="preserve">.</w:t>
+      </w:r>
+      <w:r>
+        <w:t xml:space="preserve"> </w:t>
+      </w:r>
+      <w:r>
+        <w:t xml:space="preserve">The reader meets the table at once.</w:t>
+      </w:r>
+    </w:p>
+    <w:p>
+      <w:pPr>
+        <w:pStyle w:val="FirstParagraph"/>
+      </w:pPr>
+      <w:r>
+        <w:t xml:space="preserve">A word such as</w:t>
+      </w:r>
+      <w:r>
+        <w:t xml:space="preserve"> </w:t>
+      </w:r>
+      <w:r>
+        <w:t xml:space="preserve">“below”</w:t>
+      </w:r>
+      <w:r>
+        <w:t xml:space="preserve"> </w:t>
+      </w:r>
+      <w:r>
+        <w:t xml:space="preserve">in an ordinary comparison, as in</w:t>
+      </w:r>
+      <w:r>
+        <w:t xml:space="preserve"> </w:t>
+      </w:r>
+      <w:r>
+        <w:t xml:space="preserve">“values below the detection limit”</w:t>
+      </w:r>
+      <w:r>
+        <w:t xml:space="preserve">,</w:t>
+      </w:r>
+      <w:r>
+        <w:t xml:space="preserve"> </w:t>
+      </w:r>
+      <w:r>
+        <w:t xml:space="preserve">is not a pointer at all.</w:t>
+      </w:r>
+    </w:p>
+    <w:p>
+      <w:pPr>
+        <w:pStyle w:val="BodyText"/>
+      </w:pPr>
+      <w:r>
+        <w:t xml:space="preserve">When you insert or move a section, check the references that name a position,</w:t>
+      </w:r>
+      <w:r>
+        <w:t xml:space="preserve"> </w:t>
+      </w:r>
+      <w:r>
+        <w:t xml:space="preserve">such as</w:t>
+      </w:r>
+      <w:r>
+        <w:t xml:space="preserve"> </w:t>
+      </w:r>
+      <w:r>
+        <w:t xml:space="preserve">“the two sections above”</w:t>
+      </w:r>
+      <w:r>
+        <w:t xml:space="preserve"> </w:t>
+      </w:r>
+      <w:r>
+        <w:t xml:space="preserve">or</w:t>
+      </w:r>
+      <w:r>
+        <w:t xml:space="preserve"> </w:t>
+      </w:r>
+      <w:r>
+        <w:t xml:space="preserve">“the previous section”</w:t>
+      </w:r>
+      <w:r>
+        <w:t xml:space="preserve">.</w:t>
+      </w:r>
+      <w:r>
+        <w:t xml:space="preserve"> </w:t>
+      </w:r>
+      <w:r>
+        <w:t xml:space="preserve">Name the target instead, as in</w:t>
+      </w:r>
+      <w:r>
+        <w:t xml:space="preserve"> </w:t>
+      </w:r>
+      <w:r>
+        <w:t xml:space="preserve">“the sections on mortality and morbidity”</w:t>
+      </w:r>
+      <w:r>
+        <w:t xml:space="preserve">,</w:t>
+      </w:r>
+      <w:r>
+        <w:t xml:space="preserve"> </w:t>
+      </w:r>
+      <w:r>
+        <w:t xml:space="preserve">so that a later insertion does not make the position wrong.</w:t>
+      </w:r>
+    </w:p>
+    <w:bookmarkEnd w:id="26"/>
+    <w:bookmarkStart w:id="30" w:name="links-to-videos-and-other-media"/>
+    <w:p>
+      <w:pPr>
+        <w:pStyle w:val="Heading2"/>
+      </w:pPr>
+      <w:r>
+        <w:t xml:space="preserve">7 Links to videos and other media</w:t>
+      </w:r>
+    </w:p>
+    <w:p>
+      <w:pPr>
+        <w:pStyle w:val="FirstParagraph"/>
+      </w:pPr>
+      <w:r>
+        <w:t xml:space="preserve">Put each link to a video, podcast, demo or other external material</w:t>
+      </w:r>
+      <w:r>
+        <w:t xml:space="preserve"> </w:t>
+      </w:r>
+      <w:r>
+        <w:t xml:space="preserve">in a short note right after the text the material supports.</w:t>
+      </w:r>
+      <w:r>
+        <w:t xml:space="preserve"> </w:t>
+      </w:r>
+      <w:r>
+        <w:t xml:space="preserve">Do not collect the links in a list at the end of the document.</w:t>
+      </w:r>
+      <w:r>
+        <w:t xml:space="preserve"> </w:t>
+      </w:r>
+      <w:r>
+        <w:t xml:space="preserve">If the material covers several sections,</w:t>
+      </w:r>
+      <w:r>
+        <w:t xml:space="preserve"> </w:t>
+      </w:r>
+      <w:r>
+        <w:t xml:space="preserve">put the note after the first section the material supports.</w:t>
+      </w:r>
+      <w:r>
+        <w:t xml:space="preserve"> </w:t>
+      </w:r>
+      <w:r>
+        <w:t xml:space="preserve">If the text the note supports is a question followed by its answer,</w:t>
+      </w:r>
+      <w:r>
+        <w:t xml:space="preserve"> </w:t>
+      </w:r>
+      <w:r>
+        <w:t xml:space="preserve">put the note after the answer, not between them.</w:t>
+      </w:r>
+    </w:p>
+    <w:p>
+      <w:pPr>
+        <w:pStyle w:val="BodyText"/>
+      </w:pPr>
+      <w:r>
+        <w:t xml:space="preserve">A reader who has just finished a section is ready to use material about it.</w:t>
+      </w:r>
+      <w:r>
+        <w:t xml:space="preserve"> </w:t>
+      </w:r>
+      <w:r>
+        <w:t xml:space="preserve">The same reader at the end of the document must guess which link goes with which section,</w:t>
+      </w:r>
+      <w:r>
+        <w:t xml:space="preserve"> </w:t>
+      </w:r>
+      <w:r>
+        <w:t xml:space="preserve">and may never reach the list.</w:t>
+      </w:r>
+    </w:p>
+    <w:p>
+      <w:pPr>
+        <w:pStyle w:val="BodyText"/>
+      </w:pPr>
+      <w:r>
+        <w:t xml:space="preserve">For each link:</w:t>
       </w:r>
     </w:p>
     <w:p>
@@ -2353,11 +2412,17 @@
         <w:pStyle w:val="Compact"/>
         <w:numPr>
           <w:ilvl w:val="0"/>
-          <w:numId w:val="1010"/>
+          <w:numId w:val="1011"/>
         </w:numPr>
       </w:pPr>
       <w:r>
-        <w:t xml:space="preserve">Link the exact start time when the material covers more than the topic.</w:t>
+        <w:t xml:space="preserve">Write one line, such as</w:t>
+      </w:r>
+      <w:r>
+        <w:t xml:space="preserve"> </w:t>
+      </w:r>
+      <w:r>
+        <w:t xml:space="preserve">“Video: Weinberger derives the descent direction (from 3:09).”</w:t>
       </w:r>
     </w:p>
     <w:p>
@@ -2365,10 +2430,34 @@
         <w:pStyle w:val="Compact"/>
         <w:numPr>
           <w:ilvl w:val="0"/>
-          <w:numId w:val="1010"/>
+          <w:numId w:val="1011"/>
         </w:numPr>
       </w:pPr>
       <w:r>
+        <w:t xml:space="preserve">Name the speaker and say what the material shows, in simple, literal words.</w:t>
+      </w:r>
+    </w:p>
+    <w:p>
+      <w:pPr>
+        <w:pStyle w:val="Compact"/>
+        <w:numPr>
+          <w:ilvl w:val="0"/>
+          <w:numId w:val="1011"/>
+        </w:numPr>
+      </w:pPr>
+      <w:r>
+        <w:t xml:space="preserve">Link the exact start time when the material covers more than the topic.</w:t>
+      </w:r>
+    </w:p>
+    <w:p>
+      <w:pPr>
+        <w:pStyle w:val="Compact"/>
+        <w:numPr>
+          <w:ilvl w:val="0"/>
+          <w:numId w:val="1011"/>
+        </w:numPr>
+      </w:pPr>
+      <w:r>
         <w:t xml:space="preserve">Cite the source.</w:t>
       </w:r>
     </w:p>
@@ -2398,7 +2487,60 @@
         <w:t xml:space="preserve">Do not link private repositories, such as ones that hold graded homework or exams.</w:t>
       </w:r>
     </w:p>
-    <w:bookmarkEnd w:id="26"/>
+    <w:bookmarkStart w:id="29" w:name="refs"/>
+    <w:bookmarkStart w:id="28" w:name="ref-lamport2019think"/>
+    <w:p>
+      <w:pPr>
+        <w:pStyle w:val="Bibliography"/>
+      </w:pPr>
+      <w:r>
+        <w:t xml:space="preserve">Lamport, Leslie. 2019.</w:t>
+      </w:r>
+      <w:r>
+        <w:t xml:space="preserve"> </w:t>
+      </w:r>
+      <w:r>
+        <w:rPr>
+          <w:i/>
+          <w:iCs/>
+        </w:rPr>
+        <w:t xml:space="preserve">Think and Write with</w:t>
+      </w:r>
+      <w:r>
+        <w:rPr>
+          <w:i/>
+          <w:iCs/>
+        </w:rPr>
+        <w:t xml:space="preserve"> </w:t>
+      </w:r>
+      <w:r>
+        <w:rPr>
+          <w:i/>
+          <w:iCs/>
+        </w:rPr>
+        <w:t xml:space="preserve">Leslie Lamport</w:t>
+      </w:r>
+      <w:r>
+        <w:t xml:space="preserve">. Podcast interview, Mentors.fm.</w:t>
+      </w:r>
+      <w:r>
+        <w:t xml:space="preserve"> </w:t>
+      </w:r>
+      <w:hyperlink r:id="rId27">
+        <w:r>
+          <w:rPr>
+            <w:rStyle w:val="Hyperlink"/>
+          </w:rPr>
+          <w:t xml:space="preserve">https://mentors.fm/2019/08/13/think-and-write-with-leslie-lamport/</w:t>
+        </w:r>
+      </w:hyperlink>
+      <w:r>
+        <w:t xml:space="preserve">.</w:t>
+      </w:r>
+    </w:p>
+    <w:bookmarkEnd w:id="28"/>
+    <w:bookmarkEnd w:id="29"/>
+    <w:bookmarkEnd w:id="30"/>
     <w:sectPr>
       <w:footnotePr>
         <w:numRestart w:val="eachSect"/>
@@ -2710,6 +2852,9 @@
     <w:abstractNumId w:val="991"/>
   </w:num>
   <w:num w:numId="1004">
+    <w:abstractNumId w:val="991"/>
+  </w:num>
+  <w:num w:numId="1005">
     <w:abstractNumId w:val="99411"/>
     <w:lvlOverride w:ilvl="0">
       <w:startOverride w:val="1"/>
@@ -2739,9 +2884,6 @@
       <w:startOverride w:val="1"/>
     </w:lvlOverride>
   </w:num>
-  <w:num w:numId="1005">
-    <w:abstractNumId w:val="991"/>
-  </w:num>
   <w:num w:numId="1006">
     <w:abstractNumId w:val="991"/>
   </w:num>
@@ -2755,6 +2897,9 @@
     <w:abstractNumId w:val="991"/>
   </w:num>
   <w:num w:numId="1010">
+    <w:abstractNumId w:val="991"/>
+  </w:num>
+  <w:num w:numId="1011">
     <w:abstractNumId w:val="991"/>
   </w:num>
 </w:numbering>

</xml_diff>

<commit_message>
Deploying to gh-pages from @ Morrison-Lab/psw@c6a0cfb5c17d43df329ba0fd9bc96369ca6e7596 🚀
</commit_message>
<xml_diff>
--- a/chapters/paper-organization.docx
+++ b/chapters/paper-organization.docx
@@ -15,7 +15,7 @@
         <w:pStyle w:val="Date"/>
       </w:pPr>
       <w:r>
-        <w:t xml:space="preserve">Last modified: 2026-10-31 07:13:32 (PDT)</w:t>
+        <w:t xml:space="preserve">Last modified: 2026-11-01 01:56:20 (PDT)</w:t>
       </w:r>
     </w:p>
     <w:p>
@@ -1916,13 +1916,13 @@
       </w:r>
     </w:p>
     <w:bookmarkEnd w:id="24"/>
-    <w:bookmarkStart w:id="27" w:name="avoid-forward-references"/>
+    <w:bookmarkStart w:id="27" w:name="heading-levels"/>
     <w:p>
       <w:pPr>
         <w:pStyle w:val="Heading2"/>
       </w:pPr>
       <w:r>
-        <w:t xml:space="preserve">6 Avoid forward references</w:t>
+        <w:t xml:space="preserve">6 Heading levels</w:t>
       </w:r>
     </w:p>
     <w:p>
@@ -1930,13 +1930,48 @@
         <w:pStyle w:val="FirstParagraph"/>
       </w:pPr>
       <w:r>
-        <w:t xml:space="preserve">A forward reference points the reader to content they have not reached yet.</w:t>
-      </w:r>
-      <w:r>
-        <w:t xml:space="preserve"> </w:t>
-      </w:r>
-      <w:r>
-        <w:t xml:space="preserve">Common forms are:</w:t>
+        <w:t xml:space="preserve">A page’s title is its level 1 heading, so the sections of the page start at level 2</w:t>
+      </w:r>
+      <w:r>
+        <w:t xml:space="preserve"> </w:t>
+      </w:r>
+      <w:r>
+        <w:t xml:space="preserve">(the chapters of</w:t>
+      </w:r>
+      <w:r>
+        <w:t xml:space="preserve"> </w:t>
+      </w:r>
+      <w:hyperlink r:id="rId25">
+        <w:r>
+          <w:rPr>
+            <w:rStyle w:val="Hyperlink"/>
+          </w:rPr>
+          <w:t xml:space="preserve">rme</w:t>
+        </w:r>
+      </w:hyperlink>
+      <w:r>
+        <w:t xml:space="preserve"> </w:t>
+      </w:r>
+      <w:r>
+        <w:t xml:space="preserve">put their sections at level 1 under the title instead,</w:t>
+      </w:r>
+      <w:r>
+        <w:t xml:space="preserve"> </w:t>
+      </w:r>
+      <w:r>
+        <w:t xml:space="preserve">and the check below does not flag a first heading at level 1).</w:t>
+      </w:r>
+      <w:r>
+        <w:t xml:space="preserve"> </w:t>
+      </w:r>
+      <w:r>
+        <w:t xml:space="preserve">Whichever level a site starts at, each heading is at most one level deeper than the heading before it.</w:t>
+      </w:r>
+      <w:r>
+        <w:t xml:space="preserve"> </w:t>
+      </w:r>
+      <w:r>
+        <w:t xml:space="preserve">Three mistakes break this outline:</w:t>
       </w:r>
     </w:p>
     <w:p>
@@ -1948,7 +1983,65 @@
         </w:numPr>
       </w:pPr>
       <w:r>
-        <w:t xml:space="preserve">“as discussed below”</w:t>
+        <w:rPr>
+          <w:b/>
+          <w:bCs/>
+        </w:rPr>
+        <w:t xml:space="preserve">A skipped level.</w:t>
+      </w:r>
+      <w:r>
+        <w:t xml:space="preserve"> </w:t>
+      </w:r>
+      <w:r>
+        <w:t xml:space="preserve">A</w:t>
+      </w:r>
+      <w:r>
+        <w:t xml:space="preserve"> </w:t>
+      </w:r>
+      <w:r>
+        <w:rPr>
+          <w:rStyle w:val="VerbatimChar"/>
+        </w:rPr>
+        <w:t xml:space="preserve">####</w:t>
+      </w:r>
+      <w:r>
+        <w:t xml:space="preserve"> </w:t>
+      </w:r>
+      <w:r>
+        <w:t xml:space="preserve">heading directly after a</w:t>
+      </w:r>
+      <w:r>
+        <w:t xml:space="preserve"> </w:t>
+      </w:r>
+      <w:r>
+        <w:rPr>
+          <w:rStyle w:val="VerbatimChar"/>
+        </w:rPr>
+        <w:t xml:space="preserve">##</w:t>
+      </w:r>
+      <w:r>
+        <w:t xml:space="preserve"> </w:t>
+      </w:r>
+      <w:r>
+        <w:t xml:space="preserve">heading leaves a missing level 3,</w:t>
+      </w:r>
+      <w:r>
+        <w:t xml:space="preserve"> </w:t>
+      </w:r>
+      <w:r>
+        <w:t xml:space="preserve">so the table of contents shows a gap and section numbers can read</w:t>
+      </w:r>
+      <w:r>
+        <w:t xml:space="preserve"> </w:t>
+      </w:r>
+      <w:r>
+        <w:rPr>
+          <w:rStyle w:val="VerbatimChar"/>
+        </w:rPr>
+        <w:t xml:space="preserve">1.0.1</w:t>
+      </w:r>
+      <w:r>
+        <w:t xml:space="preserve">.</w:t>
       </w:r>
     </w:p>
     <w:p>
@@ -1960,7 +2053,41 @@
         </w:numPr>
       </w:pPr>
       <w:r>
-        <w:t xml:space="preserve">“see the next section”</w:t>
+        <w:rPr>
+          <w:b/>
+          <w:bCs/>
+        </w:rPr>
+        <w:t xml:space="preserve">A page that starts too deep.</w:t>
+      </w:r>
+      <w:r>
+        <w:t xml:space="preserve"> </w:t>
+      </w:r>
+      <w:r>
+        <w:t xml:space="preserve">A page whose first heading is level 3 or deeper usually kept the headings</w:t>
+      </w:r>
+      <w:r>
+        <w:t xml:space="preserve"> </w:t>
+      </w:r>
+      <w:r>
+        <w:t xml:space="preserve">of the larger page it was split out of.</w:t>
+      </w:r>
+      <w:r>
+        <w:t xml:space="preserve"> </w:t>
+      </w:r>
+      <w:r>
+        <w:t xml:space="preserve">Raise the headings when you move a section into its own page,</w:t>
+      </w:r>
+      <w:r>
+        <w:t xml:space="preserve"> </w:t>
+      </w:r>
+      <w:r>
+        <w:t xml:space="preserve">and when you write a shared include, remember that it takes its level</w:t>
+      </w:r>
+      <w:r>
+        <w:t xml:space="preserve"> </w:t>
+      </w:r>
+      <w:r>
+        <w:t xml:space="preserve">from the page that includes it.</w:t>
       </w:r>
     </w:p>
     <w:p>
@@ -1972,7 +2099,185 @@
         </w:numPr>
       </w:pPr>
       <w:r>
-        <w:t xml:space="preserve">“we will return to this later”</w:t>
+        <w:rPr>
+          <w:b/>
+          <w:bCs/>
+        </w:rPr>
+        <w:t xml:space="preserve">A first heading that repeats the title.</w:t>
+      </w:r>
+      <w:r>
+        <w:t xml:space="preserve"> </w:t>
+      </w:r>
+      <w:r>
+        <w:t xml:space="preserve">A section copied into its own page often keeps its heading,</w:t>
+      </w:r>
+      <w:r>
+        <w:t xml:space="preserve"> </w:t>
+      </w:r>
+      <w:r>
+        <w:t xml:space="preserve">so the page opens with its title twice.</w:t>
+      </w:r>
+      <w:r>
+        <w:t xml:space="preserve"> </w:t>
+      </w:r>
+      <w:r>
+        <w:t xml:space="preserve">Drop the heading.</w:t>
+      </w:r>
+      <w:r>
+        <w:t xml:space="preserve"> </w:t>
+      </w:r>
+      <w:r>
+        <w:t xml:space="preserve">If something links to</w:t>
+      </w:r>
+      <w:r>
+        <w:t xml:space="preserve"> </w:t>
+      </w:r>
+      <w:r>
+        <w:rPr>
+          <w:rStyle w:val="VerbatimChar"/>
+        </w:rPr>
+        <w:t xml:space="preserve">page.html#sec-newton</w:t>
+      </w:r>
+      <w:r>
+        <w:t xml:space="preserve">,</w:t>
+      </w:r>
+      <w:r>
+        <w:t xml:space="preserve"> </w:t>
+      </w:r>
+      <w:r>
+        <w:t xml:space="preserve">keep that link working with an empty anchor such as</w:t>
+      </w:r>
+      <w:r>
+        <w:t xml:space="preserve"> </w:t>
+      </w:r>
+      <w:r>
+        <w:rPr>
+          <w:rStyle w:val="VerbatimChar"/>
+        </w:rPr>
+        <w:t xml:space="preserve">[]{#sec-newton}</w:t>
+      </w:r>
+      <w:r>
+        <w:t xml:space="preserve"> </w:t>
+      </w:r>
+      <w:r>
+        <w:t xml:space="preserve">at the top of the page.</w:t>
+      </w:r>
+      <w:r>
+        <w:t xml:space="preserve"> </w:t>
+      </w:r>
+      <w:r>
+        <w:t xml:space="preserve">The anchor adds an empty paragraph, and a Quarto</w:t>
+      </w:r>
+      <w:r>
+        <w:t xml:space="preserve"> </w:t>
+      </w:r>
+      <w:r>
+        <w:rPr>
+          <w:rStyle w:val="VerbatimChar"/>
+        </w:rPr>
+        <w:t xml:space="preserve">@sec-newton</w:t>
+      </w:r>
+      <w:r>
+        <w:t xml:space="preserve"> </w:t>
+      </w:r>
+      <w:r>
+        <w:t xml:space="preserve">reference does not resolve through it,</w:t>
+      </w:r>
+      <w:r>
+        <w:t xml:space="preserve"> </w:t>
+      </w:r>
+      <w:r>
+        <w:t xml:space="preserve">so a page that uses such a reference keeps its heading instead.</w:t>
+      </w:r>
+    </w:p>
+    <w:p>
+      <w:pPr>
+        <w:pStyle w:val="FirstParagraph"/>
+      </w:pPr>
+      <w:r>
+        <w:t xml:space="preserve">The</w:t>
+      </w:r>
+      <w:r>
+        <w:t xml:space="preserve"> </w:t>
+      </w:r>
+      <w:r>
+        <w:rPr>
+          <w:rStyle w:val="VerbatimChar"/>
+        </w:rPr>
+        <w:t xml:space="preserve">####</w:t>
+      </w:r>
+      <w:r>
+        <w:t xml:space="preserve"> </w:t>
+      </w:r>
+      <w:r>
+        <w:t xml:space="preserve">title of a definition, example or exercise div is not a heading in this sense.</w:t>
+      </w:r>
+    </w:p>
+    <w:p>
+      <w:pPr>
+        <w:pStyle w:val="BodyText"/>
+      </w:pPr>
+      <w:r>
+        <w:t xml:space="preserve">The</w:t>
+      </w:r>
+      <w:r>
+        <w:t xml:space="preserve"> </w:t>
+      </w:r>
+      <w:hyperlink r:id="rId26">
+        <w:r>
+          <w:rPr>
+            <w:rStyle w:val="VerbatimChar"/>
+          </w:rPr>
+          <w:t xml:space="preserve">check-heading-levels</w:t>
+        </w:r>
+        <w:r>
+          <w:rPr>
+            <w:rStyle w:val="Hyperlink"/>
+          </w:rPr>
+          <w:t xml:space="preserve"> </w:t>
+        </w:r>
+        <w:r>
+          <w:rPr>
+            <w:rStyle w:val="Hyperlink"/>
+          </w:rPr>
+          <w:t xml:space="preserve">workflow</w:t>
+        </w:r>
+      </w:hyperlink>
+      <w:r>
+        <w:t xml:space="preserve"> </w:t>
+      </w:r>
+      <w:r>
+        <w:t xml:space="preserve">in Morrison-Lab/gha flags these three mistakes</w:t>
+      </w:r>
+      <w:r>
+        <w:t xml:space="preserve"> </w:t>
+      </w:r>
+      <w:r>
+        <w:t xml:space="preserve">on the heading lines a pull request adds.</w:t>
+      </w:r>
+    </w:p>
+    <w:bookmarkEnd w:id="27"/>
+    <w:bookmarkStart w:id="30" w:name="avoid-forward-references"/>
+    <w:p>
+      <w:pPr>
+        <w:pStyle w:val="Heading2"/>
+      </w:pPr>
+      <w:r>
+        <w:t xml:space="preserve">7 Avoid forward references</w:t>
+      </w:r>
+    </w:p>
+    <w:p>
+      <w:pPr>
+        <w:pStyle w:val="FirstParagraph"/>
+      </w:pPr>
+      <w:r>
+        <w:t xml:space="preserve">A forward reference points the reader to content they have not reached yet.</w:t>
+      </w:r>
+      <w:r>
+        <w:t xml:space="preserve"> </w:t>
+      </w:r>
+      <w:r>
+        <w:t xml:space="preserve">Common forms are:</w:t>
       </w:r>
     </w:p>
     <w:p>
@@ -1980,16 +2285,52 @@
         <w:pStyle w:val="Compact"/>
         <w:numPr>
           <w:ilvl w:val="0"/>
-          <w:numId w:val="1009"/>
+          <w:numId w:val="1010"/>
         </w:numPr>
       </w:pPr>
       <w:r>
+        <w:t xml:space="preserve">“as discussed below”</w:t>
+      </w:r>
+    </w:p>
+    <w:p>
+      <w:pPr>
+        <w:pStyle w:val="Compact"/>
+        <w:numPr>
+          <w:ilvl w:val="0"/>
+          <w:numId w:val="1010"/>
+        </w:numPr>
+      </w:pPr>
+      <w:r>
+        <w:t xml:space="preserve">“see the next section”</w:t>
+      </w:r>
+    </w:p>
+    <w:p>
+      <w:pPr>
+        <w:pStyle w:val="Compact"/>
+        <w:numPr>
+          <w:ilvl w:val="0"/>
+          <w:numId w:val="1010"/>
+        </w:numPr>
+      </w:pPr>
+      <w:r>
+        <w:t xml:space="preserve">“we will return to this later”</w:t>
+      </w:r>
+    </w:p>
+    <w:p>
+      <w:pPr>
+        <w:pStyle w:val="Compact"/>
+        <w:numPr>
+          <w:ilvl w:val="0"/>
+          <w:numId w:val="1010"/>
+        </w:numPr>
+      </w:pPr>
+      <w:r>
         <w:t xml:space="preserve">a technical</w:t>
       </w:r>
       <w:r>
         <w:t xml:space="preserve"> </w:t>
       </w:r>
-      <w:hyperlink r:id="rId25">
+      <w:hyperlink r:id="rId28">
         <w:r>
           <w:rPr>
             <w:rStyle w:val="Hyperlink"/>
@@ -2142,7 +2483,7 @@
         <w:t xml:space="preserve">The reader then loses both the warning and the jump.</w:t>
       </w:r>
     </w:p>
-    <w:bookmarkStart w:id="26" w:name="exm-forward-reference"/>
+    <w:bookmarkStart w:id="29" w:name="exm-forward-reference"/>
     <w:p>
       <w:pPr>
         <w:pStyle w:val="BodyText"/>
@@ -2227,246 +2568,13 @@
         <w:t xml:space="preserve">so neither pointer is needed.</w:t>
       </w:r>
     </w:p>
-    <w:bookmarkEnd w:id="26"/>
+    <w:bookmarkEnd w:id="29"/>
     <w:p>
       <w:pPr>
         <w:pStyle w:val="BodyText"/>
       </w:pPr>
       <w:r>
         <w:t xml:space="preserve">Two cases are not forward references to fix:</w:t>
-      </w:r>
-    </w:p>
-    <w:p>
-      <w:pPr>
-        <w:pStyle w:val="Compact"/>
-        <w:numPr>
-          <w:ilvl w:val="0"/>
-          <w:numId w:val="1010"/>
-        </w:numPr>
-      </w:pPr>
-      <w:r>
-        <w:t xml:space="preserve">An overview near the start that previews the structure,</w:t>
-      </w:r>
-      <w:r>
-        <w:t xml:space="preserve"> </w:t>
-      </w:r>
-      <w:r>
-        <w:t xml:space="preserve">such as</w:t>
-      </w:r>
-      <w:r>
-        <w:t xml:space="preserve"> </w:t>
-      </w:r>
-      <w:r>
-        <w:t xml:space="preserve">“Section 2 describes the data, and Section 3 gives the results”</w:t>
-      </w:r>
-      <w:r>
-        <w:t xml:space="preserve">.</w:t>
-      </w:r>
-      <w:r>
-        <w:t xml:space="preserve"> </w:t>
-      </w:r>
-      <w:r>
-        <w:t xml:space="preserve">The reader is not meant to resolve the preview immediately.</w:t>
-      </w:r>
-    </w:p>
-    <w:p>
-      <w:pPr>
-        <w:pStyle w:val="Compact"/>
-        <w:numPr>
-          <w:ilvl w:val="0"/>
-          <w:numId w:val="1010"/>
-        </w:numPr>
-      </w:pPr>
-      <w:r>
-        <w:t xml:space="preserve">A sentence that names a figure or table placed beside it, such as</w:t>
-      </w:r>
-      <w:r>
-        <w:t xml:space="preserve"> </w:t>
-      </w:r>
-      <w:r>
-        <w:t xml:space="preserve">“Table 2 shows the estimates”</w:t>
-      </w:r>
-      <w:r>
-        <w:t xml:space="preserve">.</w:t>
-      </w:r>
-      <w:r>
-        <w:t xml:space="preserve"> </w:t>
-      </w:r>
-      <w:r>
-        <w:t xml:space="preserve">The reader encounters the table at once.</w:t>
-      </w:r>
-    </w:p>
-    <w:p>
-      <w:pPr>
-        <w:pStyle w:val="FirstParagraph"/>
-      </w:pPr>
-      <w:r>
-        <w:t xml:space="preserve">A word such as</w:t>
-      </w:r>
-      <w:r>
-        <w:t xml:space="preserve"> </w:t>
-      </w:r>
-      <w:r>
-        <w:t xml:space="preserve">“below”</w:t>
-      </w:r>
-      <w:r>
-        <w:t xml:space="preserve"> </w:t>
-      </w:r>
-      <w:r>
-        <w:t xml:space="preserve">in an ordinary comparison, as in</w:t>
-      </w:r>
-      <w:r>
-        <w:t xml:space="preserve"> </w:t>
-      </w:r>
-      <w:r>
-        <w:t xml:space="preserve">“values below the detection limit”</w:t>
-      </w:r>
-      <w:r>
-        <w:t xml:space="preserve">,</w:t>
-      </w:r>
-      <w:r>
-        <w:t xml:space="preserve"> </w:t>
-      </w:r>
-      <w:r>
-        <w:t xml:space="preserve">is not a pointer at all.</w:t>
-      </w:r>
-    </w:p>
-    <w:p>
-      <w:pPr>
-        <w:pStyle w:val="BodyText"/>
-      </w:pPr>
-      <w:r>
-        <w:t xml:space="preserve">When you insert or move a section, check the references that name a position,</w:t>
-      </w:r>
-      <w:r>
-        <w:t xml:space="preserve"> </w:t>
-      </w:r>
-      <w:r>
-        <w:t xml:space="preserve">such as</w:t>
-      </w:r>
-      <w:r>
-        <w:t xml:space="preserve"> </w:t>
-      </w:r>
-      <w:r>
-        <w:t xml:space="preserve">“the two sections above”</w:t>
-      </w:r>
-      <w:r>
-        <w:t xml:space="preserve"> </w:t>
-      </w:r>
-      <w:r>
-        <w:t xml:space="preserve">or</w:t>
-      </w:r>
-      <w:r>
-        <w:t xml:space="preserve"> </w:t>
-      </w:r>
-      <w:r>
-        <w:t xml:space="preserve">“the previous section”</w:t>
-      </w:r>
-      <w:r>
-        <w:t xml:space="preserve">.</w:t>
-      </w:r>
-      <w:r>
-        <w:t xml:space="preserve"> </w:t>
-      </w:r>
-      <w:r>
-        <w:t xml:space="preserve">Name the target instead, as in</w:t>
-      </w:r>
-      <w:r>
-        <w:t xml:space="preserve"> </w:t>
-      </w:r>
-      <w:r>
-        <w:t xml:space="preserve">“the sections on mortality and morbidity”</w:t>
-      </w:r>
-      <w:r>
-        <w:t xml:space="preserve">,</w:t>
-      </w:r>
-      <w:r>
-        <w:t xml:space="preserve"> </w:t>
-      </w:r>
-      <w:r>
-        <w:t xml:space="preserve">so that a later insertion does not make the position wrong.</w:t>
-      </w:r>
-    </w:p>
-    <w:bookmarkEnd w:id="27"/>
-    <w:bookmarkStart w:id="31" w:name="links-to-videos-and-other-media"/>
-    <w:p>
-      <w:pPr>
-        <w:pStyle w:val="Heading2"/>
-      </w:pPr>
-      <w:r>
-        <w:t xml:space="preserve">7 Links to videos and other media</w:t>
-      </w:r>
-    </w:p>
-    <w:p>
-      <w:pPr>
-        <w:pStyle w:val="FirstParagraph"/>
-      </w:pPr>
-      <w:r>
-        <w:t xml:space="preserve">Put each link to a video, podcast, demo or other external material</w:t>
-      </w:r>
-      <w:r>
-        <w:t xml:space="preserve"> </w:t>
-      </w:r>
-      <w:r>
-        <w:t xml:space="preserve">in a short note right after the text the material supports.</w:t>
-      </w:r>
-      <w:r>
-        <w:t xml:space="preserve"> </w:t>
-      </w:r>
-      <w:r>
-        <w:t xml:space="preserve">Do not collect the links in a list at the end of the document.</w:t>
-      </w:r>
-      <w:r>
-        <w:t xml:space="preserve"> </w:t>
-      </w:r>
-      <w:r>
-        <w:t xml:space="preserve">If the material covers several sections,</w:t>
-      </w:r>
-      <w:r>
-        <w:t xml:space="preserve"> </w:t>
-      </w:r>
-      <w:r>
-        <w:t xml:space="preserve">put the note after the first section the material supports.</w:t>
-      </w:r>
-      <w:r>
-        <w:t xml:space="preserve"> </w:t>
-      </w:r>
-      <w:r>
-        <w:t xml:space="preserve">If the text the note supports is a question followed by its answer,</w:t>
-      </w:r>
-      <w:r>
-        <w:t xml:space="preserve"> </w:t>
-      </w:r>
-      <w:r>
-        <w:t xml:space="preserve">put the note after the answer, not between them.</w:t>
-      </w:r>
-    </w:p>
-    <w:p>
-      <w:pPr>
-        <w:pStyle w:val="BodyText"/>
-      </w:pPr>
-      <w:r>
-        <w:t xml:space="preserve">A reader who has just finished a section is ready to use material about it.</w:t>
-      </w:r>
-      <w:r>
-        <w:t xml:space="preserve"> </w:t>
-      </w:r>
-      <w:r>
-        <w:t xml:space="preserve">The same reader at the end of the document must guess which link goes with which section,</w:t>
-      </w:r>
-      <w:r>
-        <w:t xml:space="preserve"> </w:t>
-      </w:r>
-      <w:r>
-        <w:t xml:space="preserve">and may never reach the list.</w:t>
-      </w:r>
-    </w:p>
-    <w:p>
-      <w:pPr>
-        <w:pStyle w:val="BodyText"/>
-      </w:pPr>
-      <w:r>
-        <w:t xml:space="preserve">For each link:</w:t>
       </w:r>
     </w:p>
     <w:p>
@@ -2478,13 +2586,28 @@
         </w:numPr>
       </w:pPr>
       <w:r>
-        <w:t xml:space="preserve">Write one line, such as</w:t>
-      </w:r>
-      <w:r>
-        <w:t xml:space="preserve"> </w:t>
-      </w:r>
-      <w:r>
-        <w:t xml:space="preserve">“Video: Weinberger derives the descent direction (from 3:09).”</w:t>
+        <w:t xml:space="preserve">An overview near the start that previews the structure,</w:t>
+      </w:r>
+      <w:r>
+        <w:t xml:space="preserve"> </w:t>
+      </w:r>
+      <w:r>
+        <w:t xml:space="preserve">such as</w:t>
+      </w:r>
+      <w:r>
+        <w:t xml:space="preserve"> </w:t>
+      </w:r>
+      <w:r>
+        <w:t xml:space="preserve">“Section 2 describes the data, and Section 3 gives the results”</w:t>
+      </w:r>
+      <w:r>
+        <w:t xml:space="preserve">.</w:t>
+      </w:r>
+      <w:r>
+        <w:t xml:space="preserve"> </w:t>
+      </w:r>
+      <w:r>
+        <w:t xml:space="preserve">The reader is not meant to resolve the preview immediately.</w:t>
       </w:r>
     </w:p>
     <w:p>
@@ -2496,7 +2619,195 @@
         </w:numPr>
       </w:pPr>
       <w:r>
-        <w:t xml:space="preserve">Name the speaker and say what the material shows, in simple, literal words.</w:t>
+        <w:t xml:space="preserve">A sentence that names a figure or table placed beside it, such as</w:t>
+      </w:r>
+      <w:r>
+        <w:t xml:space="preserve"> </w:t>
+      </w:r>
+      <w:r>
+        <w:t xml:space="preserve">“Table 2 shows the estimates”</w:t>
+      </w:r>
+      <w:r>
+        <w:t xml:space="preserve">.</w:t>
+      </w:r>
+      <w:r>
+        <w:t xml:space="preserve"> </w:t>
+      </w:r>
+      <w:r>
+        <w:t xml:space="preserve">The reader encounters the table at once.</w:t>
+      </w:r>
+    </w:p>
+    <w:p>
+      <w:pPr>
+        <w:pStyle w:val="FirstParagraph"/>
+      </w:pPr>
+      <w:r>
+        <w:t xml:space="preserve">A word such as</w:t>
+      </w:r>
+      <w:r>
+        <w:t xml:space="preserve"> </w:t>
+      </w:r>
+      <w:r>
+        <w:t xml:space="preserve">“below”</w:t>
+      </w:r>
+      <w:r>
+        <w:t xml:space="preserve"> </w:t>
+      </w:r>
+      <w:r>
+        <w:t xml:space="preserve">in an ordinary comparison, as in</w:t>
+      </w:r>
+      <w:r>
+        <w:t xml:space="preserve"> </w:t>
+      </w:r>
+      <w:r>
+        <w:t xml:space="preserve">“values below the detection limit”</w:t>
+      </w:r>
+      <w:r>
+        <w:t xml:space="preserve">,</w:t>
+      </w:r>
+      <w:r>
+        <w:t xml:space="preserve"> </w:t>
+      </w:r>
+      <w:r>
+        <w:t xml:space="preserve">is not a pointer at all.</w:t>
+      </w:r>
+    </w:p>
+    <w:p>
+      <w:pPr>
+        <w:pStyle w:val="BodyText"/>
+      </w:pPr>
+      <w:r>
+        <w:t xml:space="preserve">When you insert or move a section, check the references that name a position,</w:t>
+      </w:r>
+      <w:r>
+        <w:t xml:space="preserve"> </w:t>
+      </w:r>
+      <w:r>
+        <w:t xml:space="preserve">such as</w:t>
+      </w:r>
+      <w:r>
+        <w:t xml:space="preserve"> </w:t>
+      </w:r>
+      <w:r>
+        <w:t xml:space="preserve">“the two sections above”</w:t>
+      </w:r>
+      <w:r>
+        <w:t xml:space="preserve"> </w:t>
+      </w:r>
+      <w:r>
+        <w:t xml:space="preserve">or</w:t>
+      </w:r>
+      <w:r>
+        <w:t xml:space="preserve"> </w:t>
+      </w:r>
+      <w:r>
+        <w:t xml:space="preserve">“the previous section”</w:t>
+      </w:r>
+      <w:r>
+        <w:t xml:space="preserve">.</w:t>
+      </w:r>
+      <w:r>
+        <w:t xml:space="preserve"> </w:t>
+      </w:r>
+      <w:r>
+        <w:t xml:space="preserve">Name the target instead, as in</w:t>
+      </w:r>
+      <w:r>
+        <w:t xml:space="preserve"> </w:t>
+      </w:r>
+      <w:r>
+        <w:t xml:space="preserve">“the sections on mortality and morbidity”</w:t>
+      </w:r>
+      <w:r>
+        <w:t xml:space="preserve">,</w:t>
+      </w:r>
+      <w:r>
+        <w:t xml:space="preserve"> </w:t>
+      </w:r>
+      <w:r>
+        <w:t xml:space="preserve">so that a later insertion does not make the position wrong.</w:t>
+      </w:r>
+    </w:p>
+    <w:bookmarkEnd w:id="30"/>
+    <w:bookmarkStart w:id="34" w:name="links-to-videos-and-other-media"/>
+    <w:p>
+      <w:pPr>
+        <w:pStyle w:val="Heading2"/>
+      </w:pPr>
+      <w:r>
+        <w:t xml:space="preserve">8 Links to videos and other media</w:t>
+      </w:r>
+    </w:p>
+    <w:p>
+      <w:pPr>
+        <w:pStyle w:val="FirstParagraph"/>
+      </w:pPr>
+      <w:r>
+        <w:t xml:space="preserve">Put each link to a video, podcast, demo or other external material</w:t>
+      </w:r>
+      <w:r>
+        <w:t xml:space="preserve"> </w:t>
+      </w:r>
+      <w:r>
+        <w:t xml:space="preserve">in a short note right after the text the material supports.</w:t>
+      </w:r>
+      <w:r>
+        <w:t xml:space="preserve"> </w:t>
+      </w:r>
+      <w:r>
+        <w:t xml:space="preserve">Do not collect the links in a list at the end of the document.</w:t>
+      </w:r>
+      <w:r>
+        <w:t xml:space="preserve"> </w:t>
+      </w:r>
+      <w:r>
+        <w:t xml:space="preserve">If the material covers several sections,</w:t>
+      </w:r>
+      <w:r>
+        <w:t xml:space="preserve"> </w:t>
+      </w:r>
+      <w:r>
+        <w:t xml:space="preserve">put the note after the first section the material supports.</w:t>
+      </w:r>
+      <w:r>
+        <w:t xml:space="preserve"> </w:t>
+      </w:r>
+      <w:r>
+        <w:t xml:space="preserve">If the text the note supports is a question followed by its answer,</w:t>
+      </w:r>
+      <w:r>
+        <w:t xml:space="preserve"> </w:t>
+      </w:r>
+      <w:r>
+        <w:t xml:space="preserve">put the note after the answer, not between them.</w:t>
+      </w:r>
+    </w:p>
+    <w:p>
+      <w:pPr>
+        <w:pStyle w:val="BodyText"/>
+      </w:pPr>
+      <w:r>
+        <w:t xml:space="preserve">A reader who has just finished a section is ready to use material about it.</w:t>
+      </w:r>
+      <w:r>
+        <w:t xml:space="preserve"> </w:t>
+      </w:r>
+      <w:r>
+        <w:t xml:space="preserve">The same reader at the end of the document must guess which link goes with which section,</w:t>
+      </w:r>
+      <w:r>
+        <w:t xml:space="preserve"> </w:t>
+      </w:r>
+      <w:r>
+        <w:t xml:space="preserve">and may never reach the list.</w:t>
+      </w:r>
+    </w:p>
+    <w:p>
+      <w:pPr>
+        <w:pStyle w:val="BodyText"/>
+      </w:pPr>
+      <w:r>
+        <w:t xml:space="preserve">For each link:</w:t>
       </w:r>
     </w:p>
     <w:p>
@@ -2504,11 +2815,17 @@
         <w:pStyle w:val="Compact"/>
         <w:numPr>
           <w:ilvl w:val="0"/>
-          <w:numId w:val="1011"/>
+          <w:numId w:val="1012"/>
         </w:numPr>
       </w:pPr>
       <w:r>
-        <w:t xml:space="preserve">Link the exact start time when the material covers more than the topic.</w:t>
+        <w:t xml:space="preserve">Write one line, such as</w:t>
+      </w:r>
+      <w:r>
+        <w:t xml:space="preserve"> </w:t>
+      </w:r>
+      <w:r>
+        <w:t xml:space="preserve">“Video: Weinberger derives the descent direction (from 3:09).”</w:t>
       </w:r>
     </w:p>
     <w:p>
@@ -2516,10 +2833,34 @@
         <w:pStyle w:val="Compact"/>
         <w:numPr>
           <w:ilvl w:val="0"/>
-          <w:numId w:val="1011"/>
+          <w:numId w:val="1012"/>
         </w:numPr>
       </w:pPr>
       <w:r>
+        <w:t xml:space="preserve">Name the speaker and say what the material shows, in simple, literal words.</w:t>
+      </w:r>
+    </w:p>
+    <w:p>
+      <w:pPr>
+        <w:pStyle w:val="Compact"/>
+        <w:numPr>
+          <w:ilvl w:val="0"/>
+          <w:numId w:val="1012"/>
+        </w:numPr>
+      </w:pPr>
+      <w:r>
+        <w:t xml:space="preserve">Link the exact start time when the material covers more than the topic.</w:t>
+      </w:r>
+    </w:p>
+    <w:p>
+      <w:pPr>
+        <w:pStyle w:val="Compact"/>
+        <w:numPr>
+          <w:ilvl w:val="0"/>
+          <w:numId w:val="1012"/>
+        </w:numPr>
+      </w:pPr>
+      <w:r>
         <w:t xml:space="preserve">Cite the source.</w:t>
       </w:r>
     </w:p>
@@ -2549,8 +2890,8 @@
         <w:t xml:space="preserve">Do not link private repositories, such as ones that hold graded homework or exams.</w:t>
       </w:r>
     </w:p>
-    <w:bookmarkStart w:id="30" w:name="refs"/>
-    <w:bookmarkStart w:id="29" w:name="ref-lamport2019think"/>
+    <w:bookmarkStart w:id="33" w:name="refs"/>
+    <w:bookmarkStart w:id="32" w:name="ref-lamport2019think"/>
     <w:p>
       <w:pPr>
         <w:pStyle w:val="Bibliography"/>
@@ -2588,7 +2929,7 @@
       <w:r>
         <w:t xml:space="preserve"> </w:t>
       </w:r>
-      <w:hyperlink r:id="rId28">
+      <w:hyperlink r:id="rId31">
         <w:r>
           <w:rPr>
             <w:rStyle w:val="Hyperlink"/>
@@ -2600,9 +2941,9 @@
         <w:t xml:space="preserve">.</w:t>
       </w:r>
     </w:p>
-    <w:bookmarkEnd w:id="29"/>
-    <w:bookmarkEnd w:id="30"/>
-    <w:bookmarkEnd w:id="31"/>
+    <w:bookmarkEnd w:id="32"/>
+    <w:bookmarkEnd w:id="33"/>
+    <w:bookmarkEnd w:id="34"/>
     <w:sectPr>
       <w:footnotePr>
         <w:numRestart w:val="eachSect"/>
@@ -2962,6 +3303,9 @@
     <w:abstractNumId w:val="991"/>
   </w:num>
   <w:num w:numId="1011">
+    <w:abstractNumId w:val="991"/>
+  </w:num>
+  <w:num w:numId="1012">
     <w:abstractNumId w:val="991"/>
   </w:num>
 </w:numbering>

</xml_diff>